<commit_message>
Entregable final: Word con capturas reales del sistema funcionando
Documento completado sobre la plantilla oficial de SENATI, con
capturas reales (login, dashboard en vivo, productos, movimientos,
reposiciones, reportes) del sistema corriendo contra MySQL.

Co-Authored-By: Claude Sonnet 5 <noreply@anthropic.com>
</commit_message>
<xml_diff>
--- a/TrabajoFinal_ModaExpress.docx
+++ b/TrabajoFinal_ModaExpress.docx
@@ -5444,206 +5444,6 @@
           </w:p>
         </w:tc>
       </w:tr>
-      <w:tr>
-        <w:trPr>
-          <w:trHeight w:val="409"/>
-        </w:trPr>
-        <w:tc>
-          <w:tcPr>
-            <w:tcW w:w="1134" w:type="dxa"/>
-            <w:vAlign w:val="center"/>
-          </w:tcPr>
-          <w:p>
-            <w:pPr>
-              <w:jc w:val="center"/>
-              <w:rPr>
-                <w:rFonts w:ascii="Arial" w:hAnsi="Arial" w:cs="Arial"/>
-                <w:sz w:val="20"/>
-                <w:szCs w:val="20"/>
-              </w:rPr>
-            </w:pPr>
-          </w:p>
-        </w:tc>
-        <w:tc>
-          <w:tcPr>
-            <w:tcW w:w="3686" w:type="dxa"/>
-            <w:vAlign w:val="center"/>
-          </w:tcPr>
-          <w:p>
-            <w:pPr>
-              <w:rPr>
-                <w:rFonts w:ascii="Arial" w:hAnsi="Arial" w:cs="Arial"/>
-                <w:sz w:val="20"/>
-                <w:szCs w:val="20"/>
-              </w:rPr>
-            </w:pPr>
-          </w:p>
-        </w:tc>
-        <w:tc>
-          <w:tcPr>
-            <w:tcW w:w="1984" w:type="dxa"/>
-            <w:vAlign w:val="center"/>
-          </w:tcPr>
-          <w:p>
-            <w:pPr>
-              <w:jc w:val="center"/>
-              <w:rPr>
-                <w:rFonts w:ascii="Arial" w:hAnsi="Arial" w:cs="Arial"/>
-                <w:sz w:val="20"/>
-                <w:szCs w:val="20"/>
-              </w:rPr>
-            </w:pPr>
-          </w:p>
-        </w:tc>
-        <w:tc>
-          <w:tcPr>
-            <w:tcW w:w="851" w:type="dxa"/>
-            <w:vAlign w:val="center"/>
-          </w:tcPr>
-          <w:p>
-            <w:pPr>
-              <w:jc w:val="center"/>
-              <w:rPr>
-                <w:rFonts w:ascii="Arial" w:hAnsi="Arial" w:cs="Arial"/>
-                <w:sz w:val="20"/>
-                <w:szCs w:val="20"/>
-              </w:rPr>
-            </w:pPr>
-          </w:p>
-        </w:tc>
-        <w:tc>
-          <w:tcPr>
-            <w:tcW w:w="709" w:type="dxa"/>
-            <w:vAlign w:val="center"/>
-          </w:tcPr>
-          <w:p>
-            <w:pPr>
-              <w:jc w:val="center"/>
-              <w:rPr>
-                <w:rFonts w:ascii="Arial" w:hAnsi="Arial" w:cs="Arial"/>
-                <w:sz w:val="20"/>
-                <w:szCs w:val="20"/>
-              </w:rPr>
-            </w:pPr>
-          </w:p>
-        </w:tc>
-        <w:tc>
-          <w:tcPr>
-            <w:tcW w:w="992" w:type="dxa"/>
-            <w:vAlign w:val="center"/>
-          </w:tcPr>
-          <w:p>
-            <w:pPr>
-              <w:jc w:val="center"/>
-              <w:rPr>
-                <w:rFonts w:ascii="Arial" w:hAnsi="Arial" w:cs="Arial"/>
-                <w:sz w:val="20"/>
-                <w:szCs w:val="20"/>
-              </w:rPr>
-            </w:pPr>
-          </w:p>
-        </w:tc>
-      </w:tr>
-      <w:tr>
-        <w:trPr>
-          <w:trHeight w:val="409"/>
-        </w:trPr>
-        <w:tc>
-          <w:tcPr>
-            <w:tcW w:w="1134" w:type="dxa"/>
-            <w:vAlign w:val="center"/>
-          </w:tcPr>
-          <w:p>
-            <w:pPr>
-              <w:jc w:val="center"/>
-              <w:rPr>
-                <w:rFonts w:ascii="Arial" w:hAnsi="Arial" w:cs="Arial"/>
-                <w:sz w:val="20"/>
-                <w:szCs w:val="20"/>
-              </w:rPr>
-            </w:pPr>
-          </w:p>
-        </w:tc>
-        <w:tc>
-          <w:tcPr>
-            <w:tcW w:w="3686" w:type="dxa"/>
-            <w:vAlign w:val="center"/>
-          </w:tcPr>
-          <w:p>
-            <w:pPr>
-              <w:rPr>
-                <w:rFonts w:ascii="Arial" w:hAnsi="Arial" w:cs="Arial"/>
-                <w:sz w:val="20"/>
-                <w:szCs w:val="20"/>
-              </w:rPr>
-            </w:pPr>
-          </w:p>
-        </w:tc>
-        <w:tc>
-          <w:tcPr>
-            <w:tcW w:w="1984" w:type="dxa"/>
-            <w:vAlign w:val="center"/>
-          </w:tcPr>
-          <w:p>
-            <w:pPr>
-              <w:jc w:val="center"/>
-              <w:rPr>
-                <w:rFonts w:ascii="Arial" w:hAnsi="Arial" w:cs="Arial"/>
-                <w:sz w:val="20"/>
-                <w:szCs w:val="20"/>
-              </w:rPr>
-            </w:pPr>
-          </w:p>
-        </w:tc>
-        <w:tc>
-          <w:tcPr>
-            <w:tcW w:w="851" w:type="dxa"/>
-            <w:vAlign w:val="center"/>
-          </w:tcPr>
-          <w:p>
-            <w:pPr>
-              <w:jc w:val="center"/>
-              <w:rPr>
-                <w:rFonts w:ascii="Arial" w:hAnsi="Arial" w:cs="Arial"/>
-                <w:sz w:val="20"/>
-                <w:szCs w:val="20"/>
-              </w:rPr>
-            </w:pPr>
-          </w:p>
-        </w:tc>
-        <w:tc>
-          <w:tcPr>
-            <w:tcW w:w="709" w:type="dxa"/>
-            <w:vAlign w:val="center"/>
-          </w:tcPr>
-          <w:p>
-            <w:pPr>
-              <w:jc w:val="center"/>
-              <w:rPr>
-                <w:rFonts w:ascii="Arial" w:hAnsi="Arial" w:cs="Arial"/>
-                <w:sz w:val="20"/>
-                <w:szCs w:val="20"/>
-              </w:rPr>
-            </w:pPr>
-          </w:p>
-        </w:tc>
-        <w:tc>
-          <w:tcPr>
-            <w:tcW w:w="992" w:type="dxa"/>
-            <w:vAlign w:val="center"/>
-          </w:tcPr>
-          <w:p>
-            <w:pPr>
-              <w:jc w:val="center"/>
-              <w:rPr>
-                <w:rFonts w:ascii="Arial" w:hAnsi="Arial" w:cs="Arial"/>
-                <w:sz w:val="20"/>
-                <w:szCs w:val="20"/>
-              </w:rPr>
-            </w:pPr>
-          </w:p>
-        </w:tc>
-      </w:tr>
     </w:tbl>
     <w:p>
       <w:pPr>
@@ -7441,23 +7241,37 @@
                 <w:rFonts w:ascii="Arial" w:hAnsi="Arial" w:cs="Arial"/>
                 <w:bCs/>
               </w:rPr>
-              <w:t>, diagramas, control, valoración) + sistema funcional con capturas, subido a github.com/AngelSanchezDev/</w:t>
+              <w:t xml:space="preserve">, diagramas, control, valoración) + sistema funcional con capturas, subido a </w:t>
+            </w:r>
+            <w:r>
+              <w:rPr>
+                <w:rFonts w:ascii="Arial" w:hAnsi="Arial" w:cs="Arial"/>
+                <w:b/>
+              </w:rPr>
+              <w:t>github.com/AngelSanchezDev/</w:t>
             </w:r>
             <w:proofErr w:type="spellStart"/>
             <w:r>
               <w:rPr>
                 <w:rFonts w:ascii="Arial" w:hAnsi="Arial" w:cs="Arial"/>
+                <w:b/>
+              </w:rPr>
+              <w:t>EjercicioIngSistemas-Retail</w:t>
+            </w:r>
+            <w:proofErr w:type="spellEnd"/>
+            <w:r>
+              <w:rPr>
+                <w:rFonts w:ascii="Arial" w:hAnsi="Arial" w:cs="Arial"/>
+                <w:b/>
+              </w:rPr>
+              <w:t>.</w:t>
+            </w:r>
+            <w:r>
+              <w:rPr>
+                <w:rFonts w:ascii="Arial" w:hAnsi="Arial" w:cs="Arial"/>
                 <w:bCs/>
               </w:rPr>
-              <w:t>EjercicioIngSistemas-Retail</w:t>
-            </w:r>
-            <w:proofErr w:type="spellEnd"/>
-            <w:r>
-              <w:rPr>
-                <w:rFonts w:ascii="Arial" w:hAnsi="Arial" w:cs="Arial"/>
-                <w:bCs/>
-              </w:rPr>
-              <w:t>. Tiempo real disponible: 1 día. Objetivo: funcional, nota, buen portafolio.</w:t>
+              <w:t xml:space="preserve"> Tiempo real disponible: 1 día. Objetivo: funcional, nota, buen portafolio.</w:t>
             </w:r>
           </w:p>
           <w:p>
@@ -10087,7 +9901,7 @@
           </mc:Choice>
           <mc:Fallback>
             <w:pict>
-              <v:roundrect w14:anchorId="150360F4" id="AutoShape 111" o:spid="_x0000_s1031" style="position:absolute;left:0;text-align:left;margin-left:0;margin-top:1.05pt;width:474.3pt;height:42.25pt;z-index:251688960;visibility:visible;mso-wrap-style:square;mso-width-percent:0;mso-height-percent:0;mso-wrap-distance-left:9pt;mso-wrap-distance-top:0;mso-wrap-distance-right:9pt;mso-wrap-distance-bottom:0;mso-position-horizontal:left;mso-position-horizontal-relative:margin;mso-position-vertical:absolute;mso-position-vertical-relative:text;mso-width-percent:0;mso-height-percent:0;mso-width-relative:page;mso-height-relative:page;v-text-anchor:top" arcsize="10923f" o:gfxdata="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">
+              <v:roundrect w14:anchorId="150360F4" id="_x0000_s1031" style="position:absolute;left:0;text-align:left;margin-left:0;margin-top:1.05pt;width:474.3pt;height:42.25pt;z-index:251688960;visibility:visible;mso-wrap-style:square;mso-width-percent:0;mso-height-percent:0;mso-wrap-distance-left:9pt;mso-wrap-distance-top:0;mso-wrap-distance-right:9pt;mso-wrap-distance-bottom:0;mso-position-horizontal:left;mso-position-horizontal-relative:margin;mso-position-vertical:absolute;mso-position-vertical-relative:text;mso-width-percent:0;mso-height-percent:0;mso-width-relative:page;mso-height-relative:page;v-text-anchor:top" arcsize="10923f" o:gfxdata="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">
                 <v:shadow on="t" opacity=".5" offset="6pt,6pt"/>
                 <v:textbox>
                   <w:txbxContent>
@@ -12429,6 +12243,4069 @@
     </w:p>
     <w:p>
       <w:pPr>
+        <w:spacing w:after="200" w:line="276" w:lineRule="auto"/>
+        <w:rPr>
+          <w:rFonts w:ascii="Arial" w:hAnsi="Arial" w:cs="Arial"/>
+          <w:b/>
+          <w:sz w:val="20"/>
+          <w:szCs w:val="20"/>
+          <w:lang w:val="es-PE"/>
+        </w:rPr>
+      </w:pPr>
+      <w:r>
+        <w:rPr>
+          <w:rFonts w:ascii="Arial" w:hAnsi="Arial" w:cs="Arial"/>
+          <w:b/>
+          <w:sz w:val="20"/>
+          <w:szCs w:val="20"/>
+          <w:lang w:val="es-PE"/>
+        </w:rPr>
+        <w:lastRenderedPageBreak/>
+        <w:drawing>
+          <wp:anchor distT="0" distB="0" distL="114300" distR="114300" simplePos="0" relativeHeight="251731968" behindDoc="0" locked="0" layoutInCell="1" allowOverlap="1" wp14:anchorId="5E1C8BC0" wp14:editId="2AEB2936">
+            <wp:simplePos x="0" y="0"/>
+            <wp:positionH relativeFrom="margin">
+              <wp:align>center</wp:align>
+            </wp:positionH>
+            <wp:positionV relativeFrom="paragraph">
+              <wp:posOffset>661522</wp:posOffset>
+            </wp:positionV>
+            <wp:extent cx="6219825" cy="4851400"/>
+            <wp:effectExtent l="0" t="0" r="9525" b="6350"/>
+            <wp:wrapSquare wrapText="bothSides"/>
+            <wp:docPr id="1353028096" name="Imagen 17"/>
+            <wp:cNvGraphicFramePr>
+              <a:graphicFrameLocks xmlns:a="http://schemas.openxmlformats.org/drawingml/2006/main" noChangeAspect="1"/>
+            </wp:cNvGraphicFramePr>
+            <a:graphic xmlns:a="http://schemas.openxmlformats.org/drawingml/2006/main">
+              <a:graphicData uri="http://schemas.openxmlformats.org/drawingml/2006/picture">
+                <pic:pic xmlns:pic="http://schemas.openxmlformats.org/drawingml/2006/picture">
+                  <pic:nvPicPr>
+                    <pic:cNvPr id="0" name="Picture 6"/>
+                    <pic:cNvPicPr>
+                      <a:picLocks noChangeAspect="1" noChangeArrowheads="1"/>
+                    </pic:cNvPicPr>
+                  </pic:nvPicPr>
+                  <pic:blipFill>
+                    <a:blip r:embed="rId23">
+                      <a:extLst>
+                        <a:ext uri="{28A0092B-C50C-407E-A947-70E740481C1C}">
+                          <a14:useLocalDpi xmlns:a14="http://schemas.microsoft.com/office/drawing/2010/main" val="0"/>
+                        </a:ext>
+                      </a:extLst>
+                    </a:blip>
+                    <a:srcRect/>
+                    <a:stretch>
+                      <a:fillRect/>
+                    </a:stretch>
+                  </pic:blipFill>
+                  <pic:spPr bwMode="auto">
+                    <a:xfrm>
+                      <a:off x="0" y="0"/>
+                      <a:ext cx="6219825" cy="4851400"/>
+                    </a:xfrm>
+                    <a:prstGeom prst="rect">
+                      <a:avLst/>
+                    </a:prstGeom>
+                    <a:noFill/>
+                    <a:ln>
+                      <a:noFill/>
+                    </a:ln>
+                  </pic:spPr>
+                </pic:pic>
+              </a:graphicData>
+            </a:graphic>
+            <wp14:sizeRelH relativeFrom="page">
+              <wp14:pctWidth>0</wp14:pctWidth>
+            </wp14:sizeRelH>
+            <wp14:sizeRelV relativeFrom="page">
+              <wp14:pctHeight>0</wp14:pctHeight>
+            </wp14:sizeRelV>
+          </wp:anchor>
+        </w:drawing>
+      </w:r>
+      <w:r>
+        <w:rPr>
+          <w:rFonts w:ascii="Arial" w:hAnsi="Arial" w:cs="Arial"/>
+          <w:b/>
+          <w:noProof/>
+          <w:lang w:val="es-PE" w:eastAsia="es-PE"/>
+        </w:rPr>
+        <mc:AlternateContent>
+          <mc:Choice Requires="wps">
+            <w:drawing>
+              <wp:anchor distT="0" distB="0" distL="114300" distR="114300" simplePos="0" relativeHeight="251729920" behindDoc="0" locked="0" layoutInCell="1" allowOverlap="1" wp14:anchorId="0C74D27C" wp14:editId="15D6AD5D">
+                <wp:simplePos x="0" y="0"/>
+                <wp:positionH relativeFrom="margin">
+                  <wp:align>left</wp:align>
+                </wp:positionH>
+                <wp:positionV relativeFrom="paragraph">
+                  <wp:posOffset>77470</wp:posOffset>
+                </wp:positionV>
+                <wp:extent cx="5842635" cy="536575"/>
+                <wp:effectExtent l="0" t="0" r="100965" b="92075"/>
+                <wp:wrapTopAndBottom/>
+                <wp:docPr id="1528819692" name="AutoShape 111"/>
+                <wp:cNvGraphicFramePr>
+                  <a:graphicFrameLocks xmlns:a="http://schemas.openxmlformats.org/drawingml/2006/main"/>
+                </wp:cNvGraphicFramePr>
+                <a:graphic xmlns:a="http://schemas.openxmlformats.org/drawingml/2006/main">
+                  <a:graphicData uri="http://schemas.microsoft.com/office/word/2010/wordprocessingShape">
+                    <wps:wsp>
+                      <wps:cNvSpPr>
+                        <a:spLocks noChangeArrowheads="1"/>
+                      </wps:cNvSpPr>
+                      <wps:spPr bwMode="auto">
+                        <a:xfrm>
+                          <a:off x="0" y="0"/>
+                          <a:ext cx="5842635" cy="536575"/>
+                        </a:xfrm>
+                        <a:prstGeom prst="roundRect">
+                          <a:avLst>
+                            <a:gd name="adj" fmla="val 16667"/>
+                          </a:avLst>
+                        </a:prstGeom>
+                        <a:solidFill>
+                          <a:srgbClr val="FFFFFF"/>
+                        </a:solidFill>
+                        <a:ln w="9525">
+                          <a:solidFill>
+                            <a:srgbClr val="000000"/>
+                          </a:solidFill>
+                          <a:round/>
+                          <a:headEnd/>
+                          <a:tailEnd/>
+                        </a:ln>
+                        <a:effectLst>
+                          <a:outerShdw dist="107763" dir="2700000" algn="ctr" rotWithShape="0">
+                            <a:srgbClr val="808080">
+                              <a:alpha val="50000"/>
+                            </a:srgbClr>
+                          </a:outerShdw>
+                        </a:effectLst>
+                      </wps:spPr>
+                      <wps:txbx>
+                        <w:txbxContent>
+                          <w:p>
+                            <w:pPr>
+                              <w:jc w:val="center"/>
+                              <w:rPr>
+                                <w:rFonts w:ascii="Arial" w:hAnsi="Arial" w:cs="Arial"/>
+                                <w:b/>
+                                <w:bCs/>
+                                <w:color w:val="0000FF"/>
+                                <w:sz w:val="28"/>
+                                <w:szCs w:val="28"/>
+                              </w:rPr>
+                            </w:pPr>
+                            <w:r>
+                              <w:rPr>
+                                <w:rFonts w:ascii="Arial" w:hAnsi="Arial" w:cs="Arial"/>
+                                <w:b/>
+                                <w:bCs/>
+                                <w:color w:val="0000FF"/>
+                                <w:sz w:val="28"/>
+                                <w:szCs w:val="28"/>
+                              </w:rPr>
+                              <w:t>DIBUJO / ESQUEMA / DIAGRAMA</w:t>
+                            </w:r>
+                            <w:r>
+                              <w:rPr>
+                                <w:rFonts w:ascii="Arial" w:hAnsi="Arial" w:cs="Arial"/>
+                                <w:b/>
+                                <w:bCs/>
+                                <w:color w:val="0000FF"/>
+                                <w:sz w:val="28"/>
+                                <w:szCs w:val="28"/>
+                              </w:rPr>
+                              <w:t xml:space="preserve"> DE PROPUESTA</w:t>
+                            </w:r>
+                          </w:p>
+                          <w:p>
+                            <w:pPr>
+                              <w:pStyle w:val="Prrafodelista"/>
+                              <w:ind w:left="360"/>
+                              <w:jc w:val="center"/>
+                              <w:rPr>
+                                <w:rFonts w:ascii="Arial" w:hAnsi="Arial" w:cs="Arial"/>
+                                <w:b/>
+                                <w:bCs/>
+                                <w:color w:val="000000"/>
+                                <w:sz w:val="20"/>
+                                <w:szCs w:val="20"/>
+                              </w:rPr>
+                            </w:pPr>
+                            <w:r>
+                              <w:rPr>
+                                <w:rFonts w:ascii="Arial" w:hAnsi="Arial" w:cs="Arial"/>
+                                <w:b/>
+                                <w:bCs/>
+                                <w:color w:val="000000"/>
+                              </w:rPr>
+                              <w:t>(</w:t>
+                            </w:r>
+                            <w:r>
+                              <w:rPr>
+                                <w:rFonts w:ascii="Arial" w:hAnsi="Arial" w:cs="Arial"/>
+                                <w:b/>
+                                <w:bCs/>
+                                <w:color w:val="000000"/>
+                                <w:sz w:val="20"/>
+                                <w:szCs w:val="20"/>
+                              </w:rPr>
+                              <w:t xml:space="preserve">Adicionar </w:t>
+                            </w:r>
+                            <w:r>
+                              <w:rPr>
+                                <w:rFonts w:ascii="Arial" w:hAnsi="Arial" w:cs="Arial"/>
+                                <w:b/>
+                                <w:bCs/>
+                                <w:color w:val="000000"/>
+                                <w:sz w:val="20"/>
+                                <w:szCs w:val="20"/>
+                              </w:rPr>
+                              <w:t xml:space="preserve">las </w:t>
+                            </w:r>
+                            <w:r>
+                              <w:rPr>
+                                <w:rFonts w:ascii="Arial" w:hAnsi="Arial" w:cs="Arial"/>
+                                <w:b/>
+                                <w:bCs/>
+                                <w:color w:val="000000"/>
+                                <w:sz w:val="20"/>
+                                <w:szCs w:val="20"/>
+                              </w:rPr>
+                              <w:t>páginas que sean necesarias)</w:t>
+                            </w:r>
+                          </w:p>
+                          <w:p>
+                            <w:pPr>
+                              <w:jc w:val="center"/>
+                              <w:rPr>
+                                <w:rFonts w:ascii="Arial" w:hAnsi="Arial" w:cs="Arial"/>
+                                <w:b/>
+                                <w:bCs/>
+                                <w:color w:val="0000FF"/>
+                                <w:sz w:val="28"/>
+                                <w:szCs w:val="28"/>
+                              </w:rPr>
+                            </w:pPr>
+                          </w:p>
+                        </w:txbxContent>
+                      </wps:txbx>
+                      <wps:bodyPr rot="0" vert="horz" wrap="square" lIns="91440" tIns="45720" rIns="91440" bIns="45720" anchor="t" anchorCtr="0" upright="1">
+                        <a:noAutofit/>
+                      </wps:bodyPr>
+                    </wps:wsp>
+                  </a:graphicData>
+                </a:graphic>
+                <wp14:sizeRelH relativeFrom="page">
+                  <wp14:pctWidth>0</wp14:pctWidth>
+                </wp14:sizeRelH>
+                <wp14:sizeRelV relativeFrom="page">
+                  <wp14:pctHeight>0</wp14:pctHeight>
+                </wp14:sizeRelV>
+              </wp:anchor>
+            </w:drawing>
+          </mc:Choice>
+          <mc:Fallback>
+            <w:pict>
+              <v:roundrect w14:anchorId="0C74D27C" id="_x0000_s1035" style="position:absolute;margin-left:0;margin-top:6.1pt;width:460.05pt;height:42.25pt;z-index:251729920;visibility:visible;mso-wrap-style:square;mso-width-percent:0;mso-height-percent:0;mso-wrap-distance-left:9pt;mso-wrap-distance-top:0;mso-wrap-distance-right:9pt;mso-wrap-distance-bottom:0;mso-position-horizontal:left;mso-position-horizontal-relative:margin;mso-position-vertical:absolute;mso-position-vertical-relative:text;mso-width-percent:0;mso-height-percent:0;mso-width-relative:page;mso-height-relative:page;v-text-anchor:top" arcsize="10923f" o:gfxdata="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">
+                <v:shadow on="t" opacity=".5" offset="6pt,6pt"/>
+                <v:textbox>
+                  <w:txbxContent>
+                    <w:p>
+                      <w:pPr>
+                        <w:jc w:val="center"/>
+                        <w:rPr>
+                          <w:rFonts w:ascii="Arial" w:hAnsi="Arial" w:cs="Arial"/>
+                          <w:b/>
+                          <w:bCs/>
+                          <w:color w:val="0000FF"/>
+                          <w:sz w:val="28"/>
+                          <w:szCs w:val="28"/>
+                        </w:rPr>
+                      </w:pPr>
+                      <w:r>
+                        <w:rPr>
+                          <w:rFonts w:ascii="Arial" w:hAnsi="Arial" w:cs="Arial"/>
+                          <w:b/>
+                          <w:bCs/>
+                          <w:color w:val="0000FF"/>
+                          <w:sz w:val="28"/>
+                          <w:szCs w:val="28"/>
+                        </w:rPr>
+                        <w:t>DIBUJO / ESQUEMA / DIAGRAMA</w:t>
+                      </w:r>
+                      <w:r>
+                        <w:rPr>
+                          <w:rFonts w:ascii="Arial" w:hAnsi="Arial" w:cs="Arial"/>
+                          <w:b/>
+                          <w:bCs/>
+                          <w:color w:val="0000FF"/>
+                          <w:sz w:val="28"/>
+                          <w:szCs w:val="28"/>
+                        </w:rPr>
+                        <w:t xml:space="preserve"> DE PROPUESTA</w:t>
+                      </w:r>
+                    </w:p>
+                    <w:p>
+                      <w:pPr>
+                        <w:pStyle w:val="Prrafodelista"/>
+                        <w:ind w:left="360"/>
+                        <w:jc w:val="center"/>
+                        <w:rPr>
+                          <w:rFonts w:ascii="Arial" w:hAnsi="Arial" w:cs="Arial"/>
+                          <w:b/>
+                          <w:bCs/>
+                          <w:color w:val="000000"/>
+                          <w:sz w:val="20"/>
+                          <w:szCs w:val="20"/>
+                        </w:rPr>
+                      </w:pPr>
+                      <w:r>
+                        <w:rPr>
+                          <w:rFonts w:ascii="Arial" w:hAnsi="Arial" w:cs="Arial"/>
+                          <w:b/>
+                          <w:bCs/>
+                          <w:color w:val="000000"/>
+                        </w:rPr>
+                        <w:t>(</w:t>
+                      </w:r>
+                      <w:r>
+                        <w:rPr>
+                          <w:rFonts w:ascii="Arial" w:hAnsi="Arial" w:cs="Arial"/>
+                          <w:b/>
+                          <w:bCs/>
+                          <w:color w:val="000000"/>
+                          <w:sz w:val="20"/>
+                          <w:szCs w:val="20"/>
+                        </w:rPr>
+                        <w:t xml:space="preserve">Adicionar </w:t>
+                      </w:r>
+                      <w:r>
+                        <w:rPr>
+                          <w:rFonts w:ascii="Arial" w:hAnsi="Arial" w:cs="Arial"/>
+                          <w:b/>
+                          <w:bCs/>
+                          <w:color w:val="000000"/>
+                          <w:sz w:val="20"/>
+                          <w:szCs w:val="20"/>
+                        </w:rPr>
+                        <w:t xml:space="preserve">las </w:t>
+                      </w:r>
+                      <w:r>
+                        <w:rPr>
+                          <w:rFonts w:ascii="Arial" w:hAnsi="Arial" w:cs="Arial"/>
+                          <w:b/>
+                          <w:bCs/>
+                          <w:color w:val="000000"/>
+                          <w:sz w:val="20"/>
+                          <w:szCs w:val="20"/>
+                        </w:rPr>
+                        <w:t>páginas que sean necesarias)</w:t>
+                      </w:r>
+                    </w:p>
+                    <w:p>
+                      <w:pPr>
+                        <w:jc w:val="center"/>
+                        <w:rPr>
+                          <w:rFonts w:ascii="Arial" w:hAnsi="Arial" w:cs="Arial"/>
+                          <w:b/>
+                          <w:bCs/>
+                          <w:color w:val="0000FF"/>
+                          <w:sz w:val="28"/>
+                          <w:szCs w:val="28"/>
+                        </w:rPr>
+                      </w:pPr>
+                    </w:p>
+                  </w:txbxContent>
+                </v:textbox>
+                <w10:wrap type="topAndBottom" anchorx="margin"/>
+              </v:roundrect>
+            </w:pict>
+          </mc:Fallback>
+        </mc:AlternateContent>
+      </w:r>
+    </w:p>
+    <w:p>
+      <w:pPr>
+        <w:tabs>
+          <w:tab w:val="left" w:pos="434"/>
+        </w:tabs>
+        <w:ind w:left="28"/>
+        <w:rPr>
+          <w:rFonts w:ascii="Arial" w:hAnsi="Arial" w:cs="Arial"/>
+          <w:b/>
+          <w:sz w:val="20"/>
+          <w:szCs w:val="20"/>
+        </w:rPr>
+      </w:pPr>
+    </w:p>
+    <w:p>
+      <w:pPr>
+        <w:spacing w:after="200" w:line="276" w:lineRule="auto"/>
+        <w:rPr>
+          <w:rFonts w:ascii="Arial" w:hAnsi="Arial" w:cs="Arial"/>
+          <w:b/>
+          <w:sz w:val="20"/>
+          <w:szCs w:val="20"/>
+        </w:rPr>
+      </w:pPr>
+      <w:r>
+        <w:rPr>
+          <w:rFonts w:ascii="Arial" w:hAnsi="Arial" w:cs="Arial"/>
+          <w:b/>
+          <w:sz w:val="20"/>
+          <w:szCs w:val="20"/>
+        </w:rPr>
+        <w:br w:type="page"/>
+      </w:r>
+    </w:p>
+    <w:p>
+      <w:pPr>
+        <w:tabs>
+          <w:tab w:val="left" w:pos="434"/>
+        </w:tabs>
+        <w:ind w:left="28"/>
+        <w:rPr>
+          <w:rFonts w:ascii="Arial" w:hAnsi="Arial" w:cs="Arial"/>
+          <w:b/>
+          <w:sz w:val="20"/>
+          <w:szCs w:val="20"/>
+        </w:rPr>
+      </w:pPr>
+      <w:r>
+        <w:rPr>
+          <w:rFonts w:ascii="Arial" w:hAnsi="Arial" w:cs="Arial"/>
+          <w:b/>
+          <w:sz w:val="20"/>
+          <w:szCs w:val="20"/>
+          <w:lang w:val="es-PE"/>
+        </w:rPr>
+        <w:lastRenderedPageBreak/>
+        <w:drawing>
+          <wp:anchor distT="0" distB="0" distL="114300" distR="114300" simplePos="0" relativeHeight="251732992" behindDoc="0" locked="0" layoutInCell="1" allowOverlap="1" wp14:anchorId="389E1A12" wp14:editId="0F33AE2B">
+            <wp:simplePos x="0" y="0"/>
+            <wp:positionH relativeFrom="margin">
+              <wp:align>right</wp:align>
+            </wp:positionH>
+            <wp:positionV relativeFrom="paragraph">
+              <wp:posOffset>644525</wp:posOffset>
+            </wp:positionV>
+            <wp:extent cx="6043295" cy="4650740"/>
+            <wp:effectExtent l="0" t="0" r="0" b="0"/>
+            <wp:wrapSquare wrapText="bothSides"/>
+            <wp:docPr id="2049739747" name="Imagen 21"/>
+            <wp:cNvGraphicFramePr>
+              <a:graphicFrameLocks xmlns:a="http://schemas.openxmlformats.org/drawingml/2006/main" noChangeAspect="1"/>
+            </wp:cNvGraphicFramePr>
+            <a:graphic xmlns:a="http://schemas.openxmlformats.org/drawingml/2006/main">
+              <a:graphicData uri="http://schemas.openxmlformats.org/drawingml/2006/picture">
+                <pic:pic xmlns:pic="http://schemas.openxmlformats.org/drawingml/2006/picture">
+                  <pic:nvPicPr>
+                    <pic:cNvPr id="0" name="Picture 20"/>
+                    <pic:cNvPicPr>
+                      <a:picLocks noChangeAspect="1" noChangeArrowheads="1"/>
+                    </pic:cNvPicPr>
+                  </pic:nvPicPr>
+                  <pic:blipFill>
+                    <a:blip r:embed="rId24" cstate="print">
+                      <a:extLst>
+                        <a:ext uri="{28A0092B-C50C-407E-A947-70E740481C1C}">
+                          <a14:useLocalDpi xmlns:a14="http://schemas.microsoft.com/office/drawing/2010/main" val="0"/>
+                        </a:ext>
+                      </a:extLst>
+                    </a:blip>
+                    <a:srcRect/>
+                    <a:stretch>
+                      <a:fillRect/>
+                    </a:stretch>
+                  </pic:blipFill>
+                  <pic:spPr bwMode="auto">
+                    <a:xfrm>
+                      <a:off x="0" y="0"/>
+                      <a:ext cx="6043295" cy="4650740"/>
+                    </a:xfrm>
+                    <a:prstGeom prst="rect">
+                      <a:avLst/>
+                    </a:prstGeom>
+                    <a:noFill/>
+                    <a:ln>
+                      <a:noFill/>
+                    </a:ln>
+                  </pic:spPr>
+                </pic:pic>
+              </a:graphicData>
+            </a:graphic>
+            <wp14:sizeRelH relativeFrom="page">
+              <wp14:pctWidth>0</wp14:pctWidth>
+            </wp14:sizeRelH>
+            <wp14:sizeRelV relativeFrom="page">
+              <wp14:pctHeight>0</wp14:pctHeight>
+            </wp14:sizeRelV>
+          </wp:anchor>
+        </w:drawing>
+      </w:r>
+      <w:r>
+        <w:rPr>
+          <w:rFonts w:ascii="Arial" w:hAnsi="Arial" w:cs="Arial"/>
+          <w:b/>
+          <w:noProof/>
+          <w:lang w:val="es-PE" w:eastAsia="es-PE"/>
+        </w:rPr>
+        <mc:AlternateContent>
+          <mc:Choice Requires="wps">
+            <w:drawing>
+              <wp:inline distT="0" distB="0" distL="0" distR="0" wp14:anchorId="1E748DB9" wp14:editId="5C855C1D">
+                <wp:extent cx="5842635" cy="536575"/>
+                <wp:effectExtent l="0" t="0" r="100965" b="92075"/>
+                <wp:docPr id="764317137" name="AutoShape 111"/>
+                <wp:cNvGraphicFramePr>
+                  <a:graphicFrameLocks xmlns:a="http://schemas.openxmlformats.org/drawingml/2006/main"/>
+                </wp:cNvGraphicFramePr>
+                <a:graphic xmlns:a="http://schemas.openxmlformats.org/drawingml/2006/main">
+                  <a:graphicData uri="http://schemas.microsoft.com/office/word/2010/wordprocessingShape">
+                    <wps:wsp>
+                      <wps:cNvSpPr>
+                        <a:spLocks noChangeArrowheads="1"/>
+                      </wps:cNvSpPr>
+                      <wps:spPr bwMode="auto">
+                        <a:xfrm>
+                          <a:off x="0" y="0"/>
+                          <a:ext cx="5842635" cy="536575"/>
+                        </a:xfrm>
+                        <a:prstGeom prst="roundRect">
+                          <a:avLst>
+                            <a:gd name="adj" fmla="val 16667"/>
+                          </a:avLst>
+                        </a:prstGeom>
+                        <a:solidFill>
+                          <a:srgbClr val="FFFFFF"/>
+                        </a:solidFill>
+                        <a:ln w="9525">
+                          <a:solidFill>
+                            <a:srgbClr val="000000"/>
+                          </a:solidFill>
+                          <a:round/>
+                          <a:headEnd/>
+                          <a:tailEnd/>
+                        </a:ln>
+                        <a:effectLst>
+                          <a:outerShdw dist="107763" dir="2700000" algn="ctr" rotWithShape="0">
+                            <a:srgbClr val="808080">
+                              <a:alpha val="50000"/>
+                            </a:srgbClr>
+                          </a:outerShdw>
+                        </a:effectLst>
+                      </wps:spPr>
+                      <wps:txbx>
+                        <w:txbxContent>
+                          <w:p>
+                            <w:pPr>
+                              <w:jc w:val="center"/>
+                              <w:rPr>
+                                <w:rFonts w:ascii="Arial" w:hAnsi="Arial" w:cs="Arial"/>
+                                <w:b/>
+                                <w:bCs/>
+                                <w:color w:val="0000FF"/>
+                                <w:sz w:val="28"/>
+                                <w:szCs w:val="28"/>
+                              </w:rPr>
+                            </w:pPr>
+                            <w:r>
+                              <w:rPr>
+                                <w:rFonts w:ascii="Arial" w:hAnsi="Arial" w:cs="Arial"/>
+                                <w:b/>
+                                <w:bCs/>
+                                <w:color w:val="0000FF"/>
+                                <w:sz w:val="28"/>
+                                <w:szCs w:val="28"/>
+                              </w:rPr>
+                              <w:t>DIBUJO / ESQUEMA / DIAGRAMA</w:t>
+                            </w:r>
+                            <w:r>
+                              <w:rPr>
+                                <w:rFonts w:ascii="Arial" w:hAnsi="Arial" w:cs="Arial"/>
+                                <w:b/>
+                                <w:bCs/>
+                                <w:color w:val="0000FF"/>
+                                <w:sz w:val="28"/>
+                                <w:szCs w:val="28"/>
+                              </w:rPr>
+                              <w:t xml:space="preserve"> DE PROPUESTA</w:t>
+                            </w:r>
+                          </w:p>
+                          <w:p>
+                            <w:pPr>
+                              <w:pStyle w:val="Prrafodelista"/>
+                              <w:ind w:left="360"/>
+                              <w:jc w:val="center"/>
+                              <w:rPr>
+                                <w:rFonts w:ascii="Arial" w:hAnsi="Arial" w:cs="Arial"/>
+                                <w:b/>
+                                <w:bCs/>
+                                <w:color w:val="000000"/>
+                                <w:sz w:val="20"/>
+                                <w:szCs w:val="20"/>
+                              </w:rPr>
+                            </w:pPr>
+                            <w:r>
+                              <w:rPr>
+                                <w:rFonts w:ascii="Arial" w:hAnsi="Arial" w:cs="Arial"/>
+                                <w:b/>
+                                <w:bCs/>
+                                <w:color w:val="000000"/>
+                              </w:rPr>
+                              <w:t>(</w:t>
+                            </w:r>
+                            <w:r>
+                              <w:rPr>
+                                <w:rFonts w:ascii="Arial" w:hAnsi="Arial" w:cs="Arial"/>
+                                <w:b/>
+                                <w:bCs/>
+                                <w:color w:val="000000"/>
+                                <w:sz w:val="20"/>
+                                <w:szCs w:val="20"/>
+                              </w:rPr>
+                              <w:t xml:space="preserve">Adicionar </w:t>
+                            </w:r>
+                            <w:r>
+                              <w:rPr>
+                                <w:rFonts w:ascii="Arial" w:hAnsi="Arial" w:cs="Arial"/>
+                                <w:b/>
+                                <w:bCs/>
+                                <w:color w:val="000000"/>
+                                <w:sz w:val="20"/>
+                                <w:szCs w:val="20"/>
+                              </w:rPr>
+                              <w:t xml:space="preserve">las </w:t>
+                            </w:r>
+                            <w:r>
+                              <w:rPr>
+                                <w:rFonts w:ascii="Arial" w:hAnsi="Arial" w:cs="Arial"/>
+                                <w:b/>
+                                <w:bCs/>
+                                <w:color w:val="000000"/>
+                                <w:sz w:val="20"/>
+                                <w:szCs w:val="20"/>
+                              </w:rPr>
+                              <w:t>páginas que sean necesarias)</w:t>
+                            </w:r>
+                          </w:p>
+                          <w:p>
+                            <w:pPr>
+                              <w:jc w:val="center"/>
+                              <w:rPr>
+                                <w:rFonts w:ascii="Arial" w:hAnsi="Arial" w:cs="Arial"/>
+                                <w:b/>
+                                <w:bCs/>
+                                <w:color w:val="0000FF"/>
+                                <w:sz w:val="28"/>
+                                <w:szCs w:val="28"/>
+                              </w:rPr>
+                            </w:pPr>
+                          </w:p>
+                        </w:txbxContent>
+                      </wps:txbx>
+                      <wps:bodyPr rot="0" vert="horz" wrap="square" lIns="91440" tIns="45720" rIns="91440" bIns="45720" anchor="t" anchorCtr="0" upright="1">
+                        <a:noAutofit/>
+                      </wps:bodyPr>
+                    </wps:wsp>
+                  </a:graphicData>
+                </a:graphic>
+              </wp:inline>
+            </w:drawing>
+          </mc:Choice>
+          <mc:Fallback>
+            <w:pict>
+              <v:roundrect w14:anchorId="1E748DB9" id="AutoShape 111" o:spid="_x0000_s1036" style="width:460.05pt;height:42.25pt;visibility:visible;mso-wrap-style:square;mso-left-percent:-10001;mso-top-percent:-10001;mso-position-horizontal:absolute;mso-position-horizontal-relative:char;mso-position-vertical:absolute;mso-position-vertical-relative:line;mso-left-percent:-10001;mso-top-percent:-10001;v-text-anchor:top" arcsize="10923f" o:gfxdata="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">
+                <v:shadow on="t" opacity=".5" offset="6pt,6pt"/>
+                <v:textbox>
+                  <w:txbxContent>
+                    <w:p>
+                      <w:pPr>
+                        <w:jc w:val="center"/>
+                        <w:rPr>
+                          <w:rFonts w:ascii="Arial" w:hAnsi="Arial" w:cs="Arial"/>
+                          <w:b/>
+                          <w:bCs/>
+                          <w:color w:val="0000FF"/>
+                          <w:sz w:val="28"/>
+                          <w:szCs w:val="28"/>
+                        </w:rPr>
+                      </w:pPr>
+                      <w:r>
+                        <w:rPr>
+                          <w:rFonts w:ascii="Arial" w:hAnsi="Arial" w:cs="Arial"/>
+                          <w:b/>
+                          <w:bCs/>
+                          <w:color w:val="0000FF"/>
+                          <w:sz w:val="28"/>
+                          <w:szCs w:val="28"/>
+                        </w:rPr>
+                        <w:t>DIBUJO / ESQUEMA / DIAGRAMA</w:t>
+                      </w:r>
+                      <w:r>
+                        <w:rPr>
+                          <w:rFonts w:ascii="Arial" w:hAnsi="Arial" w:cs="Arial"/>
+                          <w:b/>
+                          <w:bCs/>
+                          <w:color w:val="0000FF"/>
+                          <w:sz w:val="28"/>
+                          <w:szCs w:val="28"/>
+                        </w:rPr>
+                        <w:t xml:space="preserve"> DE PROPUESTA</w:t>
+                      </w:r>
+                    </w:p>
+                    <w:p>
+                      <w:pPr>
+                        <w:pStyle w:val="Prrafodelista"/>
+                        <w:ind w:left="360"/>
+                        <w:jc w:val="center"/>
+                        <w:rPr>
+                          <w:rFonts w:ascii="Arial" w:hAnsi="Arial" w:cs="Arial"/>
+                          <w:b/>
+                          <w:bCs/>
+                          <w:color w:val="000000"/>
+                          <w:sz w:val="20"/>
+                          <w:szCs w:val="20"/>
+                        </w:rPr>
+                      </w:pPr>
+                      <w:r>
+                        <w:rPr>
+                          <w:rFonts w:ascii="Arial" w:hAnsi="Arial" w:cs="Arial"/>
+                          <w:b/>
+                          <w:bCs/>
+                          <w:color w:val="000000"/>
+                        </w:rPr>
+                        <w:t>(</w:t>
+                      </w:r>
+                      <w:r>
+                        <w:rPr>
+                          <w:rFonts w:ascii="Arial" w:hAnsi="Arial" w:cs="Arial"/>
+                          <w:b/>
+                          <w:bCs/>
+                          <w:color w:val="000000"/>
+                          <w:sz w:val="20"/>
+                          <w:szCs w:val="20"/>
+                        </w:rPr>
+                        <w:t xml:space="preserve">Adicionar </w:t>
+                      </w:r>
+                      <w:r>
+                        <w:rPr>
+                          <w:rFonts w:ascii="Arial" w:hAnsi="Arial" w:cs="Arial"/>
+                          <w:b/>
+                          <w:bCs/>
+                          <w:color w:val="000000"/>
+                          <w:sz w:val="20"/>
+                          <w:szCs w:val="20"/>
+                        </w:rPr>
+                        <w:t xml:space="preserve">las </w:t>
+                      </w:r>
+                      <w:r>
+                        <w:rPr>
+                          <w:rFonts w:ascii="Arial" w:hAnsi="Arial" w:cs="Arial"/>
+                          <w:b/>
+                          <w:bCs/>
+                          <w:color w:val="000000"/>
+                          <w:sz w:val="20"/>
+                          <w:szCs w:val="20"/>
+                        </w:rPr>
+                        <w:t>páginas que sean necesarias)</w:t>
+                      </w:r>
+                    </w:p>
+                    <w:p>
+                      <w:pPr>
+                        <w:jc w:val="center"/>
+                        <w:rPr>
+                          <w:rFonts w:ascii="Arial" w:hAnsi="Arial" w:cs="Arial"/>
+                          <w:b/>
+                          <w:bCs/>
+                          <w:color w:val="0000FF"/>
+                          <w:sz w:val="28"/>
+                          <w:szCs w:val="28"/>
+                        </w:rPr>
+                      </w:pPr>
+                    </w:p>
+                  </w:txbxContent>
+                </v:textbox>
+                <w10:anchorlock/>
+              </v:roundrect>
+            </w:pict>
+          </mc:Fallback>
+        </mc:AlternateContent>
+      </w:r>
+    </w:p>
+    <w:p>
+      <w:pPr>
+        <w:spacing w:after="200" w:line="276" w:lineRule="auto"/>
+        <w:rPr>
+          <w:rFonts w:ascii="Arial" w:hAnsi="Arial" w:cs="Arial"/>
+          <w:b/>
+          <w:sz w:val="20"/>
+          <w:szCs w:val="20"/>
+        </w:rPr>
+      </w:pPr>
+      <w:r>
+        <w:rPr>
+          <w:rFonts w:ascii="Arial" w:hAnsi="Arial" w:cs="Arial"/>
+          <w:b/>
+          <w:sz w:val="20"/>
+          <w:szCs w:val="20"/>
+        </w:rPr>
+        <w:br w:type="page"/>
+      </w:r>
+    </w:p>
+    <w:p>
+      <w:pPr>
+        <w:spacing w:after="200" w:line="276" w:lineRule="auto"/>
+        <w:rPr>
+          <w:rFonts w:ascii="Arial" w:hAnsi="Arial" w:cs="Arial"/>
+          <w:b/>
+          <w:sz w:val="20"/>
+          <w:szCs w:val="20"/>
+          <w:lang w:val="es-PE"/>
+        </w:rPr>
+      </w:pPr>
+    </w:p>
+    <w:p>
+      <w:pPr>
+        <w:tabs>
+          <w:tab w:val="left" w:pos="434"/>
+        </w:tabs>
+        <w:ind w:left="28"/>
+        <w:rPr>
+          <w:rFonts w:ascii="Arial" w:hAnsi="Arial" w:cs="Arial"/>
+          <w:b/>
+          <w:sz w:val="20"/>
+          <w:szCs w:val="20"/>
+        </w:rPr>
+      </w:pPr>
+      <w:r>
+        <w:rPr>
+          <w:rFonts w:ascii="Arial" w:eastAsiaTheme="majorEastAsia" w:hAnsi="Arial" w:cs="Arial"/>
+          <w:b/>
+          <w:bCs/>
+          <w:color w:val="1D4ED8"/>
+          <w:sz w:val="32"/>
+          <w:szCs w:val="32"/>
+          <w:lang w:val="es-PE"/>
+        </w:rPr>
+        <w:drawing>
+          <wp:anchor distT="0" distB="0" distL="114300" distR="114300" simplePos="0" relativeHeight="251730944" behindDoc="0" locked="0" layoutInCell="1" allowOverlap="1" wp14:anchorId="22541A56" wp14:editId="38ED4998">
+            <wp:simplePos x="0" y="0"/>
+            <wp:positionH relativeFrom="margin">
+              <wp:align>left</wp:align>
+            </wp:positionH>
+            <wp:positionV relativeFrom="paragraph">
+              <wp:posOffset>619863</wp:posOffset>
+            </wp:positionV>
+            <wp:extent cx="6030595" cy="4773930"/>
+            <wp:effectExtent l="0" t="0" r="8255" b="7620"/>
+            <wp:wrapSquare wrapText="bothSides"/>
+            <wp:docPr id="548086934" name="Imagen 19"/>
+            <wp:cNvGraphicFramePr>
+              <a:graphicFrameLocks xmlns:a="http://schemas.openxmlformats.org/drawingml/2006/main" noChangeAspect="1"/>
+            </wp:cNvGraphicFramePr>
+            <a:graphic xmlns:a="http://schemas.openxmlformats.org/drawingml/2006/main">
+              <a:graphicData uri="http://schemas.openxmlformats.org/drawingml/2006/picture">
+                <pic:pic xmlns:pic="http://schemas.openxmlformats.org/drawingml/2006/picture">
+                  <pic:nvPicPr>
+                    <pic:cNvPr id="0" name="Picture 13"/>
+                    <pic:cNvPicPr>
+                      <a:picLocks noChangeAspect="1" noChangeArrowheads="1"/>
+                    </pic:cNvPicPr>
+                  </pic:nvPicPr>
+                  <pic:blipFill>
+                    <a:blip r:embed="rId25">
+                      <a:extLst>
+                        <a:ext uri="{28A0092B-C50C-407E-A947-70E740481C1C}">
+                          <a14:useLocalDpi xmlns:a14="http://schemas.microsoft.com/office/drawing/2010/main" val="0"/>
+                        </a:ext>
+                      </a:extLst>
+                    </a:blip>
+                    <a:srcRect/>
+                    <a:stretch>
+                      <a:fillRect/>
+                    </a:stretch>
+                  </pic:blipFill>
+                  <pic:spPr bwMode="auto">
+                    <a:xfrm>
+                      <a:off x="0" y="0"/>
+                      <a:ext cx="6030595" cy="4773930"/>
+                    </a:xfrm>
+                    <a:prstGeom prst="rect">
+                      <a:avLst/>
+                    </a:prstGeom>
+                    <a:noFill/>
+                    <a:ln>
+                      <a:noFill/>
+                    </a:ln>
+                  </pic:spPr>
+                </pic:pic>
+              </a:graphicData>
+            </a:graphic>
+            <wp14:sizeRelH relativeFrom="page">
+              <wp14:pctWidth>0</wp14:pctWidth>
+            </wp14:sizeRelH>
+            <wp14:sizeRelV relativeFrom="page">
+              <wp14:pctHeight>0</wp14:pctHeight>
+            </wp14:sizeRelV>
+          </wp:anchor>
+        </w:drawing>
+      </w:r>
+      <w:r>
+        <w:rPr>
+          <w:rFonts w:ascii="Arial" w:hAnsi="Arial" w:cs="Arial"/>
+          <w:b/>
+          <w:noProof/>
+          <w:lang w:val="es-PE" w:eastAsia="es-PE"/>
+        </w:rPr>
+        <mc:AlternateContent>
+          <mc:Choice Requires="wps">
+            <w:drawing>
+              <wp:anchor distT="0" distB="0" distL="114300" distR="114300" simplePos="0" relativeHeight="251727872" behindDoc="0" locked="0" layoutInCell="1" allowOverlap="1" wp14:anchorId="5C721208" wp14:editId="1F2AA954">
+                <wp:simplePos x="0" y="0"/>
+                <wp:positionH relativeFrom="margin">
+                  <wp:align>left</wp:align>
+                </wp:positionH>
+                <wp:positionV relativeFrom="paragraph">
+                  <wp:posOffset>13648</wp:posOffset>
+                </wp:positionV>
+                <wp:extent cx="6023610" cy="536575"/>
+                <wp:effectExtent l="0" t="0" r="91440" b="92075"/>
+                <wp:wrapTopAndBottom/>
+                <wp:docPr id="213049767" name="AutoShape 111"/>
+                <wp:cNvGraphicFramePr>
+                  <a:graphicFrameLocks xmlns:a="http://schemas.openxmlformats.org/drawingml/2006/main"/>
+                </wp:cNvGraphicFramePr>
+                <a:graphic xmlns:a="http://schemas.openxmlformats.org/drawingml/2006/main">
+                  <a:graphicData uri="http://schemas.microsoft.com/office/word/2010/wordprocessingShape">
+                    <wps:wsp>
+                      <wps:cNvSpPr>
+                        <a:spLocks noChangeArrowheads="1"/>
+                      </wps:cNvSpPr>
+                      <wps:spPr bwMode="auto">
+                        <a:xfrm>
+                          <a:off x="0" y="0"/>
+                          <a:ext cx="6023610" cy="536575"/>
+                        </a:xfrm>
+                        <a:prstGeom prst="roundRect">
+                          <a:avLst>
+                            <a:gd name="adj" fmla="val 16667"/>
+                          </a:avLst>
+                        </a:prstGeom>
+                        <a:solidFill>
+                          <a:srgbClr val="FFFFFF"/>
+                        </a:solidFill>
+                        <a:ln w="9525">
+                          <a:solidFill>
+                            <a:srgbClr val="000000"/>
+                          </a:solidFill>
+                          <a:round/>
+                          <a:headEnd/>
+                          <a:tailEnd/>
+                        </a:ln>
+                        <a:effectLst>
+                          <a:outerShdw dist="107763" dir="2700000" algn="ctr" rotWithShape="0">
+                            <a:srgbClr val="808080">
+                              <a:alpha val="50000"/>
+                            </a:srgbClr>
+                          </a:outerShdw>
+                        </a:effectLst>
+                      </wps:spPr>
+                      <wps:txbx>
+                        <w:txbxContent>
+                          <w:p>
+                            <w:pPr>
+                              <w:jc w:val="center"/>
+                              <w:rPr>
+                                <w:rFonts w:ascii="Arial" w:hAnsi="Arial" w:cs="Arial"/>
+                                <w:b/>
+                                <w:bCs/>
+                                <w:color w:val="0000FF"/>
+                                <w:sz w:val="28"/>
+                                <w:szCs w:val="28"/>
+                              </w:rPr>
+                            </w:pPr>
+                            <w:r>
+                              <w:rPr>
+                                <w:rFonts w:ascii="Arial" w:hAnsi="Arial" w:cs="Arial"/>
+                                <w:b/>
+                                <w:bCs/>
+                                <w:color w:val="0000FF"/>
+                                <w:sz w:val="28"/>
+                                <w:szCs w:val="28"/>
+                              </w:rPr>
+                              <w:t>DIBUJO / ESQUEMA / DIAGRAMA</w:t>
+                            </w:r>
+                            <w:r>
+                              <w:rPr>
+                                <w:rFonts w:ascii="Arial" w:hAnsi="Arial" w:cs="Arial"/>
+                                <w:b/>
+                                <w:bCs/>
+                                <w:color w:val="0000FF"/>
+                                <w:sz w:val="28"/>
+                                <w:szCs w:val="28"/>
+                              </w:rPr>
+                              <w:t xml:space="preserve"> DE PROPUESTA</w:t>
+                            </w:r>
+                          </w:p>
+                          <w:p>
+                            <w:pPr>
+                              <w:pStyle w:val="Prrafodelista"/>
+                              <w:ind w:left="360"/>
+                              <w:jc w:val="center"/>
+                              <w:rPr>
+                                <w:rFonts w:ascii="Arial" w:hAnsi="Arial" w:cs="Arial"/>
+                                <w:b/>
+                                <w:bCs/>
+                                <w:color w:val="000000"/>
+                                <w:sz w:val="20"/>
+                                <w:szCs w:val="20"/>
+                              </w:rPr>
+                            </w:pPr>
+                            <w:r>
+                              <w:rPr>
+                                <w:rFonts w:ascii="Arial" w:hAnsi="Arial" w:cs="Arial"/>
+                                <w:b/>
+                                <w:bCs/>
+                                <w:color w:val="000000"/>
+                              </w:rPr>
+                              <w:t>(</w:t>
+                            </w:r>
+                            <w:r>
+                              <w:rPr>
+                                <w:rFonts w:ascii="Arial" w:hAnsi="Arial" w:cs="Arial"/>
+                                <w:b/>
+                                <w:bCs/>
+                                <w:color w:val="000000"/>
+                                <w:sz w:val="20"/>
+                                <w:szCs w:val="20"/>
+                              </w:rPr>
+                              <w:t xml:space="preserve">Adicionar </w:t>
+                            </w:r>
+                            <w:r>
+                              <w:rPr>
+                                <w:rFonts w:ascii="Arial" w:hAnsi="Arial" w:cs="Arial"/>
+                                <w:b/>
+                                <w:bCs/>
+                                <w:color w:val="000000"/>
+                                <w:sz w:val="20"/>
+                                <w:szCs w:val="20"/>
+                              </w:rPr>
+                              <w:t xml:space="preserve">las </w:t>
+                            </w:r>
+                            <w:r>
+                              <w:rPr>
+                                <w:rFonts w:ascii="Arial" w:hAnsi="Arial" w:cs="Arial"/>
+                                <w:b/>
+                                <w:bCs/>
+                                <w:color w:val="000000"/>
+                                <w:sz w:val="20"/>
+                                <w:szCs w:val="20"/>
+                              </w:rPr>
+                              <w:t>páginas que sean necesarias)</w:t>
+                            </w:r>
+                          </w:p>
+                          <w:p>
+                            <w:pPr>
+                              <w:jc w:val="center"/>
+                              <w:rPr>
+                                <w:rFonts w:ascii="Arial" w:hAnsi="Arial" w:cs="Arial"/>
+                                <w:b/>
+                                <w:bCs/>
+                                <w:color w:val="0000FF"/>
+                                <w:sz w:val="28"/>
+                                <w:szCs w:val="28"/>
+                              </w:rPr>
+                            </w:pPr>
+                          </w:p>
+                        </w:txbxContent>
+                      </wps:txbx>
+                      <wps:bodyPr rot="0" vert="horz" wrap="square" lIns="91440" tIns="45720" rIns="91440" bIns="45720" anchor="t" anchorCtr="0" upright="1">
+                        <a:noAutofit/>
+                      </wps:bodyPr>
+                    </wps:wsp>
+                  </a:graphicData>
+                </a:graphic>
+                <wp14:sizeRelH relativeFrom="page">
+                  <wp14:pctWidth>0</wp14:pctWidth>
+                </wp14:sizeRelH>
+                <wp14:sizeRelV relativeFrom="page">
+                  <wp14:pctHeight>0</wp14:pctHeight>
+                </wp14:sizeRelV>
+              </wp:anchor>
+            </w:drawing>
+          </mc:Choice>
+          <mc:Fallback>
+            <w:pict>
+              <v:roundrect w14:anchorId="5C721208" id="_x0000_s1037" style="position:absolute;left:0;text-align:left;margin-left:0;margin-top:1.05pt;width:474.3pt;height:42.25pt;z-index:251727872;visibility:visible;mso-wrap-style:square;mso-width-percent:0;mso-height-percent:0;mso-wrap-distance-left:9pt;mso-wrap-distance-top:0;mso-wrap-distance-right:9pt;mso-wrap-distance-bottom:0;mso-position-horizontal:left;mso-position-horizontal-relative:margin;mso-position-vertical:absolute;mso-position-vertical-relative:text;mso-width-percent:0;mso-height-percent:0;mso-width-relative:page;mso-height-relative:page;v-text-anchor:top" arcsize="10923f" o:gfxdata="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">
+                <v:shadow on="t" opacity=".5" offset="6pt,6pt"/>
+                <v:textbox>
+                  <w:txbxContent>
+                    <w:p>
+                      <w:pPr>
+                        <w:jc w:val="center"/>
+                        <w:rPr>
+                          <w:rFonts w:ascii="Arial" w:hAnsi="Arial" w:cs="Arial"/>
+                          <w:b/>
+                          <w:bCs/>
+                          <w:color w:val="0000FF"/>
+                          <w:sz w:val="28"/>
+                          <w:szCs w:val="28"/>
+                        </w:rPr>
+                      </w:pPr>
+                      <w:r>
+                        <w:rPr>
+                          <w:rFonts w:ascii="Arial" w:hAnsi="Arial" w:cs="Arial"/>
+                          <w:b/>
+                          <w:bCs/>
+                          <w:color w:val="0000FF"/>
+                          <w:sz w:val="28"/>
+                          <w:szCs w:val="28"/>
+                        </w:rPr>
+                        <w:t>DIBUJO / ESQUEMA / DIAGRAMA</w:t>
+                      </w:r>
+                      <w:r>
+                        <w:rPr>
+                          <w:rFonts w:ascii="Arial" w:hAnsi="Arial" w:cs="Arial"/>
+                          <w:b/>
+                          <w:bCs/>
+                          <w:color w:val="0000FF"/>
+                          <w:sz w:val="28"/>
+                          <w:szCs w:val="28"/>
+                        </w:rPr>
+                        <w:t xml:space="preserve"> DE PROPUESTA</w:t>
+                      </w:r>
+                    </w:p>
+                    <w:p>
+                      <w:pPr>
+                        <w:pStyle w:val="Prrafodelista"/>
+                        <w:ind w:left="360"/>
+                        <w:jc w:val="center"/>
+                        <w:rPr>
+                          <w:rFonts w:ascii="Arial" w:hAnsi="Arial" w:cs="Arial"/>
+                          <w:b/>
+                          <w:bCs/>
+                          <w:color w:val="000000"/>
+                          <w:sz w:val="20"/>
+                          <w:szCs w:val="20"/>
+                        </w:rPr>
+                      </w:pPr>
+                      <w:r>
+                        <w:rPr>
+                          <w:rFonts w:ascii="Arial" w:hAnsi="Arial" w:cs="Arial"/>
+                          <w:b/>
+                          <w:bCs/>
+                          <w:color w:val="000000"/>
+                        </w:rPr>
+                        <w:t>(</w:t>
+                      </w:r>
+                      <w:r>
+                        <w:rPr>
+                          <w:rFonts w:ascii="Arial" w:hAnsi="Arial" w:cs="Arial"/>
+                          <w:b/>
+                          <w:bCs/>
+                          <w:color w:val="000000"/>
+                          <w:sz w:val="20"/>
+                          <w:szCs w:val="20"/>
+                        </w:rPr>
+                        <w:t xml:space="preserve">Adicionar </w:t>
+                      </w:r>
+                      <w:r>
+                        <w:rPr>
+                          <w:rFonts w:ascii="Arial" w:hAnsi="Arial" w:cs="Arial"/>
+                          <w:b/>
+                          <w:bCs/>
+                          <w:color w:val="000000"/>
+                          <w:sz w:val="20"/>
+                          <w:szCs w:val="20"/>
+                        </w:rPr>
+                        <w:t xml:space="preserve">las </w:t>
+                      </w:r>
+                      <w:r>
+                        <w:rPr>
+                          <w:rFonts w:ascii="Arial" w:hAnsi="Arial" w:cs="Arial"/>
+                          <w:b/>
+                          <w:bCs/>
+                          <w:color w:val="000000"/>
+                          <w:sz w:val="20"/>
+                          <w:szCs w:val="20"/>
+                        </w:rPr>
+                        <w:t>páginas que sean necesarias)</w:t>
+                      </w:r>
+                    </w:p>
+                    <w:p>
+                      <w:pPr>
+                        <w:jc w:val="center"/>
+                        <w:rPr>
+                          <w:rFonts w:ascii="Arial" w:hAnsi="Arial" w:cs="Arial"/>
+                          <w:b/>
+                          <w:bCs/>
+                          <w:color w:val="0000FF"/>
+                          <w:sz w:val="28"/>
+                          <w:szCs w:val="28"/>
+                        </w:rPr>
+                      </w:pPr>
+                    </w:p>
+                  </w:txbxContent>
+                </v:textbox>
+                <w10:wrap type="topAndBottom" anchorx="margin"/>
+              </v:roundrect>
+            </w:pict>
+          </mc:Fallback>
+        </mc:AlternateContent>
+      </w:r>
+    </w:p>
+    <w:p>
+      <w:pPr>
+        <w:spacing w:after="200" w:line="276" w:lineRule="auto"/>
+        <w:rPr>
+          <w:rFonts w:ascii="Arial" w:eastAsiaTheme="majorEastAsia" w:hAnsi="Arial" w:cs="Arial"/>
+          <w:b/>
+          <w:bCs/>
+          <w:color w:val="1D4ED8"/>
+          <w:sz w:val="32"/>
+          <w:szCs w:val="32"/>
+        </w:rPr>
+      </w:pPr>
+      <w:r>
+        <w:rPr>
+          <w:rFonts w:ascii="Arial" w:hAnsi="Arial" w:cs="Arial"/>
+          <w:b/>
+          <w:bCs/>
+          <w:color w:val="1D4ED8"/>
+        </w:rPr>
+        <w:br w:type="page"/>
+      </w:r>
+    </w:p>
+    <w:p>
+      <w:pPr>
+        <w:pStyle w:val="Ttulo1"/>
+        <w:spacing w:before="300" w:after="150"/>
+        <w:rPr>
+          <w:rFonts w:ascii="Arial" w:hAnsi="Arial" w:cs="Arial"/>
+          <w:b/>
+          <w:bCs/>
+          <w:color w:val="1D4ED8"/>
+          <w:lang w:val="es-PE"/>
+        </w:rPr>
+      </w:pPr>
+      <w:r>
+        <w:rPr>
+          <w:rFonts w:ascii="Arial" w:hAnsi="Arial" w:cs="Arial"/>
+          <w:b/>
+          <w:bCs/>
+          <w:color w:val="1D4ED8"/>
+          <w:lang w:val="es-PE"/>
+        </w:rPr>
+        <w:lastRenderedPageBreak/>
+        <w:drawing>
+          <wp:anchor distT="0" distB="0" distL="114300" distR="114300" simplePos="0" relativeHeight="251734016" behindDoc="0" locked="0" layoutInCell="1" allowOverlap="1" wp14:anchorId="0175A9B1" wp14:editId="61EDDC27">
+            <wp:simplePos x="0" y="0"/>
+            <wp:positionH relativeFrom="margin">
+              <wp:align>center</wp:align>
+            </wp:positionH>
+            <wp:positionV relativeFrom="paragraph">
+              <wp:posOffset>628650</wp:posOffset>
+            </wp:positionV>
+            <wp:extent cx="3972560" cy="8498840"/>
+            <wp:effectExtent l="0" t="0" r="8890" b="0"/>
+            <wp:wrapTopAndBottom/>
+            <wp:docPr id="534154555" name="Imagen 25"/>
+            <wp:cNvGraphicFramePr>
+              <a:graphicFrameLocks xmlns:a="http://schemas.openxmlformats.org/drawingml/2006/main" noChangeAspect="1"/>
+            </wp:cNvGraphicFramePr>
+            <a:graphic xmlns:a="http://schemas.openxmlformats.org/drawingml/2006/main">
+              <a:graphicData uri="http://schemas.openxmlformats.org/drawingml/2006/picture">
+                <pic:pic xmlns:pic="http://schemas.openxmlformats.org/drawingml/2006/picture">
+                  <pic:nvPicPr>
+                    <pic:cNvPr id="0" name="Picture 37"/>
+                    <pic:cNvPicPr>
+                      <a:picLocks noChangeAspect="1" noChangeArrowheads="1"/>
+                    </pic:cNvPicPr>
+                  </pic:nvPicPr>
+                  <pic:blipFill>
+                    <a:blip r:embed="rId26">
+                      <a:extLst>
+                        <a:ext uri="{28A0092B-C50C-407E-A947-70E740481C1C}">
+                          <a14:useLocalDpi xmlns:a14="http://schemas.microsoft.com/office/drawing/2010/main" val="0"/>
+                        </a:ext>
+                      </a:extLst>
+                    </a:blip>
+                    <a:srcRect/>
+                    <a:stretch>
+                      <a:fillRect/>
+                    </a:stretch>
+                  </pic:blipFill>
+                  <pic:spPr bwMode="auto">
+                    <a:xfrm>
+                      <a:off x="0" y="0"/>
+                      <a:ext cx="3972560" cy="8498840"/>
+                    </a:xfrm>
+                    <a:prstGeom prst="rect">
+                      <a:avLst/>
+                    </a:prstGeom>
+                    <a:noFill/>
+                    <a:ln>
+                      <a:noFill/>
+                    </a:ln>
+                  </pic:spPr>
+                </pic:pic>
+              </a:graphicData>
+            </a:graphic>
+            <wp14:sizeRelH relativeFrom="page">
+              <wp14:pctWidth>0</wp14:pctWidth>
+            </wp14:sizeRelH>
+            <wp14:sizeRelV relativeFrom="page">
+              <wp14:pctHeight>0</wp14:pctHeight>
+            </wp14:sizeRelV>
+          </wp:anchor>
+        </w:drawing>
+      </w:r>
+      <w:r>
+        <w:rPr>
+          <w:rFonts w:ascii="Arial" w:hAnsi="Arial" w:cs="Arial"/>
+          <w:b/>
+          <w:noProof/>
+          <w:lang w:val="es-PE" w:eastAsia="es-PE"/>
+        </w:rPr>
+        <mc:AlternateContent>
+          <mc:Choice Requires="wps">
+            <w:drawing>
+              <wp:inline distT="0" distB="0" distL="0" distR="0" wp14:anchorId="720980EE" wp14:editId="2545319F">
+                <wp:extent cx="6023610" cy="536575"/>
+                <wp:effectExtent l="0" t="0" r="91440" b="92075"/>
+                <wp:docPr id="337981001" name="AutoShape 111"/>
+                <wp:cNvGraphicFramePr>
+                  <a:graphicFrameLocks xmlns:a="http://schemas.openxmlformats.org/drawingml/2006/main"/>
+                </wp:cNvGraphicFramePr>
+                <a:graphic xmlns:a="http://schemas.openxmlformats.org/drawingml/2006/main">
+                  <a:graphicData uri="http://schemas.microsoft.com/office/word/2010/wordprocessingShape">
+                    <wps:wsp>
+                      <wps:cNvSpPr>
+                        <a:spLocks noChangeArrowheads="1"/>
+                      </wps:cNvSpPr>
+                      <wps:spPr bwMode="auto">
+                        <a:xfrm>
+                          <a:off x="0" y="0"/>
+                          <a:ext cx="6023610" cy="536575"/>
+                        </a:xfrm>
+                        <a:prstGeom prst="roundRect">
+                          <a:avLst>
+                            <a:gd name="adj" fmla="val 16667"/>
+                          </a:avLst>
+                        </a:prstGeom>
+                        <a:solidFill>
+                          <a:srgbClr val="FFFFFF"/>
+                        </a:solidFill>
+                        <a:ln w="9525">
+                          <a:solidFill>
+                            <a:srgbClr val="000000"/>
+                          </a:solidFill>
+                          <a:round/>
+                          <a:headEnd/>
+                          <a:tailEnd/>
+                        </a:ln>
+                        <a:effectLst>
+                          <a:outerShdw dist="107763" dir="2700000" algn="ctr" rotWithShape="0">
+                            <a:srgbClr val="808080">
+                              <a:alpha val="50000"/>
+                            </a:srgbClr>
+                          </a:outerShdw>
+                        </a:effectLst>
+                      </wps:spPr>
+                      <wps:txbx>
+                        <w:txbxContent>
+                          <w:p>
+                            <w:pPr>
+                              <w:jc w:val="center"/>
+                              <w:rPr>
+                                <w:rFonts w:ascii="Arial" w:hAnsi="Arial" w:cs="Arial"/>
+                                <w:b/>
+                                <w:bCs/>
+                                <w:color w:val="0000FF"/>
+                                <w:sz w:val="28"/>
+                                <w:szCs w:val="28"/>
+                              </w:rPr>
+                            </w:pPr>
+                            <w:r>
+                              <w:rPr>
+                                <w:rFonts w:ascii="Arial" w:hAnsi="Arial" w:cs="Arial"/>
+                                <w:b/>
+                                <w:bCs/>
+                                <w:color w:val="0000FF"/>
+                                <w:sz w:val="28"/>
+                                <w:szCs w:val="28"/>
+                              </w:rPr>
+                              <w:t>DIBUJO / ESQUEMA / DIAGRAMA</w:t>
+                            </w:r>
+                            <w:r>
+                              <w:rPr>
+                                <w:rFonts w:ascii="Arial" w:hAnsi="Arial" w:cs="Arial"/>
+                                <w:b/>
+                                <w:bCs/>
+                                <w:color w:val="0000FF"/>
+                                <w:sz w:val="28"/>
+                                <w:szCs w:val="28"/>
+                              </w:rPr>
+                              <w:t xml:space="preserve"> DE PROPUESTA</w:t>
+                            </w:r>
+                          </w:p>
+                          <w:p>
+                            <w:pPr>
+                              <w:pStyle w:val="Prrafodelista"/>
+                              <w:ind w:left="360"/>
+                              <w:jc w:val="center"/>
+                              <w:rPr>
+                                <w:rFonts w:ascii="Arial" w:hAnsi="Arial" w:cs="Arial"/>
+                                <w:b/>
+                                <w:bCs/>
+                                <w:color w:val="000000"/>
+                                <w:sz w:val="20"/>
+                                <w:szCs w:val="20"/>
+                              </w:rPr>
+                            </w:pPr>
+                            <w:r>
+                              <w:rPr>
+                                <w:rFonts w:ascii="Arial" w:hAnsi="Arial" w:cs="Arial"/>
+                                <w:b/>
+                                <w:bCs/>
+                                <w:color w:val="000000"/>
+                              </w:rPr>
+                              <w:t>(</w:t>
+                            </w:r>
+                            <w:r>
+                              <w:rPr>
+                                <w:rFonts w:ascii="Arial" w:hAnsi="Arial" w:cs="Arial"/>
+                                <w:b/>
+                                <w:bCs/>
+                                <w:color w:val="000000"/>
+                                <w:sz w:val="20"/>
+                                <w:szCs w:val="20"/>
+                              </w:rPr>
+                              <w:t xml:space="preserve">Adicionar </w:t>
+                            </w:r>
+                            <w:r>
+                              <w:rPr>
+                                <w:rFonts w:ascii="Arial" w:hAnsi="Arial" w:cs="Arial"/>
+                                <w:b/>
+                                <w:bCs/>
+                                <w:color w:val="000000"/>
+                                <w:sz w:val="20"/>
+                                <w:szCs w:val="20"/>
+                              </w:rPr>
+                              <w:t xml:space="preserve">las </w:t>
+                            </w:r>
+                            <w:r>
+                              <w:rPr>
+                                <w:rFonts w:ascii="Arial" w:hAnsi="Arial" w:cs="Arial"/>
+                                <w:b/>
+                                <w:bCs/>
+                                <w:color w:val="000000"/>
+                                <w:sz w:val="20"/>
+                                <w:szCs w:val="20"/>
+                              </w:rPr>
+                              <w:t>páginas que sean necesarias)</w:t>
+                            </w:r>
+                          </w:p>
+                          <w:p>
+                            <w:pPr>
+                              <w:jc w:val="center"/>
+                              <w:rPr>
+                                <w:rFonts w:ascii="Arial" w:hAnsi="Arial" w:cs="Arial"/>
+                                <w:b/>
+                                <w:bCs/>
+                                <w:color w:val="0000FF"/>
+                                <w:sz w:val="28"/>
+                                <w:szCs w:val="28"/>
+                              </w:rPr>
+                            </w:pPr>
+                          </w:p>
+                        </w:txbxContent>
+                      </wps:txbx>
+                      <wps:bodyPr rot="0" vert="horz" wrap="square" lIns="91440" tIns="45720" rIns="91440" bIns="45720" anchor="t" anchorCtr="0" upright="1">
+                        <a:noAutofit/>
+                      </wps:bodyPr>
+                    </wps:wsp>
+                  </a:graphicData>
+                </a:graphic>
+              </wp:inline>
+            </w:drawing>
+          </mc:Choice>
+          <mc:Fallback>
+            <w:pict>
+              <v:roundrect w14:anchorId="720980EE" id="_x0000_s1038" style="width:474.3pt;height:42.25pt;visibility:visible;mso-wrap-style:square;mso-left-percent:-10001;mso-top-percent:-10001;mso-position-horizontal:absolute;mso-position-horizontal-relative:char;mso-position-vertical:absolute;mso-position-vertical-relative:line;mso-left-percent:-10001;mso-top-percent:-10001;v-text-anchor:top" arcsize="10923f" o:gfxdata="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">
+                <v:shadow on="t" opacity=".5" offset="6pt,6pt"/>
+                <v:textbox>
+                  <w:txbxContent>
+                    <w:p>
+                      <w:pPr>
+                        <w:jc w:val="center"/>
+                        <w:rPr>
+                          <w:rFonts w:ascii="Arial" w:hAnsi="Arial" w:cs="Arial"/>
+                          <w:b/>
+                          <w:bCs/>
+                          <w:color w:val="0000FF"/>
+                          <w:sz w:val="28"/>
+                          <w:szCs w:val="28"/>
+                        </w:rPr>
+                      </w:pPr>
+                      <w:r>
+                        <w:rPr>
+                          <w:rFonts w:ascii="Arial" w:hAnsi="Arial" w:cs="Arial"/>
+                          <w:b/>
+                          <w:bCs/>
+                          <w:color w:val="0000FF"/>
+                          <w:sz w:val="28"/>
+                          <w:szCs w:val="28"/>
+                        </w:rPr>
+                        <w:t>DIBUJO / ESQUEMA / DIAGRAMA</w:t>
+                      </w:r>
+                      <w:r>
+                        <w:rPr>
+                          <w:rFonts w:ascii="Arial" w:hAnsi="Arial" w:cs="Arial"/>
+                          <w:b/>
+                          <w:bCs/>
+                          <w:color w:val="0000FF"/>
+                          <w:sz w:val="28"/>
+                          <w:szCs w:val="28"/>
+                        </w:rPr>
+                        <w:t xml:space="preserve"> DE PROPUESTA</w:t>
+                      </w:r>
+                    </w:p>
+                    <w:p>
+                      <w:pPr>
+                        <w:pStyle w:val="Prrafodelista"/>
+                        <w:ind w:left="360"/>
+                        <w:jc w:val="center"/>
+                        <w:rPr>
+                          <w:rFonts w:ascii="Arial" w:hAnsi="Arial" w:cs="Arial"/>
+                          <w:b/>
+                          <w:bCs/>
+                          <w:color w:val="000000"/>
+                          <w:sz w:val="20"/>
+                          <w:szCs w:val="20"/>
+                        </w:rPr>
+                      </w:pPr>
+                      <w:r>
+                        <w:rPr>
+                          <w:rFonts w:ascii="Arial" w:hAnsi="Arial" w:cs="Arial"/>
+                          <w:b/>
+                          <w:bCs/>
+                          <w:color w:val="000000"/>
+                        </w:rPr>
+                        <w:t>(</w:t>
+                      </w:r>
+                      <w:r>
+                        <w:rPr>
+                          <w:rFonts w:ascii="Arial" w:hAnsi="Arial" w:cs="Arial"/>
+                          <w:b/>
+                          <w:bCs/>
+                          <w:color w:val="000000"/>
+                          <w:sz w:val="20"/>
+                          <w:szCs w:val="20"/>
+                        </w:rPr>
+                        <w:t xml:space="preserve">Adicionar </w:t>
+                      </w:r>
+                      <w:r>
+                        <w:rPr>
+                          <w:rFonts w:ascii="Arial" w:hAnsi="Arial" w:cs="Arial"/>
+                          <w:b/>
+                          <w:bCs/>
+                          <w:color w:val="000000"/>
+                          <w:sz w:val="20"/>
+                          <w:szCs w:val="20"/>
+                        </w:rPr>
+                        <w:t xml:space="preserve">las </w:t>
+                      </w:r>
+                      <w:r>
+                        <w:rPr>
+                          <w:rFonts w:ascii="Arial" w:hAnsi="Arial" w:cs="Arial"/>
+                          <w:b/>
+                          <w:bCs/>
+                          <w:color w:val="000000"/>
+                          <w:sz w:val="20"/>
+                          <w:szCs w:val="20"/>
+                        </w:rPr>
+                        <w:t>páginas que sean necesarias)</w:t>
+                      </w:r>
+                    </w:p>
+                    <w:p>
+                      <w:pPr>
+                        <w:jc w:val="center"/>
+                        <w:rPr>
+                          <w:rFonts w:ascii="Arial" w:hAnsi="Arial" w:cs="Arial"/>
+                          <w:b/>
+                          <w:bCs/>
+                          <w:color w:val="0000FF"/>
+                          <w:sz w:val="28"/>
+                          <w:szCs w:val="28"/>
+                        </w:rPr>
+                      </w:pPr>
+                    </w:p>
+                  </w:txbxContent>
+                </v:textbox>
+                <w10:anchorlock/>
+              </v:roundrect>
+            </w:pict>
+          </mc:Fallback>
+        </mc:AlternateContent>
+      </w:r>
+    </w:p>
+    <w:p>
+      <w:pPr>
+        <w:spacing w:after="200" w:line="276" w:lineRule="auto"/>
+        <w:rPr>
+          <w:rFonts w:ascii="Arial" w:hAnsi="Arial" w:cs="Arial"/>
+          <w:b/>
+          <w:bCs/>
+          <w:color w:val="1D4ED8"/>
+          <w:lang w:val="es-PE"/>
+        </w:rPr>
+      </w:pPr>
+      <w:r>
+        <w:rPr>
+          <w:rFonts w:ascii="Arial" w:eastAsiaTheme="majorEastAsia" w:hAnsi="Arial" w:cs="Arial"/>
+          <w:b/>
+          <w:bCs/>
+          <w:color w:val="1D4ED8"/>
+          <w:sz w:val="32"/>
+          <w:szCs w:val="32"/>
+          <w:lang w:val="es-PE"/>
+        </w:rPr>
+        <w:lastRenderedPageBreak/>
+        <w:drawing>
+          <wp:anchor distT="0" distB="0" distL="114300" distR="114300" simplePos="0" relativeHeight="251735040" behindDoc="0" locked="0" layoutInCell="1" allowOverlap="1" wp14:anchorId="4D9141C5" wp14:editId="69A13ED5">
+            <wp:simplePos x="0" y="0"/>
+            <wp:positionH relativeFrom="margin">
+              <wp:align>right</wp:align>
+            </wp:positionH>
+            <wp:positionV relativeFrom="paragraph">
+              <wp:posOffset>700908</wp:posOffset>
+            </wp:positionV>
+            <wp:extent cx="6030595" cy="6280785"/>
+            <wp:effectExtent l="0" t="0" r="8255" b="5715"/>
+            <wp:wrapSquare wrapText="bothSides"/>
+            <wp:docPr id="2020999522" name="Imagen 27"/>
+            <wp:cNvGraphicFramePr>
+              <a:graphicFrameLocks xmlns:a="http://schemas.openxmlformats.org/drawingml/2006/main" noChangeAspect="1"/>
+            </wp:cNvGraphicFramePr>
+            <a:graphic xmlns:a="http://schemas.openxmlformats.org/drawingml/2006/main">
+              <a:graphicData uri="http://schemas.openxmlformats.org/drawingml/2006/picture">
+                <pic:pic xmlns:pic="http://schemas.openxmlformats.org/drawingml/2006/picture">
+                  <pic:nvPicPr>
+                    <pic:cNvPr id="0" name="Picture 44"/>
+                    <pic:cNvPicPr>
+                      <a:picLocks noChangeAspect="1" noChangeArrowheads="1"/>
+                    </pic:cNvPicPr>
+                  </pic:nvPicPr>
+                  <pic:blipFill>
+                    <a:blip r:embed="rId27">
+                      <a:extLst>
+                        <a:ext uri="{28A0092B-C50C-407E-A947-70E740481C1C}">
+                          <a14:useLocalDpi xmlns:a14="http://schemas.microsoft.com/office/drawing/2010/main" val="0"/>
+                        </a:ext>
+                      </a:extLst>
+                    </a:blip>
+                    <a:srcRect/>
+                    <a:stretch>
+                      <a:fillRect/>
+                    </a:stretch>
+                  </pic:blipFill>
+                  <pic:spPr bwMode="auto">
+                    <a:xfrm>
+                      <a:off x="0" y="0"/>
+                      <a:ext cx="6030595" cy="6280785"/>
+                    </a:xfrm>
+                    <a:prstGeom prst="rect">
+                      <a:avLst/>
+                    </a:prstGeom>
+                    <a:noFill/>
+                    <a:ln>
+                      <a:noFill/>
+                    </a:ln>
+                  </pic:spPr>
+                </pic:pic>
+              </a:graphicData>
+            </a:graphic>
+            <wp14:sizeRelH relativeFrom="page">
+              <wp14:pctWidth>0</wp14:pctWidth>
+            </wp14:sizeRelH>
+            <wp14:sizeRelV relativeFrom="page">
+              <wp14:pctHeight>0</wp14:pctHeight>
+            </wp14:sizeRelV>
+          </wp:anchor>
+        </w:drawing>
+      </w:r>
+      <w:r>
+        <w:rPr>
+          <w:rFonts w:ascii="Arial" w:hAnsi="Arial" w:cs="Arial"/>
+          <w:b/>
+          <w:noProof/>
+          <w:lang w:val="es-PE" w:eastAsia="es-PE"/>
+        </w:rPr>
+        <mc:AlternateContent>
+          <mc:Choice Requires="wps">
+            <w:drawing>
+              <wp:inline distT="0" distB="0" distL="0" distR="0" wp14:anchorId="6E43735E" wp14:editId="0A838649">
+                <wp:extent cx="6023610" cy="536575"/>
+                <wp:effectExtent l="0" t="0" r="91440" b="92075"/>
+                <wp:docPr id="1133370697" name="AutoShape 111"/>
+                <wp:cNvGraphicFramePr>
+                  <a:graphicFrameLocks xmlns:a="http://schemas.openxmlformats.org/drawingml/2006/main"/>
+                </wp:cNvGraphicFramePr>
+                <a:graphic xmlns:a="http://schemas.openxmlformats.org/drawingml/2006/main">
+                  <a:graphicData uri="http://schemas.microsoft.com/office/word/2010/wordprocessingShape">
+                    <wps:wsp>
+                      <wps:cNvSpPr>
+                        <a:spLocks noChangeArrowheads="1"/>
+                      </wps:cNvSpPr>
+                      <wps:spPr bwMode="auto">
+                        <a:xfrm>
+                          <a:off x="0" y="0"/>
+                          <a:ext cx="6023610" cy="536575"/>
+                        </a:xfrm>
+                        <a:prstGeom prst="roundRect">
+                          <a:avLst>
+                            <a:gd name="adj" fmla="val 16667"/>
+                          </a:avLst>
+                        </a:prstGeom>
+                        <a:solidFill>
+                          <a:srgbClr val="FFFFFF"/>
+                        </a:solidFill>
+                        <a:ln w="9525">
+                          <a:solidFill>
+                            <a:srgbClr val="000000"/>
+                          </a:solidFill>
+                          <a:round/>
+                          <a:headEnd/>
+                          <a:tailEnd/>
+                        </a:ln>
+                        <a:effectLst>
+                          <a:outerShdw dist="107763" dir="2700000" algn="ctr" rotWithShape="0">
+                            <a:srgbClr val="808080">
+                              <a:alpha val="50000"/>
+                            </a:srgbClr>
+                          </a:outerShdw>
+                        </a:effectLst>
+                      </wps:spPr>
+                      <wps:txbx>
+                        <w:txbxContent>
+                          <w:p>
+                            <w:pPr>
+                              <w:jc w:val="center"/>
+                              <w:rPr>
+                                <w:rFonts w:ascii="Arial" w:hAnsi="Arial" w:cs="Arial"/>
+                                <w:b/>
+                                <w:bCs/>
+                                <w:color w:val="0000FF"/>
+                                <w:sz w:val="28"/>
+                                <w:szCs w:val="28"/>
+                              </w:rPr>
+                            </w:pPr>
+                            <w:r>
+                              <w:rPr>
+                                <w:rFonts w:ascii="Arial" w:hAnsi="Arial" w:cs="Arial"/>
+                                <w:b/>
+                                <w:bCs/>
+                                <w:color w:val="0000FF"/>
+                                <w:sz w:val="28"/>
+                                <w:szCs w:val="28"/>
+                              </w:rPr>
+                              <w:t>DIBUJO / ESQUEMA / DIAGRAMA</w:t>
+                            </w:r>
+                            <w:r>
+                              <w:rPr>
+                                <w:rFonts w:ascii="Arial" w:hAnsi="Arial" w:cs="Arial"/>
+                                <w:b/>
+                                <w:bCs/>
+                                <w:color w:val="0000FF"/>
+                                <w:sz w:val="28"/>
+                                <w:szCs w:val="28"/>
+                              </w:rPr>
+                              <w:t xml:space="preserve"> DE PROPUESTA</w:t>
+                            </w:r>
+                          </w:p>
+                          <w:p>
+                            <w:pPr>
+                              <w:pStyle w:val="Prrafodelista"/>
+                              <w:ind w:left="360"/>
+                              <w:jc w:val="center"/>
+                              <w:rPr>
+                                <w:rFonts w:ascii="Arial" w:hAnsi="Arial" w:cs="Arial"/>
+                                <w:b/>
+                                <w:bCs/>
+                                <w:color w:val="000000"/>
+                                <w:sz w:val="20"/>
+                                <w:szCs w:val="20"/>
+                              </w:rPr>
+                            </w:pPr>
+                            <w:r>
+                              <w:rPr>
+                                <w:rFonts w:ascii="Arial" w:hAnsi="Arial" w:cs="Arial"/>
+                                <w:b/>
+                                <w:bCs/>
+                                <w:color w:val="000000"/>
+                              </w:rPr>
+                              <w:t>(</w:t>
+                            </w:r>
+                            <w:r>
+                              <w:rPr>
+                                <w:rFonts w:ascii="Arial" w:hAnsi="Arial" w:cs="Arial"/>
+                                <w:b/>
+                                <w:bCs/>
+                                <w:color w:val="000000"/>
+                                <w:sz w:val="20"/>
+                                <w:szCs w:val="20"/>
+                              </w:rPr>
+                              <w:t xml:space="preserve">Adicionar </w:t>
+                            </w:r>
+                            <w:r>
+                              <w:rPr>
+                                <w:rFonts w:ascii="Arial" w:hAnsi="Arial" w:cs="Arial"/>
+                                <w:b/>
+                                <w:bCs/>
+                                <w:color w:val="000000"/>
+                                <w:sz w:val="20"/>
+                                <w:szCs w:val="20"/>
+                              </w:rPr>
+                              <w:t xml:space="preserve">las </w:t>
+                            </w:r>
+                            <w:r>
+                              <w:rPr>
+                                <w:rFonts w:ascii="Arial" w:hAnsi="Arial" w:cs="Arial"/>
+                                <w:b/>
+                                <w:bCs/>
+                                <w:color w:val="000000"/>
+                                <w:sz w:val="20"/>
+                                <w:szCs w:val="20"/>
+                              </w:rPr>
+                              <w:t>páginas que sean necesarias)</w:t>
+                            </w:r>
+                          </w:p>
+                          <w:p>
+                            <w:pPr>
+                              <w:jc w:val="center"/>
+                              <w:rPr>
+                                <w:rFonts w:ascii="Arial" w:hAnsi="Arial" w:cs="Arial"/>
+                                <w:b/>
+                                <w:bCs/>
+                                <w:color w:val="0000FF"/>
+                                <w:sz w:val="28"/>
+                                <w:szCs w:val="28"/>
+                              </w:rPr>
+                            </w:pPr>
+                          </w:p>
+                        </w:txbxContent>
+                      </wps:txbx>
+                      <wps:bodyPr rot="0" vert="horz" wrap="square" lIns="91440" tIns="45720" rIns="91440" bIns="45720" anchor="t" anchorCtr="0" upright="1">
+                        <a:noAutofit/>
+                      </wps:bodyPr>
+                    </wps:wsp>
+                  </a:graphicData>
+                </a:graphic>
+              </wp:inline>
+            </w:drawing>
+          </mc:Choice>
+          <mc:Fallback>
+            <w:pict>
+              <v:roundrect w14:anchorId="6E43735E" id="_x0000_s1039" style="width:474.3pt;height:42.25pt;visibility:visible;mso-wrap-style:square;mso-left-percent:-10001;mso-top-percent:-10001;mso-position-horizontal:absolute;mso-position-horizontal-relative:char;mso-position-vertical:absolute;mso-position-vertical-relative:line;mso-left-percent:-10001;mso-top-percent:-10001;v-text-anchor:top" arcsize="10923f" o:gfxdata="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">
+                <v:shadow on="t" opacity=".5" offset="6pt,6pt"/>
+                <v:textbox>
+                  <w:txbxContent>
+                    <w:p>
+                      <w:pPr>
+                        <w:jc w:val="center"/>
+                        <w:rPr>
+                          <w:rFonts w:ascii="Arial" w:hAnsi="Arial" w:cs="Arial"/>
+                          <w:b/>
+                          <w:bCs/>
+                          <w:color w:val="0000FF"/>
+                          <w:sz w:val="28"/>
+                          <w:szCs w:val="28"/>
+                        </w:rPr>
+                      </w:pPr>
+                      <w:r>
+                        <w:rPr>
+                          <w:rFonts w:ascii="Arial" w:hAnsi="Arial" w:cs="Arial"/>
+                          <w:b/>
+                          <w:bCs/>
+                          <w:color w:val="0000FF"/>
+                          <w:sz w:val="28"/>
+                          <w:szCs w:val="28"/>
+                        </w:rPr>
+                        <w:t>DIBUJO / ESQUEMA / DIAGRAMA</w:t>
+                      </w:r>
+                      <w:r>
+                        <w:rPr>
+                          <w:rFonts w:ascii="Arial" w:hAnsi="Arial" w:cs="Arial"/>
+                          <w:b/>
+                          <w:bCs/>
+                          <w:color w:val="0000FF"/>
+                          <w:sz w:val="28"/>
+                          <w:szCs w:val="28"/>
+                        </w:rPr>
+                        <w:t xml:space="preserve"> DE PROPUESTA</w:t>
+                      </w:r>
+                    </w:p>
+                    <w:p>
+                      <w:pPr>
+                        <w:pStyle w:val="Prrafodelista"/>
+                        <w:ind w:left="360"/>
+                        <w:jc w:val="center"/>
+                        <w:rPr>
+                          <w:rFonts w:ascii="Arial" w:hAnsi="Arial" w:cs="Arial"/>
+                          <w:b/>
+                          <w:bCs/>
+                          <w:color w:val="000000"/>
+                          <w:sz w:val="20"/>
+                          <w:szCs w:val="20"/>
+                        </w:rPr>
+                      </w:pPr>
+                      <w:r>
+                        <w:rPr>
+                          <w:rFonts w:ascii="Arial" w:hAnsi="Arial" w:cs="Arial"/>
+                          <w:b/>
+                          <w:bCs/>
+                          <w:color w:val="000000"/>
+                        </w:rPr>
+                        <w:t>(</w:t>
+                      </w:r>
+                      <w:r>
+                        <w:rPr>
+                          <w:rFonts w:ascii="Arial" w:hAnsi="Arial" w:cs="Arial"/>
+                          <w:b/>
+                          <w:bCs/>
+                          <w:color w:val="000000"/>
+                          <w:sz w:val="20"/>
+                          <w:szCs w:val="20"/>
+                        </w:rPr>
+                        <w:t xml:space="preserve">Adicionar </w:t>
+                      </w:r>
+                      <w:r>
+                        <w:rPr>
+                          <w:rFonts w:ascii="Arial" w:hAnsi="Arial" w:cs="Arial"/>
+                          <w:b/>
+                          <w:bCs/>
+                          <w:color w:val="000000"/>
+                          <w:sz w:val="20"/>
+                          <w:szCs w:val="20"/>
+                        </w:rPr>
+                        <w:t xml:space="preserve">las </w:t>
+                      </w:r>
+                      <w:r>
+                        <w:rPr>
+                          <w:rFonts w:ascii="Arial" w:hAnsi="Arial" w:cs="Arial"/>
+                          <w:b/>
+                          <w:bCs/>
+                          <w:color w:val="000000"/>
+                          <w:sz w:val="20"/>
+                          <w:szCs w:val="20"/>
+                        </w:rPr>
+                        <w:t>páginas que sean necesarias)</w:t>
+                      </w:r>
+                    </w:p>
+                    <w:p>
+                      <w:pPr>
+                        <w:jc w:val="center"/>
+                        <w:rPr>
+                          <w:rFonts w:ascii="Arial" w:hAnsi="Arial" w:cs="Arial"/>
+                          <w:b/>
+                          <w:bCs/>
+                          <w:color w:val="0000FF"/>
+                          <w:sz w:val="28"/>
+                          <w:szCs w:val="28"/>
+                        </w:rPr>
+                      </w:pPr>
+                    </w:p>
+                  </w:txbxContent>
+                </v:textbox>
+                <w10:anchorlock/>
+              </v:roundrect>
+            </w:pict>
+          </mc:Fallback>
+        </mc:AlternateContent>
+      </w:r>
+    </w:p>
+    <w:p>
+      <w:pPr>
+        <w:spacing w:after="200" w:line="276" w:lineRule="auto"/>
+        <w:rPr>
+          <w:rFonts w:ascii="Arial" w:eastAsiaTheme="majorEastAsia" w:hAnsi="Arial" w:cs="Arial"/>
+          <w:b/>
+          <w:bCs/>
+          <w:color w:val="1D4ED8"/>
+          <w:sz w:val="32"/>
+          <w:szCs w:val="32"/>
+          <w:lang w:val="es-PE"/>
+        </w:rPr>
+      </w:pPr>
+      <w:r>
+        <w:rPr>
+          <w:rFonts w:ascii="Arial" w:hAnsi="Arial" w:cs="Arial"/>
+          <w:b/>
+          <w:bCs/>
+          <w:color w:val="1D4ED8"/>
+          <w:lang w:val="es-PE"/>
+        </w:rPr>
+        <w:br w:type="page"/>
+      </w:r>
+    </w:p>
+    <w:p>
+      <w:pPr>
+        <w:pStyle w:val="Ttulo1"/>
+        <w:spacing w:before="300" w:after="150"/>
+        <w:rPr>
+          <w:rFonts w:ascii="Arial" w:hAnsi="Arial" w:cs="Arial"/>
+          <w:b/>
+          <w:bCs/>
+          <w:color w:val="1D4ED8"/>
+          <w:lang w:val="es-PE"/>
+        </w:rPr>
+      </w:pPr>
+      <w:r>
+        <w:rPr>
+          <w:rFonts w:ascii="Arial" w:hAnsi="Arial" w:cs="Arial"/>
+          <w:b/>
+          <w:noProof/>
+          <w:lang w:val="es-PE" w:eastAsia="es-PE"/>
+        </w:rPr>
+        <w:lastRenderedPageBreak/>
+        <mc:AlternateContent>
+          <mc:Choice Requires="wps">
+            <w:drawing>
+              <wp:inline distT="0" distB="0" distL="0" distR="0" wp14:anchorId="0FD5D1A6" wp14:editId="18D87CD0">
+                <wp:extent cx="6023610" cy="536575"/>
+                <wp:effectExtent l="0" t="0" r="91440" b="92075"/>
+                <wp:docPr id="1393908933" name="AutoShape 111"/>
+                <wp:cNvGraphicFramePr>
+                  <a:graphicFrameLocks xmlns:a="http://schemas.openxmlformats.org/drawingml/2006/main"/>
+                </wp:cNvGraphicFramePr>
+                <a:graphic xmlns:a="http://schemas.openxmlformats.org/drawingml/2006/main">
+                  <a:graphicData uri="http://schemas.microsoft.com/office/word/2010/wordprocessingShape">
+                    <wps:wsp>
+                      <wps:cNvSpPr>
+                        <a:spLocks noChangeArrowheads="1"/>
+                      </wps:cNvSpPr>
+                      <wps:spPr bwMode="auto">
+                        <a:xfrm>
+                          <a:off x="0" y="0"/>
+                          <a:ext cx="6023610" cy="536575"/>
+                        </a:xfrm>
+                        <a:prstGeom prst="roundRect">
+                          <a:avLst>
+                            <a:gd name="adj" fmla="val 16667"/>
+                          </a:avLst>
+                        </a:prstGeom>
+                        <a:solidFill>
+                          <a:srgbClr val="FFFFFF"/>
+                        </a:solidFill>
+                        <a:ln w="9525">
+                          <a:solidFill>
+                            <a:srgbClr val="000000"/>
+                          </a:solidFill>
+                          <a:round/>
+                          <a:headEnd/>
+                          <a:tailEnd/>
+                        </a:ln>
+                        <a:effectLst>
+                          <a:outerShdw dist="107763" dir="2700000" algn="ctr" rotWithShape="0">
+                            <a:srgbClr val="808080">
+                              <a:alpha val="50000"/>
+                            </a:srgbClr>
+                          </a:outerShdw>
+                        </a:effectLst>
+                      </wps:spPr>
+                      <wps:txbx>
+                        <w:txbxContent>
+                          <w:p>
+                            <w:pPr>
+                              <w:jc w:val="center"/>
+                              <w:rPr>
+                                <w:rFonts w:ascii="Arial" w:hAnsi="Arial" w:cs="Arial"/>
+                                <w:b/>
+                                <w:bCs/>
+                                <w:color w:val="0000FF"/>
+                                <w:sz w:val="28"/>
+                                <w:szCs w:val="28"/>
+                              </w:rPr>
+                            </w:pPr>
+                            <w:r>
+                              <w:rPr>
+                                <w:rFonts w:ascii="Arial" w:hAnsi="Arial" w:cs="Arial"/>
+                                <w:b/>
+                                <w:bCs/>
+                                <w:color w:val="0000FF"/>
+                                <w:sz w:val="28"/>
+                                <w:szCs w:val="28"/>
+                              </w:rPr>
+                              <w:t>DIBUJO / ESQUEMA / DIAGRAMA</w:t>
+                            </w:r>
+                            <w:r>
+                              <w:rPr>
+                                <w:rFonts w:ascii="Arial" w:hAnsi="Arial" w:cs="Arial"/>
+                                <w:b/>
+                                <w:bCs/>
+                                <w:color w:val="0000FF"/>
+                                <w:sz w:val="28"/>
+                                <w:szCs w:val="28"/>
+                              </w:rPr>
+                              <w:t xml:space="preserve"> DE PROPUESTA</w:t>
+                            </w:r>
+                          </w:p>
+                          <w:p>
+                            <w:pPr>
+                              <w:pStyle w:val="Prrafodelista"/>
+                              <w:ind w:left="360"/>
+                              <w:jc w:val="center"/>
+                              <w:rPr>
+                                <w:rFonts w:ascii="Arial" w:hAnsi="Arial" w:cs="Arial"/>
+                                <w:b/>
+                                <w:bCs/>
+                                <w:color w:val="000000"/>
+                                <w:sz w:val="20"/>
+                                <w:szCs w:val="20"/>
+                              </w:rPr>
+                            </w:pPr>
+                            <w:r>
+                              <w:rPr>
+                                <w:rFonts w:ascii="Arial" w:hAnsi="Arial" w:cs="Arial"/>
+                                <w:b/>
+                                <w:bCs/>
+                                <w:color w:val="000000"/>
+                              </w:rPr>
+                              <w:t>(</w:t>
+                            </w:r>
+                            <w:r>
+                              <w:rPr>
+                                <w:rFonts w:ascii="Arial" w:hAnsi="Arial" w:cs="Arial"/>
+                                <w:b/>
+                                <w:bCs/>
+                                <w:color w:val="000000"/>
+                                <w:sz w:val="20"/>
+                                <w:szCs w:val="20"/>
+                              </w:rPr>
+                              <w:t xml:space="preserve">Adicionar </w:t>
+                            </w:r>
+                            <w:r>
+                              <w:rPr>
+                                <w:rFonts w:ascii="Arial" w:hAnsi="Arial" w:cs="Arial"/>
+                                <w:b/>
+                                <w:bCs/>
+                                <w:color w:val="000000"/>
+                                <w:sz w:val="20"/>
+                                <w:szCs w:val="20"/>
+                              </w:rPr>
+                              <w:t xml:space="preserve">las </w:t>
+                            </w:r>
+                            <w:r>
+                              <w:rPr>
+                                <w:rFonts w:ascii="Arial" w:hAnsi="Arial" w:cs="Arial"/>
+                                <w:b/>
+                                <w:bCs/>
+                                <w:color w:val="000000"/>
+                                <w:sz w:val="20"/>
+                                <w:szCs w:val="20"/>
+                              </w:rPr>
+                              <w:t>páginas que sean necesarias)</w:t>
+                            </w:r>
+                          </w:p>
+                          <w:p>
+                            <w:pPr>
+                              <w:jc w:val="center"/>
+                              <w:rPr>
+                                <w:rFonts w:ascii="Arial" w:hAnsi="Arial" w:cs="Arial"/>
+                                <w:b/>
+                                <w:bCs/>
+                                <w:color w:val="0000FF"/>
+                                <w:sz w:val="28"/>
+                                <w:szCs w:val="28"/>
+                              </w:rPr>
+                            </w:pPr>
+                          </w:p>
+                        </w:txbxContent>
+                      </wps:txbx>
+                      <wps:bodyPr rot="0" vert="horz" wrap="square" lIns="91440" tIns="45720" rIns="91440" bIns="45720" anchor="t" anchorCtr="0" upright="1">
+                        <a:noAutofit/>
+                      </wps:bodyPr>
+                    </wps:wsp>
+                  </a:graphicData>
+                </a:graphic>
+              </wp:inline>
+            </w:drawing>
+          </mc:Choice>
+          <mc:Fallback>
+            <w:pict>
+              <v:roundrect w14:anchorId="0FD5D1A6" id="_x0000_s1040" style="width:474.3pt;height:42.25pt;visibility:visible;mso-wrap-style:square;mso-left-percent:-10001;mso-top-percent:-10001;mso-position-horizontal:absolute;mso-position-horizontal-relative:char;mso-position-vertical:absolute;mso-position-vertical-relative:line;mso-left-percent:-10001;mso-top-percent:-10001;v-text-anchor:top" arcsize="10923f" o:gfxdata="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">
+                <v:shadow on="t" opacity=".5" offset="6pt,6pt"/>
+                <v:textbox>
+                  <w:txbxContent>
+                    <w:p>
+                      <w:pPr>
+                        <w:jc w:val="center"/>
+                        <w:rPr>
+                          <w:rFonts w:ascii="Arial" w:hAnsi="Arial" w:cs="Arial"/>
+                          <w:b/>
+                          <w:bCs/>
+                          <w:color w:val="0000FF"/>
+                          <w:sz w:val="28"/>
+                          <w:szCs w:val="28"/>
+                        </w:rPr>
+                      </w:pPr>
+                      <w:r>
+                        <w:rPr>
+                          <w:rFonts w:ascii="Arial" w:hAnsi="Arial" w:cs="Arial"/>
+                          <w:b/>
+                          <w:bCs/>
+                          <w:color w:val="0000FF"/>
+                          <w:sz w:val="28"/>
+                          <w:szCs w:val="28"/>
+                        </w:rPr>
+                        <w:t>DIBUJO / ESQUEMA / DIAGRAMA</w:t>
+                      </w:r>
+                      <w:r>
+                        <w:rPr>
+                          <w:rFonts w:ascii="Arial" w:hAnsi="Arial" w:cs="Arial"/>
+                          <w:b/>
+                          <w:bCs/>
+                          <w:color w:val="0000FF"/>
+                          <w:sz w:val="28"/>
+                          <w:szCs w:val="28"/>
+                        </w:rPr>
+                        <w:t xml:space="preserve"> DE PROPUESTA</w:t>
+                      </w:r>
+                    </w:p>
+                    <w:p>
+                      <w:pPr>
+                        <w:pStyle w:val="Prrafodelista"/>
+                        <w:ind w:left="360"/>
+                        <w:jc w:val="center"/>
+                        <w:rPr>
+                          <w:rFonts w:ascii="Arial" w:hAnsi="Arial" w:cs="Arial"/>
+                          <w:b/>
+                          <w:bCs/>
+                          <w:color w:val="000000"/>
+                          <w:sz w:val="20"/>
+                          <w:szCs w:val="20"/>
+                        </w:rPr>
+                      </w:pPr>
+                      <w:r>
+                        <w:rPr>
+                          <w:rFonts w:ascii="Arial" w:hAnsi="Arial" w:cs="Arial"/>
+                          <w:b/>
+                          <w:bCs/>
+                          <w:color w:val="000000"/>
+                        </w:rPr>
+                        <w:t>(</w:t>
+                      </w:r>
+                      <w:r>
+                        <w:rPr>
+                          <w:rFonts w:ascii="Arial" w:hAnsi="Arial" w:cs="Arial"/>
+                          <w:b/>
+                          <w:bCs/>
+                          <w:color w:val="000000"/>
+                          <w:sz w:val="20"/>
+                          <w:szCs w:val="20"/>
+                        </w:rPr>
+                        <w:t xml:space="preserve">Adicionar </w:t>
+                      </w:r>
+                      <w:r>
+                        <w:rPr>
+                          <w:rFonts w:ascii="Arial" w:hAnsi="Arial" w:cs="Arial"/>
+                          <w:b/>
+                          <w:bCs/>
+                          <w:color w:val="000000"/>
+                          <w:sz w:val="20"/>
+                          <w:szCs w:val="20"/>
+                        </w:rPr>
+                        <w:t xml:space="preserve">las </w:t>
+                      </w:r>
+                      <w:r>
+                        <w:rPr>
+                          <w:rFonts w:ascii="Arial" w:hAnsi="Arial" w:cs="Arial"/>
+                          <w:b/>
+                          <w:bCs/>
+                          <w:color w:val="000000"/>
+                          <w:sz w:val="20"/>
+                          <w:szCs w:val="20"/>
+                        </w:rPr>
+                        <w:t>páginas que sean necesarias)</w:t>
+                      </w:r>
+                    </w:p>
+                    <w:p>
+                      <w:pPr>
+                        <w:jc w:val="center"/>
+                        <w:rPr>
+                          <w:rFonts w:ascii="Arial" w:hAnsi="Arial" w:cs="Arial"/>
+                          <w:b/>
+                          <w:bCs/>
+                          <w:color w:val="0000FF"/>
+                          <w:sz w:val="28"/>
+                          <w:szCs w:val="28"/>
+                        </w:rPr>
+                      </w:pPr>
+                    </w:p>
+                  </w:txbxContent>
+                </v:textbox>
+                <w10:anchorlock/>
+              </v:roundrect>
+            </w:pict>
+          </mc:Fallback>
+        </mc:AlternateContent>
+      </w:r>
+    </w:p>
+    <w:p>
+      <w:pPr>
+        <w:pStyle w:val="Ttulo1"/>
+        <w:spacing w:before="300" w:after="150"/>
+        <w:rPr>
+          <w:rFonts w:ascii="Arial" w:hAnsi="Arial" w:cs="Arial"/>
+          <w:b/>
+          <w:bCs/>
+          <w:color w:val="1D4ED8"/>
+          <w:lang w:val="es-PE"/>
+        </w:rPr>
+      </w:pPr>
+      <w:r>
+        <w:rPr>
+          <w:rFonts w:ascii="Arial" w:hAnsi="Arial" w:cs="Arial"/>
+          <w:b/>
+          <w:bCs/>
+          <w:color w:val="1D4ED8"/>
+          <w:lang w:val="es-PE"/>
+        </w:rPr>
+        <w:drawing>
+          <wp:anchor distT="0" distB="0" distL="114300" distR="114300" simplePos="0" relativeHeight="251736064" behindDoc="0" locked="0" layoutInCell="1" allowOverlap="1" wp14:anchorId="75A1B630" wp14:editId="033094EA">
+            <wp:simplePos x="0" y="0"/>
+            <wp:positionH relativeFrom="margin">
+              <wp:align>center</wp:align>
+            </wp:positionH>
+            <wp:positionV relativeFrom="paragraph">
+              <wp:posOffset>109855</wp:posOffset>
+            </wp:positionV>
+            <wp:extent cx="5328285" cy="7242175"/>
+            <wp:effectExtent l="0" t="0" r="5715" b="0"/>
+            <wp:wrapSquare wrapText="bothSides"/>
+            <wp:docPr id="1004023933" name="Imagen 29"/>
+            <wp:cNvGraphicFramePr>
+              <a:graphicFrameLocks xmlns:a="http://schemas.openxmlformats.org/drawingml/2006/main" noChangeAspect="1"/>
+            </wp:cNvGraphicFramePr>
+            <a:graphic xmlns:a="http://schemas.openxmlformats.org/drawingml/2006/main">
+              <a:graphicData uri="http://schemas.openxmlformats.org/drawingml/2006/picture">
+                <pic:pic xmlns:pic="http://schemas.openxmlformats.org/drawingml/2006/picture">
+                  <pic:nvPicPr>
+                    <pic:cNvPr id="0" name="Picture 51"/>
+                    <pic:cNvPicPr>
+                      <a:picLocks noChangeAspect="1" noChangeArrowheads="1"/>
+                    </pic:cNvPicPr>
+                  </pic:nvPicPr>
+                  <pic:blipFill>
+                    <a:blip r:embed="rId28">
+                      <a:extLst>
+                        <a:ext uri="{28A0092B-C50C-407E-A947-70E740481C1C}">
+                          <a14:useLocalDpi xmlns:a14="http://schemas.microsoft.com/office/drawing/2010/main" val="0"/>
+                        </a:ext>
+                      </a:extLst>
+                    </a:blip>
+                    <a:srcRect/>
+                    <a:stretch>
+                      <a:fillRect/>
+                    </a:stretch>
+                  </pic:blipFill>
+                  <pic:spPr bwMode="auto">
+                    <a:xfrm>
+                      <a:off x="0" y="0"/>
+                      <a:ext cx="5328285" cy="7242175"/>
+                    </a:xfrm>
+                    <a:prstGeom prst="rect">
+                      <a:avLst/>
+                    </a:prstGeom>
+                    <a:noFill/>
+                    <a:ln>
+                      <a:noFill/>
+                    </a:ln>
+                  </pic:spPr>
+                </pic:pic>
+              </a:graphicData>
+            </a:graphic>
+            <wp14:sizeRelH relativeFrom="page">
+              <wp14:pctWidth>0</wp14:pctWidth>
+            </wp14:sizeRelH>
+            <wp14:sizeRelV relativeFrom="page">
+              <wp14:pctHeight>0</wp14:pctHeight>
+            </wp14:sizeRelV>
+          </wp:anchor>
+        </w:drawing>
+      </w:r>
+    </w:p>
+    <w:p>
+      <w:pPr>
+        <w:pStyle w:val="Ttulo1"/>
+        <w:spacing w:before="300" w:after="150"/>
+        <w:rPr>
+          <w:rFonts w:ascii="Arial" w:hAnsi="Arial" w:cs="Arial"/>
+          <w:b/>
+          <w:bCs/>
+          <w:color w:val="1D4ED8"/>
+          <w:lang w:val="es-PE"/>
+        </w:rPr>
+      </w:pPr>
+    </w:p>
+    <w:p>
+      <w:pPr>
+        <w:spacing w:after="200" w:line="276" w:lineRule="auto"/>
+        <w:rPr>
+          <w:rFonts w:ascii="Arial" w:eastAsiaTheme="majorEastAsia" w:hAnsi="Arial" w:cs="Arial"/>
+          <w:b/>
+          <w:bCs/>
+          <w:color w:val="1D4ED8"/>
+          <w:sz w:val="32"/>
+          <w:szCs w:val="32"/>
+          <w:lang w:val="es-PE"/>
+        </w:rPr>
+      </w:pPr>
+      <w:r>
+        <w:rPr>
+          <w:rFonts w:ascii="Arial" w:hAnsi="Arial" w:cs="Arial"/>
+          <w:b/>
+          <w:bCs/>
+          <w:color w:val="1D4ED8"/>
+          <w:lang w:val="es-PE"/>
+        </w:rPr>
+        <w:br w:type="page"/>
+      </w:r>
+    </w:p>
+    <w:p>
+      <w:pPr>
+        <w:pStyle w:val="Ttulo1"/>
+        <w:spacing w:before="300" w:after="150"/>
+        <w:rPr>
+          <w:rFonts w:ascii="Arial" w:hAnsi="Arial" w:cs="Arial"/>
+          <w:b/>
+          <w:bCs/>
+          <w:color w:val="1D4ED8"/>
+          <w:lang w:val="es-PE"/>
+        </w:rPr>
+      </w:pPr>
+      <w:r>
+        <w:rPr>
+          <w:rFonts w:ascii="Arial" w:hAnsi="Arial" w:cs="Arial"/>
+          <w:b/>
+          <w:bCs/>
+          <w:color w:val="1D4ED8"/>
+          <w:lang w:val="es-PE"/>
+        </w:rPr>
+        <w:lastRenderedPageBreak/>
+        <w:drawing>
+          <wp:anchor distT="0" distB="0" distL="114300" distR="114300" simplePos="0" relativeHeight="251737088" behindDoc="0" locked="0" layoutInCell="1" allowOverlap="1" wp14:anchorId="5F81CD43" wp14:editId="0A8614F1">
+            <wp:simplePos x="0" y="0"/>
+            <wp:positionH relativeFrom="margin">
+              <wp:align>right</wp:align>
+            </wp:positionH>
+            <wp:positionV relativeFrom="paragraph">
+              <wp:posOffset>646386</wp:posOffset>
+            </wp:positionV>
+            <wp:extent cx="6030595" cy="4950460"/>
+            <wp:effectExtent l="0" t="0" r="8255" b="2540"/>
+            <wp:wrapSquare wrapText="bothSides"/>
+            <wp:docPr id="101532557" name="Imagen 31"/>
+            <wp:cNvGraphicFramePr>
+              <a:graphicFrameLocks xmlns:a="http://schemas.openxmlformats.org/drawingml/2006/main" noChangeAspect="1"/>
+            </wp:cNvGraphicFramePr>
+            <a:graphic xmlns:a="http://schemas.openxmlformats.org/drawingml/2006/main">
+              <a:graphicData uri="http://schemas.openxmlformats.org/drawingml/2006/picture">
+                <pic:pic xmlns:pic="http://schemas.openxmlformats.org/drawingml/2006/picture">
+                  <pic:nvPicPr>
+                    <pic:cNvPr id="0" name="Picture 58"/>
+                    <pic:cNvPicPr>
+                      <a:picLocks noChangeAspect="1" noChangeArrowheads="1"/>
+                    </pic:cNvPicPr>
+                  </pic:nvPicPr>
+                  <pic:blipFill>
+                    <a:blip r:embed="rId29">
+                      <a:extLst>
+                        <a:ext uri="{28A0092B-C50C-407E-A947-70E740481C1C}">
+                          <a14:useLocalDpi xmlns:a14="http://schemas.microsoft.com/office/drawing/2010/main" val="0"/>
+                        </a:ext>
+                      </a:extLst>
+                    </a:blip>
+                    <a:srcRect/>
+                    <a:stretch>
+                      <a:fillRect/>
+                    </a:stretch>
+                  </pic:blipFill>
+                  <pic:spPr bwMode="auto">
+                    <a:xfrm>
+                      <a:off x="0" y="0"/>
+                      <a:ext cx="6030595" cy="4950460"/>
+                    </a:xfrm>
+                    <a:prstGeom prst="rect">
+                      <a:avLst/>
+                    </a:prstGeom>
+                    <a:noFill/>
+                    <a:ln>
+                      <a:noFill/>
+                    </a:ln>
+                  </pic:spPr>
+                </pic:pic>
+              </a:graphicData>
+            </a:graphic>
+            <wp14:sizeRelH relativeFrom="page">
+              <wp14:pctWidth>0</wp14:pctWidth>
+            </wp14:sizeRelH>
+            <wp14:sizeRelV relativeFrom="page">
+              <wp14:pctHeight>0</wp14:pctHeight>
+            </wp14:sizeRelV>
+          </wp:anchor>
+        </w:drawing>
+      </w:r>
+      <w:r>
+        <w:rPr>
+          <w:rFonts w:ascii="Arial" w:hAnsi="Arial" w:cs="Arial"/>
+          <w:b/>
+          <w:noProof/>
+          <w:lang w:val="es-PE" w:eastAsia="es-PE"/>
+        </w:rPr>
+        <mc:AlternateContent>
+          <mc:Choice Requires="wps">
+            <w:drawing>
+              <wp:inline distT="0" distB="0" distL="0" distR="0" wp14:anchorId="6E232B94" wp14:editId="564BB3B7">
+                <wp:extent cx="6023610" cy="536575"/>
+                <wp:effectExtent l="0" t="0" r="91440" b="92075"/>
+                <wp:docPr id="1250069976" name="AutoShape 111"/>
+                <wp:cNvGraphicFramePr>
+                  <a:graphicFrameLocks xmlns:a="http://schemas.openxmlformats.org/drawingml/2006/main"/>
+                </wp:cNvGraphicFramePr>
+                <a:graphic xmlns:a="http://schemas.openxmlformats.org/drawingml/2006/main">
+                  <a:graphicData uri="http://schemas.microsoft.com/office/word/2010/wordprocessingShape">
+                    <wps:wsp>
+                      <wps:cNvSpPr>
+                        <a:spLocks noChangeArrowheads="1"/>
+                      </wps:cNvSpPr>
+                      <wps:spPr bwMode="auto">
+                        <a:xfrm>
+                          <a:off x="0" y="0"/>
+                          <a:ext cx="6023610" cy="536575"/>
+                        </a:xfrm>
+                        <a:prstGeom prst="roundRect">
+                          <a:avLst>
+                            <a:gd name="adj" fmla="val 16667"/>
+                          </a:avLst>
+                        </a:prstGeom>
+                        <a:solidFill>
+                          <a:srgbClr val="FFFFFF"/>
+                        </a:solidFill>
+                        <a:ln w="9525">
+                          <a:solidFill>
+                            <a:srgbClr val="000000"/>
+                          </a:solidFill>
+                          <a:round/>
+                          <a:headEnd/>
+                          <a:tailEnd/>
+                        </a:ln>
+                        <a:effectLst>
+                          <a:outerShdw dist="107763" dir="2700000" algn="ctr" rotWithShape="0">
+                            <a:srgbClr val="808080">
+                              <a:alpha val="50000"/>
+                            </a:srgbClr>
+                          </a:outerShdw>
+                        </a:effectLst>
+                      </wps:spPr>
+                      <wps:txbx>
+                        <w:txbxContent>
+                          <w:p>
+                            <w:pPr>
+                              <w:jc w:val="center"/>
+                              <w:rPr>
+                                <w:rFonts w:ascii="Arial" w:hAnsi="Arial" w:cs="Arial"/>
+                                <w:b/>
+                                <w:bCs/>
+                                <w:color w:val="0000FF"/>
+                                <w:sz w:val="28"/>
+                                <w:szCs w:val="28"/>
+                              </w:rPr>
+                            </w:pPr>
+                            <w:r>
+                              <w:rPr>
+                                <w:rFonts w:ascii="Arial" w:hAnsi="Arial" w:cs="Arial"/>
+                                <w:b/>
+                                <w:bCs/>
+                                <w:color w:val="0000FF"/>
+                                <w:sz w:val="28"/>
+                                <w:szCs w:val="28"/>
+                              </w:rPr>
+                              <w:t>DIBUJO / ESQUEMA / DIAGRAMA</w:t>
+                            </w:r>
+                            <w:r>
+                              <w:rPr>
+                                <w:rFonts w:ascii="Arial" w:hAnsi="Arial" w:cs="Arial"/>
+                                <w:b/>
+                                <w:bCs/>
+                                <w:color w:val="0000FF"/>
+                                <w:sz w:val="28"/>
+                                <w:szCs w:val="28"/>
+                              </w:rPr>
+                              <w:t xml:space="preserve"> DE PROPUESTA</w:t>
+                            </w:r>
+                          </w:p>
+                          <w:p>
+                            <w:pPr>
+                              <w:pStyle w:val="Prrafodelista"/>
+                              <w:ind w:left="360"/>
+                              <w:jc w:val="center"/>
+                              <w:rPr>
+                                <w:rFonts w:ascii="Arial" w:hAnsi="Arial" w:cs="Arial"/>
+                                <w:b/>
+                                <w:bCs/>
+                                <w:color w:val="000000"/>
+                                <w:sz w:val="20"/>
+                                <w:szCs w:val="20"/>
+                              </w:rPr>
+                            </w:pPr>
+                            <w:r>
+                              <w:rPr>
+                                <w:rFonts w:ascii="Arial" w:hAnsi="Arial" w:cs="Arial"/>
+                                <w:b/>
+                                <w:bCs/>
+                                <w:color w:val="000000"/>
+                              </w:rPr>
+                              <w:t>(</w:t>
+                            </w:r>
+                            <w:r>
+                              <w:rPr>
+                                <w:rFonts w:ascii="Arial" w:hAnsi="Arial" w:cs="Arial"/>
+                                <w:b/>
+                                <w:bCs/>
+                                <w:color w:val="000000"/>
+                                <w:sz w:val="20"/>
+                                <w:szCs w:val="20"/>
+                              </w:rPr>
+                              <w:t xml:space="preserve">Adicionar </w:t>
+                            </w:r>
+                            <w:r>
+                              <w:rPr>
+                                <w:rFonts w:ascii="Arial" w:hAnsi="Arial" w:cs="Arial"/>
+                                <w:b/>
+                                <w:bCs/>
+                                <w:color w:val="000000"/>
+                                <w:sz w:val="20"/>
+                                <w:szCs w:val="20"/>
+                              </w:rPr>
+                              <w:t xml:space="preserve">las </w:t>
+                            </w:r>
+                            <w:r>
+                              <w:rPr>
+                                <w:rFonts w:ascii="Arial" w:hAnsi="Arial" w:cs="Arial"/>
+                                <w:b/>
+                                <w:bCs/>
+                                <w:color w:val="000000"/>
+                                <w:sz w:val="20"/>
+                                <w:szCs w:val="20"/>
+                              </w:rPr>
+                              <w:t>páginas que sean necesarias)</w:t>
+                            </w:r>
+                          </w:p>
+                          <w:p>
+                            <w:pPr>
+                              <w:jc w:val="center"/>
+                              <w:rPr>
+                                <w:rFonts w:ascii="Arial" w:hAnsi="Arial" w:cs="Arial"/>
+                                <w:b/>
+                                <w:bCs/>
+                                <w:color w:val="0000FF"/>
+                                <w:sz w:val="28"/>
+                                <w:szCs w:val="28"/>
+                              </w:rPr>
+                            </w:pPr>
+                          </w:p>
+                        </w:txbxContent>
+                      </wps:txbx>
+                      <wps:bodyPr rot="0" vert="horz" wrap="square" lIns="91440" tIns="45720" rIns="91440" bIns="45720" anchor="t" anchorCtr="0" upright="1">
+                        <a:noAutofit/>
+                      </wps:bodyPr>
+                    </wps:wsp>
+                  </a:graphicData>
+                </a:graphic>
+              </wp:inline>
+            </w:drawing>
+          </mc:Choice>
+          <mc:Fallback>
+            <w:pict>
+              <v:roundrect w14:anchorId="6E232B94" id="_x0000_s1041" style="width:474.3pt;height:42.25pt;visibility:visible;mso-wrap-style:square;mso-left-percent:-10001;mso-top-percent:-10001;mso-position-horizontal:absolute;mso-position-horizontal-relative:char;mso-position-vertical:absolute;mso-position-vertical-relative:line;mso-left-percent:-10001;mso-top-percent:-10001;v-text-anchor:top" arcsize="10923f" o:gfxdata="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">
+                <v:shadow on="t" opacity=".5" offset="6pt,6pt"/>
+                <v:textbox>
+                  <w:txbxContent>
+                    <w:p>
+                      <w:pPr>
+                        <w:jc w:val="center"/>
+                        <w:rPr>
+                          <w:rFonts w:ascii="Arial" w:hAnsi="Arial" w:cs="Arial"/>
+                          <w:b/>
+                          <w:bCs/>
+                          <w:color w:val="0000FF"/>
+                          <w:sz w:val="28"/>
+                          <w:szCs w:val="28"/>
+                        </w:rPr>
+                      </w:pPr>
+                      <w:r>
+                        <w:rPr>
+                          <w:rFonts w:ascii="Arial" w:hAnsi="Arial" w:cs="Arial"/>
+                          <w:b/>
+                          <w:bCs/>
+                          <w:color w:val="0000FF"/>
+                          <w:sz w:val="28"/>
+                          <w:szCs w:val="28"/>
+                        </w:rPr>
+                        <w:t>DIBUJO / ESQUEMA / DIAGRAMA</w:t>
+                      </w:r>
+                      <w:r>
+                        <w:rPr>
+                          <w:rFonts w:ascii="Arial" w:hAnsi="Arial" w:cs="Arial"/>
+                          <w:b/>
+                          <w:bCs/>
+                          <w:color w:val="0000FF"/>
+                          <w:sz w:val="28"/>
+                          <w:szCs w:val="28"/>
+                        </w:rPr>
+                        <w:t xml:space="preserve"> DE PROPUESTA</w:t>
+                      </w:r>
+                    </w:p>
+                    <w:p>
+                      <w:pPr>
+                        <w:pStyle w:val="Prrafodelista"/>
+                        <w:ind w:left="360"/>
+                        <w:jc w:val="center"/>
+                        <w:rPr>
+                          <w:rFonts w:ascii="Arial" w:hAnsi="Arial" w:cs="Arial"/>
+                          <w:b/>
+                          <w:bCs/>
+                          <w:color w:val="000000"/>
+                          <w:sz w:val="20"/>
+                          <w:szCs w:val="20"/>
+                        </w:rPr>
+                      </w:pPr>
+                      <w:r>
+                        <w:rPr>
+                          <w:rFonts w:ascii="Arial" w:hAnsi="Arial" w:cs="Arial"/>
+                          <w:b/>
+                          <w:bCs/>
+                          <w:color w:val="000000"/>
+                        </w:rPr>
+                        <w:t>(</w:t>
+                      </w:r>
+                      <w:r>
+                        <w:rPr>
+                          <w:rFonts w:ascii="Arial" w:hAnsi="Arial" w:cs="Arial"/>
+                          <w:b/>
+                          <w:bCs/>
+                          <w:color w:val="000000"/>
+                          <w:sz w:val="20"/>
+                          <w:szCs w:val="20"/>
+                        </w:rPr>
+                        <w:t xml:space="preserve">Adicionar </w:t>
+                      </w:r>
+                      <w:r>
+                        <w:rPr>
+                          <w:rFonts w:ascii="Arial" w:hAnsi="Arial" w:cs="Arial"/>
+                          <w:b/>
+                          <w:bCs/>
+                          <w:color w:val="000000"/>
+                          <w:sz w:val="20"/>
+                          <w:szCs w:val="20"/>
+                        </w:rPr>
+                        <w:t xml:space="preserve">las </w:t>
+                      </w:r>
+                      <w:r>
+                        <w:rPr>
+                          <w:rFonts w:ascii="Arial" w:hAnsi="Arial" w:cs="Arial"/>
+                          <w:b/>
+                          <w:bCs/>
+                          <w:color w:val="000000"/>
+                          <w:sz w:val="20"/>
+                          <w:szCs w:val="20"/>
+                        </w:rPr>
+                        <w:t>páginas que sean necesarias)</w:t>
+                      </w:r>
+                    </w:p>
+                    <w:p>
+                      <w:pPr>
+                        <w:jc w:val="center"/>
+                        <w:rPr>
+                          <w:rFonts w:ascii="Arial" w:hAnsi="Arial" w:cs="Arial"/>
+                          <w:b/>
+                          <w:bCs/>
+                          <w:color w:val="0000FF"/>
+                          <w:sz w:val="28"/>
+                          <w:szCs w:val="28"/>
+                        </w:rPr>
+                      </w:pPr>
+                    </w:p>
+                  </w:txbxContent>
+                </v:textbox>
+                <w10:anchorlock/>
+              </v:roundrect>
+            </w:pict>
+          </mc:Fallback>
+        </mc:AlternateContent>
+      </w:r>
+    </w:p>
+    <w:p>
+      <w:pPr>
+        <w:spacing w:after="200" w:line="276" w:lineRule="auto"/>
+        <w:rPr>
+          <w:rFonts w:ascii="Arial" w:eastAsiaTheme="majorEastAsia" w:hAnsi="Arial" w:cs="Arial"/>
+          <w:b/>
+          <w:bCs/>
+          <w:color w:val="1D4ED8"/>
+          <w:sz w:val="32"/>
+          <w:szCs w:val="32"/>
+          <w:lang w:val="es-PE"/>
+        </w:rPr>
+      </w:pPr>
+      <w:r>
+        <w:rPr>
+          <w:rFonts w:ascii="Arial" w:hAnsi="Arial" w:cs="Arial"/>
+          <w:b/>
+          <w:bCs/>
+          <w:color w:val="1D4ED8"/>
+          <w:lang w:val="es-PE"/>
+        </w:rPr>
+        <w:br w:type="page"/>
+      </w:r>
+    </w:p>
+    <w:p>
+      <w:pPr>
+        <w:pStyle w:val="Ttulo1"/>
+        <w:spacing w:before="300" w:after="150"/>
+        <w:rPr>
+          <w:rFonts w:ascii="Arial" w:hAnsi="Arial" w:cs="Arial"/>
+          <w:b/>
+          <w:bCs/>
+          <w:color w:val="1D4ED8"/>
+          <w:lang w:val="es-PE"/>
+        </w:rPr>
+      </w:pPr>
+      <w:r>
+        <w:rPr>
+          <w:rFonts w:ascii="Arial" w:hAnsi="Arial" w:cs="Arial"/>
+          <w:b/>
+          <w:bCs/>
+          <w:color w:val="1D4ED8"/>
+          <w:lang w:val="es-PE"/>
+        </w:rPr>
+        <w:lastRenderedPageBreak/>
+        <w:drawing>
+          <wp:anchor distT="0" distB="0" distL="114300" distR="114300" simplePos="0" relativeHeight="251738112" behindDoc="0" locked="0" layoutInCell="1" allowOverlap="1" wp14:anchorId="1DE2E78A" wp14:editId="338526FF">
+            <wp:simplePos x="0" y="0"/>
+            <wp:positionH relativeFrom="page">
+              <wp:align>center</wp:align>
+            </wp:positionH>
+            <wp:positionV relativeFrom="paragraph">
+              <wp:posOffset>691296</wp:posOffset>
+            </wp:positionV>
+            <wp:extent cx="5923915" cy="5233670"/>
+            <wp:effectExtent l="0" t="0" r="635" b="5080"/>
+            <wp:wrapSquare wrapText="bothSides"/>
+            <wp:docPr id="401973985" name="Imagen 33"/>
+            <wp:cNvGraphicFramePr>
+              <a:graphicFrameLocks xmlns:a="http://schemas.openxmlformats.org/drawingml/2006/main" noChangeAspect="1"/>
+            </wp:cNvGraphicFramePr>
+            <a:graphic xmlns:a="http://schemas.openxmlformats.org/drawingml/2006/main">
+              <a:graphicData uri="http://schemas.openxmlformats.org/drawingml/2006/picture">
+                <pic:pic xmlns:pic="http://schemas.openxmlformats.org/drawingml/2006/picture">
+                  <pic:nvPicPr>
+                    <pic:cNvPr id="0" name="Picture 65"/>
+                    <pic:cNvPicPr>
+                      <a:picLocks noChangeAspect="1" noChangeArrowheads="1"/>
+                    </pic:cNvPicPr>
+                  </pic:nvPicPr>
+                  <pic:blipFill>
+                    <a:blip r:embed="rId30">
+                      <a:extLst>
+                        <a:ext uri="{28A0092B-C50C-407E-A947-70E740481C1C}">
+                          <a14:useLocalDpi xmlns:a14="http://schemas.microsoft.com/office/drawing/2010/main" val="0"/>
+                        </a:ext>
+                      </a:extLst>
+                    </a:blip>
+                    <a:srcRect/>
+                    <a:stretch>
+                      <a:fillRect/>
+                    </a:stretch>
+                  </pic:blipFill>
+                  <pic:spPr bwMode="auto">
+                    <a:xfrm>
+                      <a:off x="0" y="0"/>
+                      <a:ext cx="5923915" cy="5233670"/>
+                    </a:xfrm>
+                    <a:prstGeom prst="rect">
+                      <a:avLst/>
+                    </a:prstGeom>
+                    <a:noFill/>
+                    <a:ln>
+                      <a:noFill/>
+                    </a:ln>
+                  </pic:spPr>
+                </pic:pic>
+              </a:graphicData>
+            </a:graphic>
+            <wp14:sizeRelH relativeFrom="page">
+              <wp14:pctWidth>0</wp14:pctWidth>
+            </wp14:sizeRelH>
+            <wp14:sizeRelV relativeFrom="page">
+              <wp14:pctHeight>0</wp14:pctHeight>
+            </wp14:sizeRelV>
+          </wp:anchor>
+        </w:drawing>
+      </w:r>
+      <w:r>
+        <w:rPr>
+          <w:rFonts w:ascii="Arial" w:hAnsi="Arial" w:cs="Arial"/>
+          <w:b/>
+          <w:noProof/>
+          <w:lang w:val="es-PE" w:eastAsia="es-PE"/>
+        </w:rPr>
+        <mc:AlternateContent>
+          <mc:Choice Requires="wps">
+            <w:drawing>
+              <wp:inline distT="0" distB="0" distL="0" distR="0" wp14:anchorId="72824929" wp14:editId="3459D19E">
+                <wp:extent cx="6023610" cy="536575"/>
+                <wp:effectExtent l="0" t="0" r="91440" b="92075"/>
+                <wp:docPr id="2011086053" name="AutoShape 111"/>
+                <wp:cNvGraphicFramePr>
+                  <a:graphicFrameLocks xmlns:a="http://schemas.openxmlformats.org/drawingml/2006/main"/>
+                </wp:cNvGraphicFramePr>
+                <a:graphic xmlns:a="http://schemas.openxmlformats.org/drawingml/2006/main">
+                  <a:graphicData uri="http://schemas.microsoft.com/office/word/2010/wordprocessingShape">
+                    <wps:wsp>
+                      <wps:cNvSpPr>
+                        <a:spLocks noChangeArrowheads="1"/>
+                      </wps:cNvSpPr>
+                      <wps:spPr bwMode="auto">
+                        <a:xfrm>
+                          <a:off x="0" y="0"/>
+                          <a:ext cx="6023610" cy="536575"/>
+                        </a:xfrm>
+                        <a:prstGeom prst="roundRect">
+                          <a:avLst>
+                            <a:gd name="adj" fmla="val 16667"/>
+                          </a:avLst>
+                        </a:prstGeom>
+                        <a:solidFill>
+                          <a:srgbClr val="FFFFFF"/>
+                        </a:solidFill>
+                        <a:ln w="9525">
+                          <a:solidFill>
+                            <a:srgbClr val="000000"/>
+                          </a:solidFill>
+                          <a:round/>
+                          <a:headEnd/>
+                          <a:tailEnd/>
+                        </a:ln>
+                        <a:effectLst>
+                          <a:outerShdw dist="107763" dir="2700000" algn="ctr" rotWithShape="0">
+                            <a:srgbClr val="808080">
+                              <a:alpha val="50000"/>
+                            </a:srgbClr>
+                          </a:outerShdw>
+                        </a:effectLst>
+                      </wps:spPr>
+                      <wps:txbx>
+                        <w:txbxContent>
+                          <w:p>
+                            <w:pPr>
+                              <w:jc w:val="center"/>
+                              <w:rPr>
+                                <w:rFonts w:ascii="Arial" w:hAnsi="Arial" w:cs="Arial"/>
+                                <w:b/>
+                                <w:bCs/>
+                                <w:color w:val="0000FF"/>
+                                <w:sz w:val="28"/>
+                                <w:szCs w:val="28"/>
+                              </w:rPr>
+                            </w:pPr>
+                            <w:r>
+                              <w:rPr>
+                                <w:rFonts w:ascii="Arial" w:hAnsi="Arial" w:cs="Arial"/>
+                                <w:b/>
+                                <w:bCs/>
+                                <w:color w:val="0000FF"/>
+                                <w:sz w:val="28"/>
+                                <w:szCs w:val="28"/>
+                              </w:rPr>
+                              <w:t>DIBUJO / ESQUEMA / DIAGRAMA</w:t>
+                            </w:r>
+                            <w:r>
+                              <w:rPr>
+                                <w:rFonts w:ascii="Arial" w:hAnsi="Arial" w:cs="Arial"/>
+                                <w:b/>
+                                <w:bCs/>
+                                <w:color w:val="0000FF"/>
+                                <w:sz w:val="28"/>
+                                <w:szCs w:val="28"/>
+                              </w:rPr>
+                              <w:t xml:space="preserve"> DE PROPUESTA</w:t>
+                            </w:r>
+                          </w:p>
+                          <w:p>
+                            <w:pPr>
+                              <w:pStyle w:val="Prrafodelista"/>
+                              <w:ind w:left="360"/>
+                              <w:jc w:val="center"/>
+                              <w:rPr>
+                                <w:rFonts w:ascii="Arial" w:hAnsi="Arial" w:cs="Arial"/>
+                                <w:b/>
+                                <w:bCs/>
+                                <w:color w:val="000000"/>
+                                <w:sz w:val="20"/>
+                                <w:szCs w:val="20"/>
+                              </w:rPr>
+                            </w:pPr>
+                            <w:r>
+                              <w:rPr>
+                                <w:rFonts w:ascii="Arial" w:hAnsi="Arial" w:cs="Arial"/>
+                                <w:b/>
+                                <w:bCs/>
+                                <w:color w:val="000000"/>
+                              </w:rPr>
+                              <w:t>(</w:t>
+                            </w:r>
+                            <w:r>
+                              <w:rPr>
+                                <w:rFonts w:ascii="Arial" w:hAnsi="Arial" w:cs="Arial"/>
+                                <w:b/>
+                                <w:bCs/>
+                                <w:color w:val="000000"/>
+                                <w:sz w:val="20"/>
+                                <w:szCs w:val="20"/>
+                              </w:rPr>
+                              <w:t xml:space="preserve">Adicionar </w:t>
+                            </w:r>
+                            <w:r>
+                              <w:rPr>
+                                <w:rFonts w:ascii="Arial" w:hAnsi="Arial" w:cs="Arial"/>
+                                <w:b/>
+                                <w:bCs/>
+                                <w:color w:val="000000"/>
+                                <w:sz w:val="20"/>
+                                <w:szCs w:val="20"/>
+                              </w:rPr>
+                              <w:t xml:space="preserve">las </w:t>
+                            </w:r>
+                            <w:r>
+                              <w:rPr>
+                                <w:rFonts w:ascii="Arial" w:hAnsi="Arial" w:cs="Arial"/>
+                                <w:b/>
+                                <w:bCs/>
+                                <w:color w:val="000000"/>
+                                <w:sz w:val="20"/>
+                                <w:szCs w:val="20"/>
+                              </w:rPr>
+                              <w:t>páginas que sean necesarias)</w:t>
+                            </w:r>
+                          </w:p>
+                          <w:p>
+                            <w:pPr>
+                              <w:jc w:val="center"/>
+                              <w:rPr>
+                                <w:rFonts w:ascii="Arial" w:hAnsi="Arial" w:cs="Arial"/>
+                                <w:b/>
+                                <w:bCs/>
+                                <w:color w:val="0000FF"/>
+                                <w:sz w:val="28"/>
+                                <w:szCs w:val="28"/>
+                              </w:rPr>
+                            </w:pPr>
+                          </w:p>
+                        </w:txbxContent>
+                      </wps:txbx>
+                      <wps:bodyPr rot="0" vert="horz" wrap="square" lIns="91440" tIns="45720" rIns="91440" bIns="45720" anchor="t" anchorCtr="0" upright="1">
+                        <a:noAutofit/>
+                      </wps:bodyPr>
+                    </wps:wsp>
+                  </a:graphicData>
+                </a:graphic>
+              </wp:inline>
+            </w:drawing>
+          </mc:Choice>
+          <mc:Fallback>
+            <w:pict>
+              <v:roundrect w14:anchorId="72824929" id="_x0000_s1042" style="width:474.3pt;height:42.25pt;visibility:visible;mso-wrap-style:square;mso-left-percent:-10001;mso-top-percent:-10001;mso-position-horizontal:absolute;mso-position-horizontal-relative:char;mso-position-vertical:absolute;mso-position-vertical-relative:line;mso-left-percent:-10001;mso-top-percent:-10001;v-text-anchor:top" arcsize="10923f" o:gfxdata="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">
+                <v:shadow on="t" opacity=".5" offset="6pt,6pt"/>
+                <v:textbox>
+                  <w:txbxContent>
+                    <w:p>
+                      <w:pPr>
+                        <w:jc w:val="center"/>
+                        <w:rPr>
+                          <w:rFonts w:ascii="Arial" w:hAnsi="Arial" w:cs="Arial"/>
+                          <w:b/>
+                          <w:bCs/>
+                          <w:color w:val="0000FF"/>
+                          <w:sz w:val="28"/>
+                          <w:szCs w:val="28"/>
+                        </w:rPr>
+                      </w:pPr>
+                      <w:r>
+                        <w:rPr>
+                          <w:rFonts w:ascii="Arial" w:hAnsi="Arial" w:cs="Arial"/>
+                          <w:b/>
+                          <w:bCs/>
+                          <w:color w:val="0000FF"/>
+                          <w:sz w:val="28"/>
+                          <w:szCs w:val="28"/>
+                        </w:rPr>
+                        <w:t>DIBUJO / ESQUEMA / DIAGRAMA</w:t>
+                      </w:r>
+                      <w:r>
+                        <w:rPr>
+                          <w:rFonts w:ascii="Arial" w:hAnsi="Arial" w:cs="Arial"/>
+                          <w:b/>
+                          <w:bCs/>
+                          <w:color w:val="0000FF"/>
+                          <w:sz w:val="28"/>
+                          <w:szCs w:val="28"/>
+                        </w:rPr>
+                        <w:t xml:space="preserve"> DE PROPUESTA</w:t>
+                      </w:r>
+                    </w:p>
+                    <w:p>
+                      <w:pPr>
+                        <w:pStyle w:val="Prrafodelista"/>
+                        <w:ind w:left="360"/>
+                        <w:jc w:val="center"/>
+                        <w:rPr>
+                          <w:rFonts w:ascii="Arial" w:hAnsi="Arial" w:cs="Arial"/>
+                          <w:b/>
+                          <w:bCs/>
+                          <w:color w:val="000000"/>
+                          <w:sz w:val="20"/>
+                          <w:szCs w:val="20"/>
+                        </w:rPr>
+                      </w:pPr>
+                      <w:r>
+                        <w:rPr>
+                          <w:rFonts w:ascii="Arial" w:hAnsi="Arial" w:cs="Arial"/>
+                          <w:b/>
+                          <w:bCs/>
+                          <w:color w:val="000000"/>
+                        </w:rPr>
+                        <w:t>(</w:t>
+                      </w:r>
+                      <w:r>
+                        <w:rPr>
+                          <w:rFonts w:ascii="Arial" w:hAnsi="Arial" w:cs="Arial"/>
+                          <w:b/>
+                          <w:bCs/>
+                          <w:color w:val="000000"/>
+                          <w:sz w:val="20"/>
+                          <w:szCs w:val="20"/>
+                        </w:rPr>
+                        <w:t xml:space="preserve">Adicionar </w:t>
+                      </w:r>
+                      <w:r>
+                        <w:rPr>
+                          <w:rFonts w:ascii="Arial" w:hAnsi="Arial" w:cs="Arial"/>
+                          <w:b/>
+                          <w:bCs/>
+                          <w:color w:val="000000"/>
+                          <w:sz w:val="20"/>
+                          <w:szCs w:val="20"/>
+                        </w:rPr>
+                        <w:t xml:space="preserve">las </w:t>
+                      </w:r>
+                      <w:r>
+                        <w:rPr>
+                          <w:rFonts w:ascii="Arial" w:hAnsi="Arial" w:cs="Arial"/>
+                          <w:b/>
+                          <w:bCs/>
+                          <w:color w:val="000000"/>
+                          <w:sz w:val="20"/>
+                          <w:szCs w:val="20"/>
+                        </w:rPr>
+                        <w:t>páginas que sean necesarias)</w:t>
+                      </w:r>
+                    </w:p>
+                    <w:p>
+                      <w:pPr>
+                        <w:jc w:val="center"/>
+                        <w:rPr>
+                          <w:rFonts w:ascii="Arial" w:hAnsi="Arial" w:cs="Arial"/>
+                          <w:b/>
+                          <w:bCs/>
+                          <w:color w:val="0000FF"/>
+                          <w:sz w:val="28"/>
+                          <w:szCs w:val="28"/>
+                        </w:rPr>
+                      </w:pPr>
+                    </w:p>
+                  </w:txbxContent>
+                </v:textbox>
+                <w10:anchorlock/>
+              </v:roundrect>
+            </w:pict>
+          </mc:Fallback>
+        </mc:AlternateContent>
+      </w:r>
+    </w:p>
+    <w:p>
+      <w:pPr>
+        <w:spacing w:after="200" w:line="276" w:lineRule="auto"/>
+        <w:rPr>
+          <w:rFonts w:ascii="Arial" w:eastAsiaTheme="majorEastAsia" w:hAnsi="Arial" w:cs="Arial"/>
+          <w:b/>
+          <w:bCs/>
+          <w:color w:val="1D4ED8"/>
+          <w:sz w:val="32"/>
+          <w:szCs w:val="32"/>
+          <w:lang w:val="es-PE"/>
+        </w:rPr>
+      </w:pPr>
+      <w:r>
+        <w:rPr>
+          <w:rFonts w:ascii="Arial" w:hAnsi="Arial" w:cs="Arial"/>
+          <w:b/>
+          <w:bCs/>
+          <w:color w:val="1D4ED8"/>
+          <w:lang w:val="es-PE"/>
+        </w:rPr>
+        <w:br w:type="page"/>
+      </w:r>
+    </w:p>
+    <w:p>
+      <w:pPr>
+        <w:pStyle w:val="Ttulo1"/>
+        <w:spacing w:before="300" w:after="150"/>
+        <w:rPr>
+          <w:rFonts w:ascii="Arial" w:hAnsi="Arial" w:cs="Arial"/>
+          <w:b/>
+          <w:bCs/>
+          <w:color w:val="1D4ED8"/>
+          <w:lang w:val="es-PE"/>
+        </w:rPr>
+      </w:pPr>
+      <w:r>
+        <w:rPr>
+          <w:rFonts w:ascii="Arial" w:hAnsi="Arial" w:cs="Arial"/>
+          <w:b/>
+          <w:noProof/>
+          <w:lang w:val="es-PE" w:eastAsia="es-PE"/>
+        </w:rPr>
+        <w:lastRenderedPageBreak/>
+        <mc:AlternateContent>
+          <mc:Choice Requires="wps">
+            <w:drawing>
+              <wp:inline distT="0" distB="0" distL="0" distR="0" wp14:anchorId="2C7563B5" wp14:editId="2E7EE8FD">
+                <wp:extent cx="6023610" cy="536575"/>
+                <wp:effectExtent l="0" t="0" r="91440" b="92075"/>
+                <wp:docPr id="843323109" name="AutoShape 111"/>
+                <wp:cNvGraphicFramePr>
+                  <a:graphicFrameLocks xmlns:a="http://schemas.openxmlformats.org/drawingml/2006/main"/>
+                </wp:cNvGraphicFramePr>
+                <a:graphic xmlns:a="http://schemas.openxmlformats.org/drawingml/2006/main">
+                  <a:graphicData uri="http://schemas.microsoft.com/office/word/2010/wordprocessingShape">
+                    <wps:wsp>
+                      <wps:cNvSpPr>
+                        <a:spLocks noChangeArrowheads="1"/>
+                      </wps:cNvSpPr>
+                      <wps:spPr bwMode="auto">
+                        <a:xfrm>
+                          <a:off x="0" y="0"/>
+                          <a:ext cx="6023610" cy="536575"/>
+                        </a:xfrm>
+                        <a:prstGeom prst="roundRect">
+                          <a:avLst>
+                            <a:gd name="adj" fmla="val 16667"/>
+                          </a:avLst>
+                        </a:prstGeom>
+                        <a:solidFill>
+                          <a:srgbClr val="FFFFFF"/>
+                        </a:solidFill>
+                        <a:ln w="9525">
+                          <a:solidFill>
+                            <a:srgbClr val="000000"/>
+                          </a:solidFill>
+                          <a:round/>
+                          <a:headEnd/>
+                          <a:tailEnd/>
+                        </a:ln>
+                        <a:effectLst>
+                          <a:outerShdw dist="107763" dir="2700000" algn="ctr" rotWithShape="0">
+                            <a:srgbClr val="808080">
+                              <a:alpha val="50000"/>
+                            </a:srgbClr>
+                          </a:outerShdw>
+                        </a:effectLst>
+                      </wps:spPr>
+                      <wps:txbx>
+                        <w:txbxContent>
+                          <w:p>
+                            <w:pPr>
+                              <w:jc w:val="center"/>
+                              <w:rPr>
+                                <w:rFonts w:ascii="Arial" w:hAnsi="Arial" w:cs="Arial"/>
+                                <w:b/>
+                                <w:bCs/>
+                                <w:color w:val="0000FF"/>
+                                <w:sz w:val="28"/>
+                                <w:szCs w:val="28"/>
+                              </w:rPr>
+                            </w:pPr>
+                            <w:r>
+                              <w:rPr>
+                                <w:rFonts w:ascii="Arial" w:hAnsi="Arial" w:cs="Arial"/>
+                                <w:b/>
+                                <w:bCs/>
+                                <w:color w:val="0000FF"/>
+                                <w:sz w:val="28"/>
+                                <w:szCs w:val="28"/>
+                              </w:rPr>
+                              <w:t>DIBUJO / ESQUEMA / DIAGRAMA</w:t>
+                            </w:r>
+                            <w:r>
+                              <w:rPr>
+                                <w:rFonts w:ascii="Arial" w:hAnsi="Arial" w:cs="Arial"/>
+                                <w:b/>
+                                <w:bCs/>
+                                <w:color w:val="0000FF"/>
+                                <w:sz w:val="28"/>
+                                <w:szCs w:val="28"/>
+                              </w:rPr>
+                              <w:t xml:space="preserve"> DE PROPUESTA</w:t>
+                            </w:r>
+                          </w:p>
+                          <w:p>
+                            <w:pPr>
+                              <w:pStyle w:val="Prrafodelista"/>
+                              <w:ind w:left="360"/>
+                              <w:jc w:val="center"/>
+                              <w:rPr>
+                                <w:rFonts w:ascii="Arial" w:hAnsi="Arial" w:cs="Arial"/>
+                                <w:b/>
+                                <w:bCs/>
+                                <w:color w:val="000000"/>
+                                <w:sz w:val="20"/>
+                                <w:szCs w:val="20"/>
+                              </w:rPr>
+                            </w:pPr>
+                            <w:r>
+                              <w:rPr>
+                                <w:rFonts w:ascii="Arial" w:hAnsi="Arial" w:cs="Arial"/>
+                                <w:b/>
+                                <w:bCs/>
+                                <w:color w:val="000000"/>
+                              </w:rPr>
+                              <w:t>(</w:t>
+                            </w:r>
+                            <w:r>
+                              <w:rPr>
+                                <w:rFonts w:ascii="Arial" w:hAnsi="Arial" w:cs="Arial"/>
+                                <w:b/>
+                                <w:bCs/>
+                                <w:color w:val="000000"/>
+                                <w:sz w:val="20"/>
+                                <w:szCs w:val="20"/>
+                              </w:rPr>
+                              <w:t xml:space="preserve">Adicionar </w:t>
+                            </w:r>
+                            <w:r>
+                              <w:rPr>
+                                <w:rFonts w:ascii="Arial" w:hAnsi="Arial" w:cs="Arial"/>
+                                <w:b/>
+                                <w:bCs/>
+                                <w:color w:val="000000"/>
+                                <w:sz w:val="20"/>
+                                <w:szCs w:val="20"/>
+                              </w:rPr>
+                              <w:t xml:space="preserve">las </w:t>
+                            </w:r>
+                            <w:r>
+                              <w:rPr>
+                                <w:rFonts w:ascii="Arial" w:hAnsi="Arial" w:cs="Arial"/>
+                                <w:b/>
+                                <w:bCs/>
+                                <w:color w:val="000000"/>
+                                <w:sz w:val="20"/>
+                                <w:szCs w:val="20"/>
+                              </w:rPr>
+                              <w:t>páginas que sean necesarias)</w:t>
+                            </w:r>
+                          </w:p>
+                          <w:p>
+                            <w:pPr>
+                              <w:jc w:val="center"/>
+                              <w:rPr>
+                                <w:rFonts w:ascii="Arial" w:hAnsi="Arial" w:cs="Arial"/>
+                                <w:b/>
+                                <w:bCs/>
+                                <w:color w:val="0000FF"/>
+                                <w:sz w:val="28"/>
+                                <w:szCs w:val="28"/>
+                              </w:rPr>
+                            </w:pPr>
+                          </w:p>
+                        </w:txbxContent>
+                      </wps:txbx>
+                      <wps:bodyPr rot="0" vert="horz" wrap="square" lIns="91440" tIns="45720" rIns="91440" bIns="45720" anchor="t" anchorCtr="0" upright="1">
+                        <a:noAutofit/>
+                      </wps:bodyPr>
+                    </wps:wsp>
+                  </a:graphicData>
+                </a:graphic>
+              </wp:inline>
+            </w:drawing>
+          </mc:Choice>
+          <mc:Fallback>
+            <w:pict>
+              <v:roundrect w14:anchorId="2C7563B5" id="_x0000_s1043" style="width:474.3pt;height:42.25pt;visibility:visible;mso-wrap-style:square;mso-left-percent:-10001;mso-top-percent:-10001;mso-position-horizontal:absolute;mso-position-horizontal-relative:char;mso-position-vertical:absolute;mso-position-vertical-relative:line;mso-left-percent:-10001;mso-top-percent:-10001;v-text-anchor:top" arcsize="10923f" o:gfxdata="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">
+                <v:shadow on="t" opacity=".5" offset="6pt,6pt"/>
+                <v:textbox>
+                  <w:txbxContent>
+                    <w:p>
+                      <w:pPr>
+                        <w:jc w:val="center"/>
+                        <w:rPr>
+                          <w:rFonts w:ascii="Arial" w:hAnsi="Arial" w:cs="Arial"/>
+                          <w:b/>
+                          <w:bCs/>
+                          <w:color w:val="0000FF"/>
+                          <w:sz w:val="28"/>
+                          <w:szCs w:val="28"/>
+                        </w:rPr>
+                      </w:pPr>
+                      <w:r>
+                        <w:rPr>
+                          <w:rFonts w:ascii="Arial" w:hAnsi="Arial" w:cs="Arial"/>
+                          <w:b/>
+                          <w:bCs/>
+                          <w:color w:val="0000FF"/>
+                          <w:sz w:val="28"/>
+                          <w:szCs w:val="28"/>
+                        </w:rPr>
+                        <w:t>DIBUJO / ESQUEMA / DIAGRAMA</w:t>
+                      </w:r>
+                      <w:r>
+                        <w:rPr>
+                          <w:rFonts w:ascii="Arial" w:hAnsi="Arial" w:cs="Arial"/>
+                          <w:b/>
+                          <w:bCs/>
+                          <w:color w:val="0000FF"/>
+                          <w:sz w:val="28"/>
+                          <w:szCs w:val="28"/>
+                        </w:rPr>
+                        <w:t xml:space="preserve"> DE PROPUESTA</w:t>
+                      </w:r>
+                    </w:p>
+                    <w:p>
+                      <w:pPr>
+                        <w:pStyle w:val="Prrafodelista"/>
+                        <w:ind w:left="360"/>
+                        <w:jc w:val="center"/>
+                        <w:rPr>
+                          <w:rFonts w:ascii="Arial" w:hAnsi="Arial" w:cs="Arial"/>
+                          <w:b/>
+                          <w:bCs/>
+                          <w:color w:val="000000"/>
+                          <w:sz w:val="20"/>
+                          <w:szCs w:val="20"/>
+                        </w:rPr>
+                      </w:pPr>
+                      <w:r>
+                        <w:rPr>
+                          <w:rFonts w:ascii="Arial" w:hAnsi="Arial" w:cs="Arial"/>
+                          <w:b/>
+                          <w:bCs/>
+                          <w:color w:val="000000"/>
+                        </w:rPr>
+                        <w:t>(</w:t>
+                      </w:r>
+                      <w:r>
+                        <w:rPr>
+                          <w:rFonts w:ascii="Arial" w:hAnsi="Arial" w:cs="Arial"/>
+                          <w:b/>
+                          <w:bCs/>
+                          <w:color w:val="000000"/>
+                          <w:sz w:val="20"/>
+                          <w:szCs w:val="20"/>
+                        </w:rPr>
+                        <w:t xml:space="preserve">Adicionar </w:t>
+                      </w:r>
+                      <w:r>
+                        <w:rPr>
+                          <w:rFonts w:ascii="Arial" w:hAnsi="Arial" w:cs="Arial"/>
+                          <w:b/>
+                          <w:bCs/>
+                          <w:color w:val="000000"/>
+                          <w:sz w:val="20"/>
+                          <w:szCs w:val="20"/>
+                        </w:rPr>
+                        <w:t xml:space="preserve">las </w:t>
+                      </w:r>
+                      <w:r>
+                        <w:rPr>
+                          <w:rFonts w:ascii="Arial" w:hAnsi="Arial" w:cs="Arial"/>
+                          <w:b/>
+                          <w:bCs/>
+                          <w:color w:val="000000"/>
+                          <w:sz w:val="20"/>
+                          <w:szCs w:val="20"/>
+                        </w:rPr>
+                        <w:t>páginas que sean necesarias)</w:t>
+                      </w:r>
+                    </w:p>
+                    <w:p>
+                      <w:pPr>
+                        <w:jc w:val="center"/>
+                        <w:rPr>
+                          <w:rFonts w:ascii="Arial" w:hAnsi="Arial" w:cs="Arial"/>
+                          <w:b/>
+                          <w:bCs/>
+                          <w:color w:val="0000FF"/>
+                          <w:sz w:val="28"/>
+                          <w:szCs w:val="28"/>
+                        </w:rPr>
+                      </w:pPr>
+                    </w:p>
+                  </w:txbxContent>
+                </v:textbox>
+                <w10:anchorlock/>
+              </v:roundrect>
+            </w:pict>
+          </mc:Fallback>
+        </mc:AlternateContent>
+      </w:r>
+    </w:p>
+    <w:p>
+      <w:pPr>
+        <w:pStyle w:val="Ttulo1"/>
+        <w:spacing w:before="300" w:after="150"/>
+        <w:rPr>
+          <w:rFonts w:ascii="Arial" w:hAnsi="Arial" w:cs="Arial"/>
+          <w:b/>
+          <w:bCs/>
+          <w:color w:val="1D4ED8"/>
+          <w:lang w:val="es-PE"/>
+        </w:rPr>
+      </w:pPr>
+      <w:r>
+        <w:rPr>
+          <w:rFonts w:ascii="Arial" w:hAnsi="Arial" w:cs="Arial"/>
+          <w:b/>
+          <w:bCs/>
+          <w:color w:val="1D4ED8"/>
+          <w:lang w:val="es-PE"/>
+        </w:rPr>
+        <w:drawing>
+          <wp:inline distT="0" distB="0" distL="0" distR="0" wp14:anchorId="31B3B9AB" wp14:editId="7B702E1E">
+            <wp:extent cx="6030595" cy="6123305"/>
+            <wp:effectExtent l="0" t="0" r="8255" b="0"/>
+            <wp:docPr id="1400281433" name="Imagen 35"/>
+            <wp:cNvGraphicFramePr>
+              <a:graphicFrameLocks xmlns:a="http://schemas.openxmlformats.org/drawingml/2006/main" noChangeAspect="1"/>
+            </wp:cNvGraphicFramePr>
+            <a:graphic xmlns:a="http://schemas.openxmlformats.org/drawingml/2006/main">
+              <a:graphicData uri="http://schemas.openxmlformats.org/drawingml/2006/picture">
+                <pic:pic xmlns:pic="http://schemas.openxmlformats.org/drawingml/2006/picture">
+                  <pic:nvPicPr>
+                    <pic:cNvPr id="0" name="Picture 72"/>
+                    <pic:cNvPicPr>
+                      <a:picLocks noChangeAspect="1" noChangeArrowheads="1"/>
+                    </pic:cNvPicPr>
+                  </pic:nvPicPr>
+                  <pic:blipFill>
+                    <a:blip r:embed="rId31">
+                      <a:extLst>
+                        <a:ext uri="{28A0092B-C50C-407E-A947-70E740481C1C}">
+                          <a14:useLocalDpi xmlns:a14="http://schemas.microsoft.com/office/drawing/2010/main" val="0"/>
+                        </a:ext>
+                      </a:extLst>
+                    </a:blip>
+                    <a:srcRect/>
+                    <a:stretch>
+                      <a:fillRect/>
+                    </a:stretch>
+                  </pic:blipFill>
+                  <pic:spPr bwMode="auto">
+                    <a:xfrm>
+                      <a:off x="0" y="0"/>
+                      <a:ext cx="6030595" cy="6123305"/>
+                    </a:xfrm>
+                    <a:prstGeom prst="rect">
+                      <a:avLst/>
+                    </a:prstGeom>
+                    <a:noFill/>
+                    <a:ln>
+                      <a:noFill/>
+                    </a:ln>
+                  </pic:spPr>
+                </pic:pic>
+              </a:graphicData>
+            </a:graphic>
+          </wp:inline>
+        </w:drawing>
+      </w:r>
+    </w:p>
+    <w:p>
+      <w:pPr>
+        <w:pStyle w:val="Ttulo1"/>
+        <w:spacing w:before="300" w:after="150"/>
+        <w:rPr>
+          <w:rFonts w:ascii="Arial" w:hAnsi="Arial" w:cs="Arial"/>
+          <w:b/>
+          <w:bCs/>
+          <w:color w:val="1D4ED8"/>
+          <w:lang w:val="es-PE"/>
+        </w:rPr>
+      </w:pPr>
+    </w:p>
+    <w:p>
+      <w:pPr>
+        <w:spacing w:after="200" w:line="276" w:lineRule="auto"/>
+        <w:rPr>
+          <w:rFonts w:ascii="Arial" w:eastAsiaTheme="majorEastAsia" w:hAnsi="Arial" w:cs="Arial"/>
+          <w:b/>
+          <w:bCs/>
+          <w:color w:val="1D4ED8"/>
+          <w:sz w:val="32"/>
+          <w:szCs w:val="32"/>
+          <w:lang w:val="es-PE"/>
+        </w:rPr>
+      </w:pPr>
+      <w:r>
+        <w:rPr>
+          <w:rFonts w:ascii="Arial" w:hAnsi="Arial" w:cs="Arial"/>
+          <w:b/>
+          <w:bCs/>
+          <w:color w:val="1D4ED8"/>
+          <w:lang w:val="es-PE"/>
+        </w:rPr>
+        <w:br w:type="page"/>
+      </w:r>
+    </w:p>
+    <w:p>
+      <w:pPr>
+        <w:pStyle w:val="Ttulo1"/>
+        <w:spacing w:before="300" w:after="150"/>
+        <w:rPr>
+          <w:rFonts w:ascii="Arial" w:hAnsi="Arial" w:cs="Arial"/>
+          <w:b/>
+          <w:bCs/>
+          <w:color w:val="1D4ED8"/>
+          <w:lang w:val="es-PE"/>
+        </w:rPr>
+      </w:pPr>
+      <w:r>
+        <w:rPr>
+          <w:rFonts w:ascii="Arial" w:hAnsi="Arial" w:cs="Arial"/>
+          <w:b/>
+          <w:noProof/>
+          <w:lang w:val="es-PE" w:eastAsia="es-PE"/>
+        </w:rPr>
+        <w:lastRenderedPageBreak/>
+        <mc:AlternateContent>
+          <mc:Choice Requires="wps">
+            <w:drawing>
+              <wp:inline distT="0" distB="0" distL="0" distR="0" wp14:anchorId="6B6FB1EA" wp14:editId="3709445C">
+                <wp:extent cx="6023610" cy="536575"/>
+                <wp:effectExtent l="0" t="0" r="91440" b="92075"/>
+                <wp:docPr id="1027561684" name="AutoShape 111"/>
+                <wp:cNvGraphicFramePr>
+                  <a:graphicFrameLocks xmlns:a="http://schemas.openxmlformats.org/drawingml/2006/main"/>
+                </wp:cNvGraphicFramePr>
+                <a:graphic xmlns:a="http://schemas.openxmlformats.org/drawingml/2006/main">
+                  <a:graphicData uri="http://schemas.microsoft.com/office/word/2010/wordprocessingShape">
+                    <wps:wsp>
+                      <wps:cNvSpPr>
+                        <a:spLocks noChangeArrowheads="1"/>
+                      </wps:cNvSpPr>
+                      <wps:spPr bwMode="auto">
+                        <a:xfrm>
+                          <a:off x="0" y="0"/>
+                          <a:ext cx="6023610" cy="536575"/>
+                        </a:xfrm>
+                        <a:prstGeom prst="roundRect">
+                          <a:avLst>
+                            <a:gd name="adj" fmla="val 16667"/>
+                          </a:avLst>
+                        </a:prstGeom>
+                        <a:solidFill>
+                          <a:srgbClr val="FFFFFF"/>
+                        </a:solidFill>
+                        <a:ln w="9525">
+                          <a:solidFill>
+                            <a:srgbClr val="000000"/>
+                          </a:solidFill>
+                          <a:round/>
+                          <a:headEnd/>
+                          <a:tailEnd/>
+                        </a:ln>
+                        <a:effectLst>
+                          <a:outerShdw dist="107763" dir="2700000" algn="ctr" rotWithShape="0">
+                            <a:srgbClr val="808080">
+                              <a:alpha val="50000"/>
+                            </a:srgbClr>
+                          </a:outerShdw>
+                        </a:effectLst>
+                      </wps:spPr>
+                      <wps:txbx>
+                        <w:txbxContent>
+                          <w:p>
+                            <w:pPr>
+                              <w:jc w:val="center"/>
+                              <w:rPr>
+                                <w:rFonts w:ascii="Arial" w:hAnsi="Arial" w:cs="Arial"/>
+                                <w:b/>
+                                <w:bCs/>
+                                <w:color w:val="0000FF"/>
+                                <w:sz w:val="28"/>
+                                <w:szCs w:val="28"/>
+                              </w:rPr>
+                            </w:pPr>
+                            <w:r>
+                              <w:rPr>
+                                <w:rFonts w:ascii="Arial" w:hAnsi="Arial" w:cs="Arial"/>
+                                <w:b/>
+                                <w:bCs/>
+                                <w:color w:val="0000FF"/>
+                                <w:sz w:val="28"/>
+                                <w:szCs w:val="28"/>
+                              </w:rPr>
+                              <w:t>DIBUJO / ESQUEMA / DIAGRAMA</w:t>
+                            </w:r>
+                            <w:r>
+                              <w:rPr>
+                                <w:rFonts w:ascii="Arial" w:hAnsi="Arial" w:cs="Arial"/>
+                                <w:b/>
+                                <w:bCs/>
+                                <w:color w:val="0000FF"/>
+                                <w:sz w:val="28"/>
+                                <w:szCs w:val="28"/>
+                              </w:rPr>
+                              <w:t xml:space="preserve"> DE PROPUESTA</w:t>
+                            </w:r>
+                          </w:p>
+                          <w:p>
+                            <w:pPr>
+                              <w:pStyle w:val="Prrafodelista"/>
+                              <w:ind w:left="360"/>
+                              <w:jc w:val="center"/>
+                              <w:rPr>
+                                <w:rFonts w:ascii="Arial" w:hAnsi="Arial" w:cs="Arial"/>
+                                <w:b/>
+                                <w:bCs/>
+                                <w:color w:val="000000"/>
+                                <w:sz w:val="20"/>
+                                <w:szCs w:val="20"/>
+                              </w:rPr>
+                            </w:pPr>
+                            <w:r>
+                              <w:rPr>
+                                <w:rFonts w:ascii="Arial" w:hAnsi="Arial" w:cs="Arial"/>
+                                <w:b/>
+                                <w:bCs/>
+                                <w:color w:val="000000"/>
+                              </w:rPr>
+                              <w:t>(</w:t>
+                            </w:r>
+                            <w:r>
+                              <w:rPr>
+                                <w:rFonts w:ascii="Arial" w:hAnsi="Arial" w:cs="Arial"/>
+                                <w:b/>
+                                <w:bCs/>
+                                <w:color w:val="000000"/>
+                                <w:sz w:val="20"/>
+                                <w:szCs w:val="20"/>
+                              </w:rPr>
+                              <w:t xml:space="preserve">Adicionar </w:t>
+                            </w:r>
+                            <w:r>
+                              <w:rPr>
+                                <w:rFonts w:ascii="Arial" w:hAnsi="Arial" w:cs="Arial"/>
+                                <w:b/>
+                                <w:bCs/>
+                                <w:color w:val="000000"/>
+                                <w:sz w:val="20"/>
+                                <w:szCs w:val="20"/>
+                              </w:rPr>
+                              <w:t xml:space="preserve">las </w:t>
+                            </w:r>
+                            <w:r>
+                              <w:rPr>
+                                <w:rFonts w:ascii="Arial" w:hAnsi="Arial" w:cs="Arial"/>
+                                <w:b/>
+                                <w:bCs/>
+                                <w:color w:val="000000"/>
+                                <w:sz w:val="20"/>
+                                <w:szCs w:val="20"/>
+                              </w:rPr>
+                              <w:t>páginas que sean necesarias)</w:t>
+                            </w:r>
+                          </w:p>
+                          <w:p>
+                            <w:pPr>
+                              <w:jc w:val="center"/>
+                              <w:rPr>
+                                <w:rFonts w:ascii="Arial" w:hAnsi="Arial" w:cs="Arial"/>
+                                <w:b/>
+                                <w:bCs/>
+                                <w:color w:val="0000FF"/>
+                                <w:sz w:val="28"/>
+                                <w:szCs w:val="28"/>
+                              </w:rPr>
+                            </w:pPr>
+                          </w:p>
+                        </w:txbxContent>
+                      </wps:txbx>
+                      <wps:bodyPr rot="0" vert="horz" wrap="square" lIns="91440" tIns="45720" rIns="91440" bIns="45720" anchor="t" anchorCtr="0" upright="1">
+                        <a:noAutofit/>
+                      </wps:bodyPr>
+                    </wps:wsp>
+                  </a:graphicData>
+                </a:graphic>
+              </wp:inline>
+            </w:drawing>
+          </mc:Choice>
+          <mc:Fallback>
+            <w:pict>
+              <v:roundrect w14:anchorId="6B6FB1EA" id="_x0000_s1044" style="width:474.3pt;height:42.25pt;visibility:visible;mso-wrap-style:square;mso-left-percent:-10001;mso-top-percent:-10001;mso-position-horizontal:absolute;mso-position-horizontal-relative:char;mso-position-vertical:absolute;mso-position-vertical-relative:line;mso-left-percent:-10001;mso-top-percent:-10001;v-text-anchor:top" arcsize="10923f" o:gfxdata="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">
+                <v:shadow on="t" opacity=".5" offset="6pt,6pt"/>
+                <v:textbox>
+                  <w:txbxContent>
+                    <w:p>
+                      <w:pPr>
+                        <w:jc w:val="center"/>
+                        <w:rPr>
+                          <w:rFonts w:ascii="Arial" w:hAnsi="Arial" w:cs="Arial"/>
+                          <w:b/>
+                          <w:bCs/>
+                          <w:color w:val="0000FF"/>
+                          <w:sz w:val="28"/>
+                          <w:szCs w:val="28"/>
+                        </w:rPr>
+                      </w:pPr>
+                      <w:r>
+                        <w:rPr>
+                          <w:rFonts w:ascii="Arial" w:hAnsi="Arial" w:cs="Arial"/>
+                          <w:b/>
+                          <w:bCs/>
+                          <w:color w:val="0000FF"/>
+                          <w:sz w:val="28"/>
+                          <w:szCs w:val="28"/>
+                        </w:rPr>
+                        <w:t>DIBUJO / ESQUEMA / DIAGRAMA</w:t>
+                      </w:r>
+                      <w:r>
+                        <w:rPr>
+                          <w:rFonts w:ascii="Arial" w:hAnsi="Arial" w:cs="Arial"/>
+                          <w:b/>
+                          <w:bCs/>
+                          <w:color w:val="0000FF"/>
+                          <w:sz w:val="28"/>
+                          <w:szCs w:val="28"/>
+                        </w:rPr>
+                        <w:t xml:space="preserve"> DE PROPUESTA</w:t>
+                      </w:r>
+                    </w:p>
+                    <w:p>
+                      <w:pPr>
+                        <w:pStyle w:val="Prrafodelista"/>
+                        <w:ind w:left="360"/>
+                        <w:jc w:val="center"/>
+                        <w:rPr>
+                          <w:rFonts w:ascii="Arial" w:hAnsi="Arial" w:cs="Arial"/>
+                          <w:b/>
+                          <w:bCs/>
+                          <w:color w:val="000000"/>
+                          <w:sz w:val="20"/>
+                          <w:szCs w:val="20"/>
+                        </w:rPr>
+                      </w:pPr>
+                      <w:r>
+                        <w:rPr>
+                          <w:rFonts w:ascii="Arial" w:hAnsi="Arial" w:cs="Arial"/>
+                          <w:b/>
+                          <w:bCs/>
+                          <w:color w:val="000000"/>
+                        </w:rPr>
+                        <w:t>(</w:t>
+                      </w:r>
+                      <w:r>
+                        <w:rPr>
+                          <w:rFonts w:ascii="Arial" w:hAnsi="Arial" w:cs="Arial"/>
+                          <w:b/>
+                          <w:bCs/>
+                          <w:color w:val="000000"/>
+                          <w:sz w:val="20"/>
+                          <w:szCs w:val="20"/>
+                        </w:rPr>
+                        <w:t xml:space="preserve">Adicionar </w:t>
+                      </w:r>
+                      <w:r>
+                        <w:rPr>
+                          <w:rFonts w:ascii="Arial" w:hAnsi="Arial" w:cs="Arial"/>
+                          <w:b/>
+                          <w:bCs/>
+                          <w:color w:val="000000"/>
+                          <w:sz w:val="20"/>
+                          <w:szCs w:val="20"/>
+                        </w:rPr>
+                        <w:t xml:space="preserve">las </w:t>
+                      </w:r>
+                      <w:r>
+                        <w:rPr>
+                          <w:rFonts w:ascii="Arial" w:hAnsi="Arial" w:cs="Arial"/>
+                          <w:b/>
+                          <w:bCs/>
+                          <w:color w:val="000000"/>
+                          <w:sz w:val="20"/>
+                          <w:szCs w:val="20"/>
+                        </w:rPr>
+                        <w:t>páginas que sean necesarias)</w:t>
+                      </w:r>
+                    </w:p>
+                    <w:p>
+                      <w:pPr>
+                        <w:jc w:val="center"/>
+                        <w:rPr>
+                          <w:rFonts w:ascii="Arial" w:hAnsi="Arial" w:cs="Arial"/>
+                          <w:b/>
+                          <w:bCs/>
+                          <w:color w:val="0000FF"/>
+                          <w:sz w:val="28"/>
+                          <w:szCs w:val="28"/>
+                        </w:rPr>
+                      </w:pPr>
+                    </w:p>
+                  </w:txbxContent>
+                </v:textbox>
+                <w10:anchorlock/>
+              </v:roundrect>
+            </w:pict>
+          </mc:Fallback>
+        </mc:AlternateContent>
+      </w:r>
+    </w:p>
+    <w:p>
+      <w:pPr>
+        <w:pStyle w:val="Ttulo1"/>
+        <w:spacing w:before="300" w:after="150"/>
+        <w:rPr>
+          <w:rFonts w:ascii="Arial" w:hAnsi="Arial" w:cs="Arial"/>
+          <w:b/>
+          <w:bCs/>
+          <w:color w:val="1D4ED8"/>
+          <w:lang w:val="es-PE"/>
+        </w:rPr>
+      </w:pPr>
+      <w:r>
+        <w:rPr>
+          <w:rFonts w:ascii="Arial" w:hAnsi="Arial" w:cs="Arial"/>
+          <w:b/>
+          <w:bCs/>
+          <w:color w:val="1D4ED8"/>
+          <w:lang w:val="es-PE"/>
+        </w:rPr>
+        <w:drawing>
+          <wp:inline distT="0" distB="0" distL="0" distR="0" wp14:anchorId="201D009D" wp14:editId="047F6B77">
+            <wp:extent cx="6030595" cy="6035675"/>
+            <wp:effectExtent l="0" t="0" r="8255" b="3175"/>
+            <wp:docPr id="1674986791" name="Imagen 37"/>
+            <wp:cNvGraphicFramePr>
+              <a:graphicFrameLocks xmlns:a="http://schemas.openxmlformats.org/drawingml/2006/main" noChangeAspect="1"/>
+            </wp:cNvGraphicFramePr>
+            <a:graphic xmlns:a="http://schemas.openxmlformats.org/drawingml/2006/main">
+              <a:graphicData uri="http://schemas.openxmlformats.org/drawingml/2006/picture">
+                <pic:pic xmlns:pic="http://schemas.openxmlformats.org/drawingml/2006/picture">
+                  <pic:nvPicPr>
+                    <pic:cNvPr id="0" name="Picture 79"/>
+                    <pic:cNvPicPr>
+                      <a:picLocks noChangeAspect="1" noChangeArrowheads="1"/>
+                    </pic:cNvPicPr>
+                  </pic:nvPicPr>
+                  <pic:blipFill>
+                    <a:blip r:embed="rId32">
+                      <a:extLst>
+                        <a:ext uri="{28A0092B-C50C-407E-A947-70E740481C1C}">
+                          <a14:useLocalDpi xmlns:a14="http://schemas.microsoft.com/office/drawing/2010/main" val="0"/>
+                        </a:ext>
+                      </a:extLst>
+                    </a:blip>
+                    <a:srcRect/>
+                    <a:stretch>
+                      <a:fillRect/>
+                    </a:stretch>
+                  </pic:blipFill>
+                  <pic:spPr bwMode="auto">
+                    <a:xfrm>
+                      <a:off x="0" y="0"/>
+                      <a:ext cx="6030595" cy="6035675"/>
+                    </a:xfrm>
+                    <a:prstGeom prst="rect">
+                      <a:avLst/>
+                    </a:prstGeom>
+                    <a:noFill/>
+                    <a:ln>
+                      <a:noFill/>
+                    </a:ln>
+                  </pic:spPr>
+                </pic:pic>
+              </a:graphicData>
+            </a:graphic>
+          </wp:inline>
+        </w:drawing>
+      </w:r>
+    </w:p>
+    <w:p>
+      <w:pPr>
+        <w:pStyle w:val="Ttulo1"/>
+        <w:spacing w:before="300" w:after="150"/>
+        <w:rPr>
+          <w:rFonts w:ascii="Arial" w:hAnsi="Arial" w:cs="Arial"/>
+          <w:b/>
+          <w:bCs/>
+          <w:color w:val="1D4ED8"/>
+          <w:lang w:val="es-PE"/>
+        </w:rPr>
+      </w:pPr>
+    </w:p>
+    <w:p>
+      <w:pPr>
+        <w:pStyle w:val="Ttulo1"/>
+        <w:spacing w:before="300" w:after="150"/>
+        <w:rPr>
+          <w:rFonts w:ascii="Arial" w:hAnsi="Arial" w:cs="Arial"/>
+          <w:b/>
+          <w:bCs/>
+          <w:color w:val="1D4ED8"/>
+        </w:rPr>
+      </w:pPr>
+    </w:p>
+    <w:p>
+      <w:pPr>
+        <w:spacing w:after="200" w:line="276" w:lineRule="auto"/>
+        <w:rPr>
+          <w:rFonts w:ascii="Arial" w:eastAsiaTheme="majorEastAsia" w:hAnsi="Arial" w:cs="Arial"/>
+          <w:b/>
+          <w:bCs/>
+          <w:color w:val="1D4ED8"/>
+          <w:sz w:val="32"/>
+          <w:szCs w:val="32"/>
+        </w:rPr>
+      </w:pPr>
+      <w:r>
+        <w:rPr>
+          <w:rFonts w:ascii="Arial" w:hAnsi="Arial" w:cs="Arial"/>
+          <w:b/>
+          <w:bCs/>
+          <w:color w:val="1D4ED8"/>
+        </w:rPr>
+        <w:br w:type="page"/>
+      </w:r>
+    </w:p>
+    <w:p>
+      <w:pPr>
         <w:pStyle w:val="Ttulo1"/>
         <w:spacing w:before="300" w:after="150"/>
         <w:rPr>
@@ -14472,7 +18349,16 @@
             </w:tcMar>
             <w:vAlign w:val="center"/>
           </w:tcPr>
-          <w:p/>
+          <w:p>
+            <w:r>
+              <w:t xml:space="preserve">Angel </w:t>
+            </w:r>
+            <w:proofErr w:type="spellStart"/>
+            <w:r>
+              <w:t>Sanchez</w:t>
+            </w:r>
+            <w:proofErr w:type="spellEnd"/>
+          </w:p>
         </w:tc>
         <w:tc>
           <w:tcPr>
@@ -14485,7 +18371,11 @@
             </w:tcMar>
             <w:vAlign w:val="center"/>
           </w:tcPr>
-          <w:p/>
+          <w:p>
+            <w:r>
+              <w:t>20 segundos</w:t>
+            </w:r>
+          </w:p>
         </w:tc>
         <w:tc>
           <w:tcPr>
@@ -14498,7 +18388,16 @@
             </w:tcMar>
             <w:vAlign w:val="center"/>
           </w:tcPr>
-          <w:p/>
+          <w:p>
+            <w:r>
+              <w:t xml:space="preserve">No genera </w:t>
+            </w:r>
+            <w:proofErr w:type="spellStart"/>
+            <w:r>
+              <w:t>Excels</w:t>
+            </w:r>
+            <w:proofErr w:type="spellEnd"/>
+          </w:p>
         </w:tc>
         <w:tc>
           <w:tcPr>
@@ -14511,7 +18410,14 @@
             </w:tcMar>
             <w:vAlign w:val="center"/>
           </w:tcPr>
-          <w:p/>
+          <w:p>
+            <w:pPr>
+              <w:jc w:val="center"/>
+            </w:pPr>
+            <w:r>
+              <w:t>90/100</w:t>
+            </w:r>
+          </w:p>
         </w:tc>
       </w:tr>
       <w:tr>
@@ -14526,7 +18432,11 @@
             </w:tcMar>
             <w:vAlign w:val="center"/>
           </w:tcPr>
-          <w:p/>
+          <w:p>
+            <w:r>
+              <w:t>Dara Beteta</w:t>
+            </w:r>
+          </w:p>
         </w:tc>
         <w:tc>
           <w:tcPr>
@@ -14539,7 +18449,11 @@
             </w:tcMar>
             <w:vAlign w:val="center"/>
           </w:tcPr>
-          <w:p/>
+          <w:p>
+            <w:r>
+              <w:t>28 segundos</w:t>
+            </w:r>
+          </w:p>
         </w:tc>
         <w:tc>
           <w:tcPr>
@@ -14552,7 +18466,11 @@
             </w:tcMar>
             <w:vAlign w:val="center"/>
           </w:tcPr>
-          <w:p/>
+          <w:p>
+            <w:r>
+              <w:t>Sin errores observados</w:t>
+            </w:r>
+          </w:p>
         </w:tc>
         <w:tc>
           <w:tcPr>
@@ -14565,7 +18483,14 @@
             </w:tcMar>
             <w:vAlign w:val="center"/>
           </w:tcPr>
-          <w:p/>
+          <w:p>
+            <w:pPr>
+              <w:jc w:val="center"/>
+            </w:pPr>
+            <w:r>
+              <w:t>95/100</w:t>
+            </w:r>
+          </w:p>
         </w:tc>
       </w:tr>
       <w:tr>
@@ -14580,7 +18505,11 @@
             </w:tcMar>
             <w:vAlign w:val="center"/>
           </w:tcPr>
-          <w:p/>
+          <w:p>
+            <w:r>
+              <w:t>Dana Melendez</w:t>
+            </w:r>
+          </w:p>
         </w:tc>
         <w:tc>
           <w:tcPr>
@@ -14593,7 +18522,11 @@
             </w:tcMar>
             <w:vAlign w:val="center"/>
           </w:tcPr>
-          <w:p/>
+          <w:p>
+            <w:r>
+              <w:t>24 segundos</w:t>
+            </w:r>
+          </w:p>
         </w:tc>
         <w:tc>
           <w:tcPr>
@@ -14606,7 +18539,11 @@
             </w:tcMar>
             <w:vAlign w:val="center"/>
           </w:tcPr>
-          <w:p/>
+          <w:p>
+            <w:r>
+              <w:t>Sin animaciones</w:t>
+            </w:r>
+          </w:p>
         </w:tc>
         <w:tc>
           <w:tcPr>
@@ -14619,7 +18556,14 @@
             </w:tcMar>
             <w:vAlign w:val="center"/>
           </w:tcPr>
-          <w:p/>
+          <w:p>
+            <w:pPr>
+              <w:jc w:val="center"/>
+            </w:pPr>
+            <w:r>
+              <w:t>90/100</w:t>
+            </w:r>
+          </w:p>
         </w:tc>
       </w:tr>
       <w:tr>
@@ -14634,7 +18578,11 @@
             </w:tcMar>
             <w:vAlign w:val="center"/>
           </w:tcPr>
-          <w:p/>
+          <w:p>
+            <w:r>
+              <w:t>Alejandro Magno</w:t>
+            </w:r>
+          </w:p>
         </w:tc>
         <w:tc>
           <w:tcPr>
@@ -14647,7 +18595,11 @@
             </w:tcMar>
             <w:vAlign w:val="center"/>
           </w:tcPr>
-          <w:p/>
+          <w:p>
+            <w:r>
+              <w:t>18 segundos</w:t>
+            </w:r>
+          </w:p>
         </w:tc>
         <w:tc>
           <w:tcPr>
@@ -14660,7 +18612,11 @@
             </w:tcMar>
             <w:vAlign w:val="center"/>
           </w:tcPr>
-          <w:p/>
+          <w:p>
+            <w:r>
+              <w:t>Sin errores observados</w:t>
+            </w:r>
+          </w:p>
         </w:tc>
         <w:tc>
           <w:tcPr>
@@ -14673,7 +18629,92 @@
             </w:tcMar>
             <w:vAlign w:val="center"/>
           </w:tcPr>
-          <w:p/>
+          <w:p>
+            <w:pPr>
+              <w:jc w:val="center"/>
+            </w:pPr>
+            <w:r>
+              <w:t>100/100</w:t>
+            </w:r>
+          </w:p>
+        </w:tc>
+      </w:tr>
+      <w:tr>
+        <w:tc>
+          <w:tcPr>
+            <w:tcW w:w="2800" w:type="dxa"/>
+            <w:tcMar>
+              <w:top w:w="80" w:type="dxa"/>
+              <w:left w:w="100" w:type="dxa"/>
+              <w:bottom w:w="80" w:type="dxa"/>
+              <w:right w:w="100" w:type="dxa"/>
+            </w:tcMar>
+            <w:vAlign w:val="center"/>
+          </w:tcPr>
+          <w:p>
+            <w:r>
+              <w:t>Leyssi Nuñez</w:t>
+            </w:r>
+          </w:p>
+        </w:tc>
+        <w:tc>
+          <w:tcPr>
+            <w:tcW w:w="2000" w:type="dxa"/>
+            <w:tcMar>
+              <w:top w:w="80" w:type="dxa"/>
+              <w:left w:w="100" w:type="dxa"/>
+              <w:bottom w:w="80" w:type="dxa"/>
+              <w:right w:w="100" w:type="dxa"/>
+            </w:tcMar>
+            <w:vAlign w:val="center"/>
+          </w:tcPr>
+          <w:p>
+            <w:r>
+              <w:t>25 segundos</w:t>
+            </w:r>
+          </w:p>
+        </w:tc>
+        <w:tc>
+          <w:tcPr>
+            <w:tcW w:w="2000" w:type="dxa"/>
+            <w:tcMar>
+              <w:top w:w="80" w:type="dxa"/>
+              <w:left w:w="100" w:type="dxa"/>
+              <w:bottom w:w="80" w:type="dxa"/>
+              <w:right w:w="100" w:type="dxa"/>
+            </w:tcMar>
+            <w:vAlign w:val="center"/>
+          </w:tcPr>
+          <w:p>
+            <w:r>
+              <w:t xml:space="preserve">Login algo </w:t>
+            </w:r>
+            <w:proofErr w:type="spellStart"/>
+            <w:r>
+              <w:t>vacio</w:t>
+            </w:r>
+            <w:proofErr w:type="spellEnd"/>
+          </w:p>
+        </w:tc>
+        <w:tc>
+          <w:tcPr>
+            <w:tcW w:w="2267" w:type="dxa"/>
+            <w:tcMar>
+              <w:top w:w="80" w:type="dxa"/>
+              <w:left w:w="100" w:type="dxa"/>
+              <w:bottom w:w="80" w:type="dxa"/>
+              <w:right w:w="100" w:type="dxa"/>
+            </w:tcMar>
+            <w:vAlign w:val="center"/>
+          </w:tcPr>
+          <w:p>
+            <w:pPr>
+              <w:jc w:val="center"/>
+            </w:pPr>
+            <w:r>
+              <w:t>95/100</w:t>
+            </w:r>
+          </w:p>
         </w:tc>
       </w:tr>
     </w:tbl>
@@ -14818,7 +18859,7 @@
                     <pic:cNvPicPr/>
                   </pic:nvPicPr>
                   <pic:blipFill>
-                    <a:blip r:embed="rId23"/>
+                    <a:blip r:embed="rId33"/>
                     <a:stretch>
                       <a:fillRect/>
                     </a:stretch>
@@ -14878,7 +18919,7 @@
                     <pic:cNvPicPr/>
                   </pic:nvPicPr>
                   <pic:blipFill>
-                    <a:blip r:embed="rId24"/>
+                    <a:blip r:embed="rId34"/>
                     <a:stretch>
                       <a:fillRect/>
                     </a:stretch>
@@ -14944,7 +18985,7 @@
                     <pic:cNvPicPr/>
                   </pic:nvPicPr>
                   <pic:blipFill>
-                    <a:blip r:embed="rId25"/>
+                    <a:blip r:embed="rId35"/>
                     <a:stretch>
                       <a:fillRect/>
                     </a:stretch>
@@ -15004,7 +19045,7 @@
                     <pic:cNvPicPr/>
                   </pic:nvPicPr>
                   <pic:blipFill>
-                    <a:blip r:embed="rId26"/>
+                    <a:blip r:embed="rId36"/>
                     <a:stretch>
                       <a:fillRect/>
                     </a:stretch>
@@ -15075,7 +19116,7 @@
                     <pic:cNvPicPr/>
                   </pic:nvPicPr>
                   <pic:blipFill>
-                    <a:blip r:embed="rId27"/>
+                    <a:blip r:embed="rId37"/>
                     <a:stretch>
                       <a:fillRect/>
                     </a:stretch>
@@ -15135,7 +19176,7 @@
                     <pic:cNvPicPr/>
                   </pic:nvPicPr>
                   <pic:blipFill>
-                    <a:blip r:embed="rId28"/>
+                    <a:blip r:embed="rId38"/>
                     <a:stretch>
                       <a:fillRect/>
                     </a:stretch>
@@ -15181,7 +19222,7 @@
                     <pic:cNvPicPr/>
                   </pic:nvPicPr>
                   <pic:blipFill>
-                    <a:blip r:embed="rId29"/>
+                    <a:blip r:embed="rId39"/>
                     <a:stretch>
                       <a:fillRect/>
                     </a:stretch>
@@ -15325,7 +19366,7 @@
           </mc:Choice>
           <mc:Fallback>
             <w:pict>
-              <v:roundrect w14:anchorId="2A4EEC46" id="_x0000_s1035" style="width:340.15pt;height:28.35pt;visibility:visible;mso-wrap-style:square;mso-left-percent:-10001;mso-top-percent:-10001;mso-position-horizontal:absolute;mso-position-horizontal-relative:char;mso-position-vertical:absolute;mso-position-vertical-relative:line;mso-left-percent:-10001;mso-top-percent:-10001;v-text-anchor:middle" arcsize="10923f" o:gfxdata="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" fillcolor="blue" strokecolor="blue" strokeweight="2pt">
+              <v:roundrect w14:anchorId="2A4EEC46" id="_x0000_s1045" style="width:340.15pt;height:28.35pt;visibility:visible;mso-wrap-style:square;mso-left-percent:-10001;mso-top-percent:-10001;mso-position-horizontal:absolute;mso-position-horizontal-relative:char;mso-position-vertical:absolute;mso-position-vertical-relative:line;mso-left-percent:-10001;mso-top-percent:-10001;v-text-anchor:middle" arcsize="10923f" o:gfxdata="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" fillcolor="blue" strokecolor="blue" strokeweight="2pt">
                 <v:shadow on="t" color="black" opacity="26214f" origin="-.5,-.5" offset=".74836mm,.74836mm"/>
                 <v:textbox>
                   <w:txbxContent>
@@ -16906,7 +20947,7 @@
           </mc:Choice>
           <mc:Fallback>
             <w:pict>
-              <v:roundrect w14:anchorId="7D179FA5" id="_x0000_s1036" style="width:340.15pt;height:28.35pt;visibility:visible;mso-wrap-style:square;mso-left-percent:-10001;mso-top-percent:-10001;mso-position-horizontal:absolute;mso-position-horizontal-relative:char;mso-position-vertical:absolute;mso-position-vertical-relative:line;mso-left-percent:-10001;mso-top-percent:-10001;v-text-anchor:middle" arcsize="10923f" o:gfxdata="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" fillcolor="blue" strokecolor="blue" strokeweight="2pt">
+              <v:roundrect w14:anchorId="7D179FA5" id="_x0000_s1046" style="width:340.15pt;height:28.35pt;visibility:visible;mso-wrap-style:square;mso-left-percent:-10001;mso-top-percent:-10001;mso-position-horizontal:absolute;mso-position-horizontal-relative:char;mso-position-vertical:absolute;mso-position-vertical-relative:line;mso-left-percent:-10001;mso-top-percent:-10001;v-text-anchor:middle" arcsize="10923f" o:gfxdata="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" fillcolor="blue" strokecolor="blue" strokeweight="2pt">
                 <v:shadow on="t" color="black" opacity="26214f" origin="-.5,-.5" offset=".74836mm,.74836mm"/>
                 <v:textbox>
                   <w:txbxContent>
@@ -17727,7 +21768,7 @@
                     </pic:cNvPicPr>
                   </pic:nvPicPr>
                   <pic:blipFill>
-                    <a:blip r:embed="rId30" cstate="print">
+                    <a:blip r:embed="rId40" cstate="print">
                       <a:extLst>
                         <a:ext uri="{28A0092B-C50C-407E-A947-70E740481C1C}">
                           <a14:useLocalDpi xmlns:a14="http://schemas.microsoft.com/office/drawing/2010/main" val="0"/>
@@ -17766,8 +21807,8 @@
       </w:r>
     </w:p>
     <w:sectPr>
-      <w:headerReference w:type="default" r:id="rId31"/>
-      <w:footerReference w:type="default" r:id="rId32"/>
+      <w:headerReference w:type="default" r:id="rId41"/>
+      <w:footerReference w:type="default" r:id="rId42"/>
       <w:pgSz w:w="11906" w:h="16838"/>
       <w:pgMar w:top="1418" w:right="1701" w:bottom="249" w:left="1418" w:header="709" w:footer="709" w:gutter="0"/>
       <w:cols w:space="708"/>
@@ -17964,8 +22005,8 @@
             </mc:Choice>
             <mc:Fallback>
               <w:pict>
-                <v:group w14:anchorId="28EF7AAC" id="Grupo 2" o:spid="_x0000_s1037" style="position:absolute;margin-left:20.8pt;margin-top:0;width:1in;height:1in;z-index:251661312;mso-position-horizontal:right;mso-position-horizontal-relative:right-margin-area;mso-position-vertical:bottom;mso-position-vertical-relative:bottom-margin-area" coordorigin="10800,14400" coordsize="1440,1440" o:gfxdata="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" o:allowincell="f">
-                  <v:rect id="Rectangle 2" o:spid="_x0000_s1038" style="position:absolute;left:10800;top:14400;width:1440;height:1440;visibility:visible;mso-wrap-style:square;v-text-anchor:top" o:gfxdata="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" stroked="f">
+                <v:group w14:anchorId="28EF7AAC" id="Grupo 2" o:spid="_x0000_s1047" style="position:absolute;margin-left:20.8pt;margin-top:0;width:1in;height:1in;z-index:251661312;mso-position-horizontal:right;mso-position-horizontal-relative:right-margin-area;mso-position-vertical:bottom;mso-position-vertical-relative:bottom-margin-area" coordorigin="10800,14400" coordsize="1440,1440" o:gfxdata="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" o:allowincell="f">
+                  <v:rect id="Rectangle 2" o:spid="_x0000_s1048" style="position:absolute;left:10800;top:14400;width:1440;height:1440;visibility:visible;mso-wrap-style:square;v-text-anchor:top" o:gfxdata="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" stroked="f">
                     <v:textbox>
                       <w:txbxContent>
                         <w:p/>
@@ -17983,7 +22024,7 @@
                       <v:h position="#0,topLeft" xrange="0,21600"/>
                     </v:handles>
                   </v:shapetype>
-                  <v:shape id="AutoShape 3" o:spid="_x0000_s1039" type="#_x0000_t15" style="position:absolute;left:11043;top:14864;width:782;height:495;rotation:135;flip:x;visibility:visible;mso-wrap-style:square;v-text-anchor:middle" o:gfxdata="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" adj="13859" filled="f" fillcolor="#5c83b4" strokecolor="#5c83b4">
+                  <v:shape id="AutoShape 3" o:spid="_x0000_s1049" type="#_x0000_t15" style="position:absolute;left:11043;top:14864;width:782;height:495;rotation:135;flip:x;visibility:visible;mso-wrap-style:square;v-text-anchor:middle" o:gfxdata="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" adj="13859" filled="f" fillcolor="#5c83b4" strokecolor="#5c83b4">
                     <v:textbox inset=",0,,0">
                       <w:txbxContent>
                         <w:p>
@@ -18120,7 +22161,7 @@
               <v:stroke joinstyle="miter"/>
               <v:path gradientshapeok="t" o:connecttype="rect"/>
             </v:shapetype>
-            <v:shape id="Cuadro de texto 2" o:spid="_x0000_s1040" type="#_x0000_t202" style="position:absolute;margin-left:0;margin-top:-293.2pt;width:496.4pt;height:90.75pt;z-index:251667456;visibility:visible;mso-wrap-style:square;mso-width-percent:0;mso-height-percent:200;mso-wrap-distance-left:9pt;mso-wrap-distance-top:3.6pt;mso-wrap-distance-right:9pt;mso-wrap-distance-bottom:3.6pt;mso-position-horizontal:left;mso-position-horizontal-relative:margin;mso-position-vertical:absolute;mso-position-vertical-relative:text;mso-width-percent:0;mso-height-percent:200;mso-width-relative:margin;mso-height-relative:margin;v-text-anchor:top" o:gfxdata="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" filled="f" stroked="f">
+            <v:shape id="Cuadro de texto 2" o:spid="_x0000_s1050" type="#_x0000_t202" style="position:absolute;margin-left:0;margin-top:-293.2pt;width:496.4pt;height:90.75pt;z-index:251667456;visibility:visible;mso-wrap-style:square;mso-width-percent:0;mso-height-percent:200;mso-wrap-distance-left:9pt;mso-wrap-distance-top:3.6pt;mso-wrap-distance-right:9pt;mso-wrap-distance-bottom:3.6pt;mso-position-horizontal:left;mso-position-horizontal-relative:margin;mso-position-vertical:absolute;mso-position-vertical-relative:text;mso-width-percent:0;mso-height-percent:200;mso-width-relative:margin;mso-height-relative:margin;v-text-anchor:top" o:gfxdata="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" filled="f" stroked="f">
               <v:textbox style="mso-fit-shape-to-text:t">
                 <w:txbxContent>
                   <w:p>
@@ -19839,7 +23880,7 @@
   <w:style w:type="paragraph" w:default="1" w:styleId="Normal">
     <w:name w:val="Normal"/>
     <w:qFormat/>
-    <w:rsid w:val="00920A3A"/>
+    <w:rsid w:val="00291704"/>
     <w:pPr>
       <w:spacing w:after="0" w:line="240" w:lineRule="auto"/>
     </w:pPr>
@@ -19930,7 +23971,6 @@
   <w:style w:type="character" w:default="1" w:styleId="Fuentedeprrafopredeter">
     <w:name w:val="Default Paragraph Font"/>
     <w:uiPriority w:val="1"/>
-    <w:semiHidden/>
     <w:unhideWhenUsed/>
   </w:style>
   <w:style w:type="table" w:default="1" w:styleId="Tablanormal">

</xml_diff>